<commit_message>
07.9 bổ sung mục 4.20, 4.21: Phiếu 2329, Văn bản 2644 ghi lại việc chậm; Phiếu 2960 và việc trả lại hồ sơ
- 4.20: hai văn bản của Thanh tra tỉnh ghi lại việc phường chưa có kết quả khi các mốc luật định đã qua; hệ quả của việc Công văn 3292 xếp Văn bản 2644 vào nhóm văn bản chuyển đơn
- 4.21: Phiếu hướng dẫn 2960 không nêu nội dung nào, nơi nào theo Mẫu số 05; bộ hồ sơ được trả lại; Điều 21 Thông tư 05 không quy định trả đơn; sáu nội dung thuộc trách nhiệm của chính Thanh tra tỉnh
- 3.3 cách đếm chặt; 4.6 báo phát và 150 ngày; 5.7 câu hỏi V.2(a) của Đơn B; đề nghị B.7, G.1, G.2; cập nhật Tóm tắt, mục 8, 10, 11, Phụ lục A–D
- Sửa các trích dẫn đơn 06/10/2026 cho đúng nguyên văn số hiệu văn bản

Co-Authored-By: Claude Opus 5.5 <noreply@anthropic.com>
Claude-Session: https://claude.ai/code/session_01WybE5Msv7e85cfhQzUC1p7
</commit_message>
<xml_diff>
--- a/07.9 - Bao cao phan bien Cong van 3292.docx
+++ b/07.9 - Bao cao phan bien Cong van 3292.docx
@@ -2,7 +2,7 @@
 <file path=word/document.xml><?xml version="1.0" encoding="utf-8"?>
 <w:document xmlns:w="http://schemas.openxmlformats.org/wordprocessingml/2006/main" xmlns:m="http://schemas.openxmlformats.org/officeDocument/2006/math" xmlns:r="http://schemas.openxmlformats.org/officeDocument/2006/relationships" xmlns:o="urn:schemas-microsoft-com:office:office" xmlns:v="urn:schemas-microsoft-com:vml" xmlns:w10="urn:schemas-microsoft-com:office:word" xmlns:a="http://schemas.openxmlformats.org/drawingml/2006/main" xmlns:pic="http://schemas.openxmlformats.org/drawingml/2006/picture" xmlns:wp="http://schemas.openxmlformats.org/drawingml/2006/wordprocessingDrawing">
   <w:body>
-    <w:bookmarkStart w:id="66" w:name="X77404fc30862f613d78fe123e35fcba26e88ace"/>
+    <w:bookmarkStart w:id="68" w:name="X77404fc30862f613d78fe123e35fcba26e88ace"/>
     <w:p>
       <w:pPr>
         <w:pStyle w:val="Heading1"/>
@@ -93,7 +93,7 @@
         <w:t xml:space="preserve"> </w:t>
       </w:r>
       <w:r>
-        <w:t xml:space="preserve">Báo cáo là phụ lục dùng chung. Đơn gửi cơ quan nào chỉ cần nêu vấn đề, yêu cầu giải quyết và dẫn số mục tương ứng; bảng dẫn chiếu theo nơi nhận ở mục 11. Số mục 1 đến 9 giữ như bản ngày 27/10/2026, để các tài liệu đã dẫn số mục (Diễn tiến vụ việc, mục lục hồ sơ) vẫn đúng; phần mới đặt ở các mục 4.15 – 4.19, 5.6 – 5.8, 10 và 11, Phụ lục C và Phụ lục D.</w:t>
+        <w:t xml:space="preserve">Báo cáo là phụ lục dùng chung. Đơn gửi cơ quan nào chỉ cần nêu vấn đề, yêu cầu giải quyết và dẫn số mục tương ứng; bảng dẫn chiếu theo nơi nhận ở mục 11. Số mục 1 đến 9 giữ như bản ngày 27/10/2026, để các tài liệu đã dẫn số mục (Diễn tiến vụ việc, mục lục hồ sơ) vẫn đúng; phần mới đặt ở các mục 4.15 – 4.21, 5.6 – 5.8, 10 và 11, Phụ lục C và Phụ lục D.</w:t>
       </w:r>
     </w:p>
     <w:bookmarkStart w:id="20" w:name="mục-lục"/>
@@ -114,7 +114,7 @@
         </w:numPr>
       </w:pPr>
       <w:r>
-        <w:t xml:space="preserve">Tóm tắt — chín điểm chính</w:t>
+        <w:t xml:space="preserve">Tóm tắt — mười điểm chính</w:t>
       </w:r>
     </w:p>
     <w:p>
@@ -150,7 +150,7 @@
         </w:numPr>
       </w:pPr>
       <w:r>
-        <w:t xml:space="preserve">Mười chín điểm phản biện</w:t>
+        <w:t xml:space="preserve">Hai mươi mốt điểm phản biện</w:t>
       </w:r>
     </w:p>
     <w:p>
@@ -241,12 +241,24 @@
       <w:pPr>
         <w:pStyle w:val="Compact"/>
         <w:numPr>
-          <w:ilvl w:val="0"/>
-          <w:numId w:val="1001"/>
+          <w:ilvl w:val="1"/>
+          <w:numId w:val="1002"/>
         </w:numPr>
       </w:pPr>
       <w:r>
-        <w:t xml:space="preserve">Dù phân loại thế nào, đơn ngày 16/5/2026 cũng không có nội dung như Thông báo 5553 mô tả (5.1 – 5.8)</w:t>
+        <w:t xml:space="preserve">4.20: Phiếu chuyển 2329 và Văn bản 2644 ghi lại việc phường chưa có kết quả khi các mốc luật định đã qua; Công văn 3292 xếp Văn bản 2644 vào nhóm văn bản chuyển đơn</w:t>
+      </w:r>
+    </w:p>
+    <w:p>
+      <w:pPr>
+        <w:pStyle w:val="Compact"/>
+        <w:numPr>
+          <w:ilvl w:val="1"/>
+          <w:numId w:val="1002"/>
+        </w:numPr>
+      </w:pPr>
+      <w:r>
+        <w:t xml:space="preserve">4.21: Phiếu hướng dẫn 2960 không chỉ ra nội dung nào, nơi nào; bộ hồ sơ được trả lại; căn cứ của việc trả lại</w:t>
       </w:r>
     </w:p>
     <w:p>
@@ -258,7 +270,7 @@
         </w:numPr>
       </w:pPr>
       <w:r>
-        <w:t xml:space="preserve">Vài điểm về hình thức</w:t>
+        <w:t xml:space="preserve">Dù phân loại thế nào, đơn ngày 16/5/2026 cũng không có nội dung như Thông báo 5553 mô tả (5.1 – 5.8)</w:t>
       </w:r>
     </w:p>
     <w:p>
@@ -270,19 +282,7 @@
         </w:numPr>
       </w:pPr>
       <w:r>
-        <w:t xml:space="preserve">Hệ quả của việc chính Thanh tra tỉnh gọi đơn ngày 06/10/2026 là</w:t>
-      </w:r>
-      <w:r>
-        <w:t xml:space="preserve"> </w:t>
-      </w:r>
-      <w:r>
-        <w:t xml:space="preserve">“</w:t>
-      </w:r>
-      <w:r>
-        <w:t xml:space="preserve">đơn kiến nghị</w:t>
-      </w:r>
-      <w:r>
-        <w:t xml:space="preserve">”</w:t>
+        <w:t xml:space="preserve">Vài điểm về hình thức</w:t>
       </w:r>
     </w:p>
     <w:p>
@@ -294,7 +294,19 @@
         </w:numPr>
       </w:pPr>
       <w:r>
-        <w:t xml:space="preserve">Nhận định của người lập báo cáo</w:t>
+        <w:t xml:space="preserve">Hệ quả của việc chính Thanh tra tỉnh gọi đơn ngày 06/10/2026 là</w:t>
+      </w:r>
+      <w:r>
+        <w:t xml:space="preserve"> </w:t>
+      </w:r>
+      <w:r>
+        <w:t xml:space="preserve">“</w:t>
+      </w:r>
+      <w:r>
+        <w:t xml:space="preserve">đơn kiến nghị</w:t>
+      </w:r>
+      <w:r>
+        <w:t xml:space="preserve">”</w:t>
       </w:r>
     </w:p>
     <w:p>
@@ -306,7 +318,7 @@
         </w:numPr>
       </w:pPr>
       <w:r>
-        <w:t xml:space="preserve">Đề nghị</w:t>
+        <w:t xml:space="preserve">Nhận định của người lập báo cáo</w:t>
       </w:r>
     </w:p>
     <w:p>
@@ -318,7 +330,7 @@
         </w:numPr>
       </w:pPr>
       <w:r>
-        <w:t xml:space="preserve">Ghi chú tự đối chiếu và giới hạn của các kết luận</w:t>
+        <w:t xml:space="preserve">Đề nghị</w:t>
       </w:r>
     </w:p>
     <w:p>
@@ -330,6 +342,18 @@
         </w:numPr>
       </w:pPr>
       <w:r>
+        <w:t xml:space="preserve">Ghi chú tự đối chiếu và giới hạn của các kết luận</w:t>
+      </w:r>
+    </w:p>
+    <w:p>
+      <w:pPr>
+        <w:pStyle w:val="Compact"/>
+        <w:numPr>
+          <w:ilvl w:val="0"/>
+          <w:numId w:val="1001"/>
+        </w:numPr>
+      </w:pPr>
+      <w:r>
         <w:t xml:space="preserve">Dẫn chiếu khi làm đơn</w:t>
       </w:r>
     </w:p>
@@ -455,7 +479,7 @@
         <w:pStyle w:val="BodyText"/>
       </w:pPr>
       <w:r>
-        <w:t xml:space="preserve">Chín điểm chính của báo cáo:</w:t>
+        <w:t xml:space="preserve">Mười điểm chính của báo cáo:</w:t>
       </w:r>
     </w:p>
     <w:p>
@@ -477,7 +501,7 @@
         <w:t xml:space="preserve"> </w:t>
       </w:r>
       <w:r>
-        <w:t xml:space="preserve">Hai việc được trả lời một phần, bốn việc không được trả lời (mục 3).</w:t>
+        <w:t xml:space="preserve">Hai việc được trả lời một phần, bốn việc không được trả lời (mục 3). Đếm chặt hơn thì chỉ một việc được trả lời một phần: kết quả phân loại đơn tháng 5/2026, không kèm căn cứ (mục 3.3).</w:t>
       </w:r>
     </w:p>
     <w:p>
@@ -553,7 +577,7 @@
         <w:t xml:space="preserve"> </w:t>
       </w:r>
       <w:r>
-        <w:t xml:space="preserve">(4.16).</w:t>
+        <w:t xml:space="preserve">(4.16). Trong khi đó, chính Phiếu chuyển 2329 và Văn bản 2644 đã ghi lại rằng đến ngày 03/8 và ngày 27/8/2026 phường chưa có kết quả, khi các mốc luật định trên cả hai hồ sơ đã qua; khi Văn bản 2644 được xếp vào nhóm văn bản chuyển đơn, việc chậm ấy không còn chỗ trong văn bản trả lời (4.20).</w:t>
       </w:r>
     </w:p>
     <w:p>
@@ -609,13 +633,28 @@
           <w:b/>
           <w:bCs/>
         </w:rPr>
-        <w:t xml:space="preserve">Đã gọi là tố cáo thì các nghĩa vụ đi kèm phải được trả lời.</w:t>
-      </w:r>
-      <w:r>
-        <w:t xml:space="preserve"> </w:t>
-      </w:r>
-      <w:r>
-        <w:t xml:space="preserve">Ở khâu chuyển: thông báo cho người tố cáo — đến nay chưa có (4.6); xem xét dấu hiệu tội phạm theo Điều 27 Luật Tố cáo — chưa có dấu vết ở chiều nào (4.18). Ở cấp phường: mốc xử lý ban đầu 02/6 – 05/6/2026 và mốc thông báo kết quả cho cơ quan đã chuyển 11/6/2026 đều đã qua; văn bản đầu tiên là Thông báo 5553 ký ngày 28/8/2026. Văn bản đôn đốc đầu tiên tôi được biết là Phiếu chuyển 2329, ban hành sau đơn của tôi (4.8).</w:t>
+        <w:t xml:space="preserve">Phiếu hướng dẫn 2960 không chỉ ra nội dung nào, nơi nào, và bộ hồ sơ được trả lại.</w:t>
+      </w:r>
+      <w:r>
+        <w:t xml:space="preserve"> </w:t>
+      </w:r>
+      <w:r>
+        <w:t xml:space="preserve">Đơn ngày 14/9/2026 tự ghi là đơn kiến nghị, phản ánh; nội dung tố cáo tôi gửi riêng Chủ tịch Ủy ban nhân dân tỉnh bằng một đơn cùng ngày. Phiếu 2960 xác định đơn</w:t>
+      </w:r>
+      <w:r>
+        <w:t xml:space="preserve"> </w:t>
+      </w:r>
+      <w:r>
+        <w:t xml:space="preserve">“</w:t>
+      </w:r>
+      <w:r>
+        <w:t xml:space="preserve">có cả nội dung kiến nghị, phản ánh và tố cáo</w:t>
+      </w:r>
+      <w:r>
+        <w:t xml:space="preserve">”</w:t>
+      </w:r>
+      <w:r>
+        <w:t xml:space="preserve">, nhưng không nêu nội dung nào cần tách, gửi cơ quan nào như Mẫu số 05 Thông tư số 05/2021/TT-TTCP đặt ra; bộ hồ sơ giấy được trả lại kèm duy nhất tờ phiếu. Điều 21 của thông tư quy định việc hướng dẫn tách đơn; tôi chưa tìm thấy quy định nào cho trả lại đơn vì đơn có nhiều nội dung. Sáu nội dung trả lời được bằng hồ sơ lưu của chính Thanh tra tỉnh không có văn bản trả lời. Tháng 5 chuyển cả đơn xuống phường, tháng 9 trả cả hồ sơ về người gửi: cả hai lần, phần đơn đặt cho chính Thanh tra tỉnh đều không được trả lời (4.17, 4.21).</w:t>
       </w:r>
     </w:p>
     <w:p>
@@ -631,43 +670,13 @@
           <w:b/>
           <w:bCs/>
         </w:rPr>
-        <w:t xml:space="preserve">Hai đánh giá trái nhau về cùng một yếu tố.</w:t>
-      </w:r>
-      <w:r>
-        <w:t xml:space="preserve"> </w:t>
-      </w:r>
-      <w:r>
-        <w:t xml:space="preserve">Thanh tra tỉnh xác định nội dung đơn là</w:t>
-      </w:r>
-      <w:r>
-        <w:t xml:space="preserve"> </w:t>
-      </w:r>
-      <w:r>
-        <w:t xml:space="preserve">“</w:t>
-      </w:r>
-      <w:r>
-        <w:t xml:space="preserve">tố cáo hành vi vi phạm pháp luật của ông Võ Phương Đăng</w:t>
-      </w:r>
-      <w:r>
-        <w:t xml:space="preserve">”</w:t>
-      </w:r>
-      <w:r>
-        <w:t xml:space="preserve">; Thông báo 5553 — văn bản gửi Thanh tra tỉnh để báo cáo — không thụ lý vì</w:t>
-      </w:r>
-      <w:r>
-        <w:t xml:space="preserve"> </w:t>
-      </w:r>
-      <w:r>
-        <w:t xml:space="preserve">“</w:t>
-      </w:r>
-      <w:r>
-        <w:t xml:space="preserve">không có cơ sở xác định hành vi vi phạm pháp luật</w:t>
-      </w:r>
-      <w:r>
-        <w:t xml:space="preserve">”</w:t>
-      </w:r>
-      <w:r>
-        <w:t xml:space="preserve">. Công văn 3292 khẳng định đánh giá thứ nhất và không nhắc đánh giá thứ hai (4.19).</w:t>
+        <w:t xml:space="preserve">Đã gọi là tố cáo thì các nghĩa vụ đi kèm phải được trả lời.</w:t>
+      </w:r>
+      <w:r>
+        <w:t xml:space="preserve"> </w:t>
+      </w:r>
+      <w:r>
+        <w:t xml:space="preserve">Ở khâu chuyển: thông báo cho người tố cáo — đến nay chưa có (4.6); xem xét dấu hiệu tội phạm theo Điều 27 Luật Tố cáo — chưa có dấu vết ở chiều nào (4.18). Ở cấp phường: mốc xử lý ban đầu 02/6 – 05/6/2026 và mốc thông báo kết quả cho cơ quan đã chuyển 11/6/2026 đều đã qua; văn bản đầu tiên là Thông báo 5553 ký ngày 28/8/2026. Văn bản đôn đốc đầu tiên tôi được biết là Phiếu chuyển 2329, ban hành sau đơn của tôi (4.8).</w:t>
       </w:r>
     </w:p>
     <w:p>
@@ -683,13 +692,43 @@
           <w:b/>
           <w:bCs/>
         </w:rPr>
-        <w:t xml:space="preserve">Dù phân loại thế nào, đơn đề ngày 16/5/2026 không có nội dung như Thông báo 5553 mô tả.</w:t>
-      </w:r>
-      <w:r>
-        <w:t xml:space="preserve"> </w:t>
-      </w:r>
-      <w:r>
-        <w:t xml:space="preserve">Không đơn nào của tôi đề ngày 18/5/2026 (4.5, 5.2). Thông báo 5553 mô tả đúng một trong bảy điểm tại Mục III của đơn, không nhắc Mục IV và năm trong sáu đề nghị tại Mục V (5.6). Ba kết luận của Thông báo lấy chính những việc bị nêu trong đơn làm căn cứ chứng minh rằng những việc ấy đúng (5.7). Không quy định nào cho phép bỏ một nội dung đã nhận mà không nêu hướng xử lý (5.8).</w:t>
+        <w:t xml:space="preserve">Hai đánh giá trái nhau về cùng một yếu tố.</w:t>
+      </w:r>
+      <w:r>
+        <w:t xml:space="preserve"> </w:t>
+      </w:r>
+      <w:r>
+        <w:t xml:space="preserve">Thanh tra tỉnh xác định nội dung đơn là</w:t>
+      </w:r>
+      <w:r>
+        <w:t xml:space="preserve"> </w:t>
+      </w:r>
+      <w:r>
+        <w:t xml:space="preserve">“</w:t>
+      </w:r>
+      <w:r>
+        <w:t xml:space="preserve">tố cáo hành vi vi phạm pháp luật của ông Võ Phương Đăng</w:t>
+      </w:r>
+      <w:r>
+        <w:t xml:space="preserve">”</w:t>
+      </w:r>
+      <w:r>
+        <w:t xml:space="preserve">; Thông báo 5553 — văn bản gửi Thanh tra tỉnh để báo cáo — không thụ lý vì</w:t>
+      </w:r>
+      <w:r>
+        <w:t xml:space="preserve"> </w:t>
+      </w:r>
+      <w:r>
+        <w:t xml:space="preserve">“</w:t>
+      </w:r>
+      <w:r>
+        <w:t xml:space="preserve">không có cơ sở xác định hành vi vi phạm pháp luật</w:t>
+      </w:r>
+      <w:r>
+        <w:t xml:space="preserve">”</w:t>
+      </w:r>
+      <w:r>
+        <w:t xml:space="preserve">. Công văn 3292 khẳng định đánh giá thứ nhất và không nhắc đánh giá thứ hai (4.19).</w:t>
       </w:r>
     </w:p>
     <w:p>
@@ -705,6 +744,28 @@
           <w:b/>
           <w:bCs/>
         </w:rPr>
+        <w:t xml:space="preserve">Dù phân loại thế nào, đơn đề ngày 16/5/2026 không có nội dung như Thông báo 5553 mô tả.</w:t>
+      </w:r>
+      <w:r>
+        <w:t xml:space="preserve"> </w:t>
+      </w:r>
+      <w:r>
+        <w:t xml:space="preserve">Không đơn nào của tôi đề ngày 18/5/2026 (4.5, 5.2). Thông báo 5553 mô tả đúng một trong bảy điểm tại Mục III của đơn, không nhắc Mục IV và năm trong sáu đề nghị tại Mục V (5.6). Ba kết luận của Thông báo lấy chính những việc bị nêu trong đơn làm căn cứ chứng minh rằng những việc ấy đúng (5.7). Không quy định nào cho phép bỏ một nội dung đã nhận mà không nêu hướng xử lý (5.8). Câu hỏi pháp lý mà đơn ấy đặt cho chính Thanh tra tỉnh — trả lời đơn khiếu nại bằng công văn có hợp pháp không — đã trở lại hồ sơ của Thanh tra tỉnh dưới dạng kết luận của cấp phường, và Công văn 3292 không có ý kiến (5.7).</w:t>
+      </w:r>
+    </w:p>
+    <w:p>
+      <w:pPr>
+        <w:pStyle w:val="Compact"/>
+        <w:numPr>
+          <w:ilvl w:val="0"/>
+          <w:numId w:val="1003"/>
+        </w:numPr>
+      </w:pPr>
+      <w:r>
+        <w:rPr>
+          <w:b/>
+          <w:bCs/>
+        </w:rPr>
         <w:t xml:space="preserve">Hồ sơ tố cáo phường nhận ngày 09/7/2026 chưa được văn bản nào nhận diện.</w:t>
       </w:r>
       <w:r>
@@ -724,7 +785,7 @@
         <w:t xml:space="preserve">111 ngày</w:t>
       </w:r>
       <w:r>
-        <w:t xml:space="preserve">, chưa có văn bản. Phiếu chuyển 2329 và Văn bản 2644 đã đưa việc ấy về phường kèm yêu cầu báo kết quả; Công văn 3292 không nói yêu cầu ấy đã được thực hiện hay chưa (4.9, 4.13, 5.8).</w:t>
+        <w:t xml:space="preserve">, chưa có văn bản. Phiếu chuyển 2329 và Văn bản 2644 đã đưa việc ấy về phường kèm yêu cầu báo kết quả; Công văn 3292 không nói yêu cầu ấy đã được thực hiện hay chưa (4.9, 4.13, 4.20, 5.8).</w:t>
       </w:r>
     </w:p>
     <w:p>
@@ -1751,7 +1812,7 @@
                 <w:bCs/>
                 <w:sz w:val="22"/>
               </w:rPr>
-              <w:t xml:space="preserve">kèm bản sao Công văn số 1436</w:t>
+              <w:t xml:space="preserve">kèm bản sao Công văn số 1436/TTr-TCDKNTC</w:t>
             </w:r>
             <w:r>
               <w:rPr>
@@ -2825,15 +2886,84 @@
         </w:tc>
       </w:tr>
     </w:tbl>
+    <w:p>
+      <w:pPr>
+        <w:pStyle w:val="BodyText"/>
+        <w:spacing w:before="160"/>
+      </w:pPr>
+      <w:r>
+        <w:t xml:space="preserve">Cách đếm trên có lợi cho Công văn 3292. Đếm chặt hơn, câu hỏi 1 được đáp bằng chính cụm</w:t>
+      </w:r>
+      <w:r>
+        <w:t xml:space="preserve"> </w:t>
+      </w:r>
+      <w:r>
+        <w:rPr>
+          <w:i/>
+          <w:iCs/>
+        </w:rPr>
+        <w:t xml:space="preserve">“</w:t>
+      </w:r>
+      <w:r>
+        <w:rPr>
+          <w:i/>
+          <w:iCs/>
+        </w:rPr>
+        <w:t xml:space="preserve">đơn ghi ngày 18/5/2026</w:t>
+      </w:r>
+      <w:r>
+        <w:rPr>
+          <w:i/>
+          <w:iCs/>
+        </w:rPr>
+        <w:t xml:space="preserve">”</w:t>
+      </w:r>
+      <w:r>
+        <w:t xml:space="preserve"> </w:t>
+      </w:r>
+      <w:r>
+        <w:t xml:space="preserve">— cụm mà câu hỏi 3 đang hỏi là có tồn tại trong hồ sơ hay không — nên khó coi là đã được trả lời. Khi ấy, trong sáu việc, chỉ còn một việc được trả lời một phần: kết quả phân loại đơn tháng 5/2026 là đơn tố cáo, không kèm căn cứ. Ngoài sáu việc ấy, Công văn 3292 còn xác định một việc đơn không hỏi: đơn ngày 06/10/2026 là</w:t>
+      </w:r>
+      <w:r>
+        <w:t xml:space="preserve"> </w:t>
+      </w:r>
+      <w:r>
+        <w:rPr>
+          <w:i/>
+          <w:iCs/>
+        </w:rPr>
+        <w:t xml:space="preserve">“</w:t>
+      </w:r>
+      <w:r>
+        <w:rPr>
+          <w:i/>
+          <w:iCs/>
+        </w:rPr>
+        <w:t xml:space="preserve">đơn kiến nghị</w:t>
+      </w:r>
+      <w:r>
+        <w:rPr>
+          <w:i/>
+          <w:iCs/>
+        </w:rPr>
+        <w:t xml:space="preserve">”</w:t>
+      </w:r>
+      <w:r>
+        <w:t xml:space="preserve"> </w:t>
+      </w:r>
+      <w:r>
+        <w:t xml:space="preserve">(trích yếu; về hệ quả, xem mục 7).</w:t>
+      </w:r>
+    </w:p>
     <w:bookmarkEnd w:id="25"/>
     <w:bookmarkEnd w:id="26"/>
-    <w:bookmarkStart w:id="46" w:name="mười-chín-điểm-phản-biện"/>
+    <w:bookmarkStart w:id="48" w:name="hai-mươi-mốt-điểm-phản-biện"/>
     <w:p>
       <w:pPr>
         <w:pStyle w:val="Heading2"/>
       </w:pPr>
       <w:r>
-        <w:t xml:space="preserve">4. Mười chín điểm phản biện</w:t>
+        <w:t xml:space="preserve">4. Hai mươi mốt điểm phản biện</w:t>
       </w:r>
     </w:p>
     <w:bookmarkStart w:id="27" w:name="Xad0bc708ef139b253160d4398fed1d980ffe41b"/>
@@ -3914,7 +4044,7 @@
         <w:t xml:space="preserve"> </w:t>
       </w:r>
       <w:r>
-        <w:t xml:space="preserve">là đủ để một đơn thành đơn tố cáo, thì không còn đơn đề nghị thanh tra nào tồn tại được — vì mọi đơn đề nghị thanh tra hành vi hành chính đều phải nêu người có hành vi ấy và phải nêu dấu hiệu, nếu không thì không có gì để thanh tra. Còn nếu Thanh tra tỉnh cho rằng một phần nội dung đơn có tính chất tố cáo, Thông tư số 05/2021/TT-TTCP có sẵn quy định cho đơn có nhiều nội dung khác nhau, và chính Thanh tra tỉnh đã dùng quy định ấy bốn tháng sau (mục 4.17).</w:t>
+        <w:t xml:space="preserve">là đủ để một đơn thành đơn tố cáo, thì không còn đơn đề nghị thanh tra nào tồn tại được — vì mọi đơn đề nghị thanh tra hành vi hành chính đều phải nêu người có hành vi ấy và phải nêu dấu hiệu, nếu không thì không có gì để thanh tra. Còn nếu Thanh tra tỉnh cho rằng một phần nội dung đơn có tính chất tố cáo, Thông tư số 05/2021/TT-TTCP có sẵn quy định cho đơn có nhiều nội dung khác nhau, và chính Thanh tra tỉnh đã dùng quy định ấy bốn tháng sau (mục 4.17, 4.21).</w:t>
       </w:r>
     </w:p>
     <w:p>
@@ -4905,7 +5035,7 @@
         <w:t xml:space="preserve"> </w:t>
       </w:r>
       <w:r>
-        <w:t xml:space="preserve">(17.05). Văn bản trả lời đơn ấy — Phiếu hướng dẫn số 2960/HD-TTr ngày 28/9/2026 — hướng dẫn tách đơn, không trả lời câu hỏi. Lần thứ hai là chính đơn 06/10/2026. Văn bản trả lời lần này, Công văn 3292, dùng lại cụm</w:t>
+        <w:t xml:space="preserve">(17.05). Văn bản trả lời đơn ấy — Phiếu hướng dẫn số 2960/HD-TTr ngày 28/9/2026 — hướng dẫn tách đơn, không trả lời câu hỏi, và bộ hồ sơ được trả lại (mục 4.21). Lần thứ hai là chính đơn 06/10/2026. Văn bản trả lời lần này, Công văn 3292, dùng lại cụm</w:t>
       </w:r>
       <w:r>
         <w:t xml:space="preserve"> </w:t>
@@ -5413,7 +5543,7 @@
           <w:i/>
           <w:iCs/>
         </w:rPr>
-        <w:t xml:space="preserve">việc chuyển đơn theo Công văn số 1436 đã được thông báo cho tôi bằng văn bản nào; nếu chưa, kính đề nghị gửi tôi văn bản thông báo theo quy định, kèm bản sao Công văn số 1436.</w:t>
+        <w:t xml:space="preserve">việc chuyển đơn theo Công văn số 1436/TTr-TCDKNTC đã được thông báo cho tôi bằng văn bản nào; nếu chưa, kính đề nghị gửi tôi văn bản thông báo theo quy định, kèm bản sao Công văn số 1436/TTr-TCDKNTC.</w:t>
       </w:r>
       <w:r>
         <w:rPr>
@@ -5534,6 +5664,30 @@
       </w:pPr>
       <w:r>
         <w:t xml:space="preserve">Về thời hạn chuyển, Thanh tra tỉnh làm nhanh: nhận đơn ngày 20/5/2026, ban hành Công văn 1436 ngày 22/5/2026, sau 02 ngày làm việc. Phần còn thiếu là phần thông báo. Đến ngày lập báo cáo này, tôi chưa nhận được văn bản thông báo nào về việc chuyển đơn theo Công văn 1436, và chưa từng được cấp bản sao Công văn 1436. Toàn bộ những gì tôi biết về Công văn 1436 là qua mô tả của Thông báo 5553 — văn bản mà tôi đang khiếu nại — và nay qua bốn dòng của Công văn 3292.</w:t>
+      </w:r>
+    </w:p>
+    <w:p>
+      <w:pPr>
+        <w:pStyle w:val="BodyText"/>
+      </w:pPr>
+      <w:r>
+        <w:t xml:space="preserve">Về phía tôi, chứng từ duy nhất trên tuyến này là báo phát của bưu điện: bưu gửi ES805557486VN phát thành công lúc 09 giờ 26 ngày 20/5/2026. Chứng từ ấy cho biết đơn đã đến Thanh tra tỉnh. Theo chiều ngược lại thì không có gì: không phiếu chuyển, không văn bản thông báo, không bản sao. Văn bản đầu tiên của Thanh tra tỉnh gửi tôi có nhắc tới việc chuyển đơn ấy là chính Công văn 3292 ngày 19/10/2026 —</w:t>
+      </w:r>
+      <w:r>
+        <w:t xml:space="preserve"> </w:t>
+      </w:r>
+      <w:r>
+        <w:rPr>
+          <w:b/>
+          <w:bCs/>
+        </w:rPr>
+        <w:t xml:space="preserve">150 ngày</w:t>
+      </w:r>
+      <w:r>
+        <w:t xml:space="preserve"> </w:t>
+      </w:r>
+      <w:r>
+        <w:t xml:space="preserve">sau Công văn 1436. Nếu coi Công văn 3292 là văn bản thông báo việc chuyển đơn, thì văn bản ấy ra sau ngày chuyển 150 ngày, trong khi khoản 2 Điều 24 Luật Tố cáo đặt việc chuyển và việc thông báo trong cùng một thời hạn 05 ngày làm việc; và nó vẫn không kèm bản sao Công văn 1436. Nếu không coi như vậy, thì đến nay chưa có văn bản thông báo.</w:t>
       </w:r>
     </w:p>
     <w:p>
@@ -7410,14 +7564,14 @@
           <w:i/>
           <w:iCs/>
         </w:rPr>
-        <w:t xml:space="preserve">thông báo kết quả đến Thanh tra tỉnh như yêu cầu tại Phiếu chuyển số 2329</w:t>
-      </w:r>
-      <w:r>
-        <w:rPr>
-          <w:i/>
-          <w:iCs/>
-        </w:rPr>
-        <w:t xml:space="preserve">; đồng thời xem xét, xử lý theo thẩm quyền hoặc kiến nghị cấp có thẩm quyền xử lý trách nhiệm theo quy định của pháp luật đối với việc chậm thực hiện Phiếu chuyển số 2329 và Văn bản số 2644.”</w:t>
+        <w:t xml:space="preserve">thông báo kết quả đến Thanh tra tỉnh như yêu cầu tại Phiếu chuyển số 2329/TTr-TCDKNTC</w:t>
+      </w:r>
+      <w:r>
+        <w:rPr>
+          <w:i/>
+          <w:iCs/>
+        </w:rPr>
+        <w:t xml:space="preserve">; đồng thời xem xét, xử lý theo thẩm quyền hoặc kiến nghị cấp có thẩm quyền xử lý trách nhiệm theo quy định của pháp luật đối với việc chậm thực hiện Phiếu chuyển số 2329/TTr-TCDKNTC và Văn bản số 2644/TTr-TCDKNTC.”</w:t>
       </w:r>
     </w:p>
     <w:p>
@@ -8056,7 +8210,7 @@
               <w:rPr>
                 <w:sz w:val="22"/>
               </w:rPr>
-              <w:t xml:space="preserve">.</w:t>
+              <w:t xml:space="preserve">. Bộ hồ sơ giấy được trả lại kèm tờ phiếu; phiếu không nêu nội dung nào cần tách và gửi đâu (mục 4.21).</w:t>
             </w:r>
           </w:p>
         </w:tc>
@@ -8120,19 +8274,13 @@
                 <w:bCs/>
                 <w:sz w:val="22"/>
               </w:rPr>
-              <w:t xml:space="preserve">Tôi thực hiện đúng hướng dẫn ấy.</w:t>
-            </w:r>
-            <w:r>
-              <w:rPr>
-                <w:sz w:val="22"/>
-              </w:rPr>
-              <w:t xml:space="preserve"> </w:t>
-            </w:r>
-            <w:r>
-              <w:rPr>
-                <w:sz w:val="22"/>
-              </w:rPr>
-              <w:t xml:space="preserve">Phần khiếu nại các kết luận của Thông báo 5553 tôi tách ra, gửi Chủ tịch Ủy ban nhân dân phường (phường nhận 17 giờ ngày 06/10/2026). Phần còn lại —</w:t>
+              <w:t xml:space="preserve">Tôi làm theo hướng dẫn ấy</w:t>
+            </w:r>
+            <w:r>
+              <w:rPr>
+                <w:sz w:val="22"/>
+              </w:rPr>
+              <w:t xml:space="preserve">, theo cách tự xác định, vì phiếu không chỉ ra nội dung nào đi đâu. Phần khiếu nại các kết luận của Thông báo 5553 tôi tách ra, gửi Chủ tịch Ủy ban nhân dân phường (phường nhận 17 giờ ngày 06/10/2026). Phần còn lại —</w:t>
             </w:r>
             <w:r>
               <w:rPr>
@@ -8468,7 +8616,7 @@
         <w:t xml:space="preserve">có phiếu hướng dẫn tách đơn</w:t>
       </w:r>
       <w:r>
-        <w:t xml:space="preserve">; đơn 06/10 đã tách đúng theo hướng dẫn ấy thì</w:t>
+        <w:t xml:space="preserve">; đơn 06/10 đã tách theo hướng dẫn ấy thì</w:t>
       </w:r>
       <w:r>
         <w:t xml:space="preserve"> </w:t>
@@ -11827,7 +11975,7 @@
           <w:i/>
           <w:iCs/>
         </w:rPr>
-        <w:t xml:space="preserve">thông báo kết quả đến Thanh tra tỉnh như yêu cầu tại Phiếu chuyển số 2329</w:t>
+        <w:t xml:space="preserve">thông báo kết quả đến Thanh tra tỉnh như yêu cầu tại Phiếu chuyển số 2329/TTr-TCDKNTC</w:t>
       </w:r>
       <w:r>
         <w:rPr>
@@ -12487,6 +12635,14 @@
         <w:t xml:space="preserve">hoạt động đôn đốc tiếp theo — điều này đọc được từ văn bản. Thanh tra tỉnh có hoạt động nào khác ngoài văn bản hay không thì chỉ hồ sơ xử lý của chính cơ quan trả lời được; vì vậy đề nghị tại mục 9 là đề nghị cho biết, không phải kết luận thay.</w:t>
       </w:r>
     </w:p>
+    <w:p>
+      <w:pPr>
+        <w:pStyle w:val="BodyText"/>
+      </w:pPr>
+      <w:r>
+        <w:t xml:space="preserve">Hệ quả của bước ba — những câu hỏi không còn chỗ trong văn bản trả lời khi Văn bản 2644 được gọi là văn bản chuyển đơn — được nêu tại mục 4.20.</w:t>
+      </w:r>
+    </w:p>
     <w:bookmarkEnd w:id="42"/>
     <w:bookmarkStart w:id="43" w:name="X4b2a3e743ba54d07edc3935fbf9882ea413aa95"/>
     <w:p>
@@ -12510,7 +12666,7 @@
         <w:pStyle w:val="BodyText"/>
       </w:pPr>
       <w:r>
-        <w:t xml:space="preserve">Thanh tra tỉnh đã dùng đúng quy định ấy. Phiếu hướng dẫn số 2960/HD-TTr ngày 28/9/2026 (15.4) mang tên</w:t>
+        <w:t xml:space="preserve">Thanh tra tỉnh đã dùng quy định ấy. Phiếu hướng dẫn số 2960/HD-TTr ngày 28/9/2026 (15.4) mang tên</w:t>
       </w:r>
       <w:r>
         <w:t xml:space="preserve"> </w:t>
@@ -12572,6 +12728,14 @@
     <w:p>
       <w:pPr>
         <w:pStyle w:val="FirstParagraph"/>
+      </w:pPr>
+      <w:r>
+        <w:t xml:space="preserve">Phiếu ấy dùng đúng tên của Mẫu số 05, nhưng không nêu nội dung nào cần tách và gửi đâu; bộ hồ sơ giấy được trả lại kèm phiếu. Phần này phân tích riêng tại mục 4.21; mục này chỉ đặt hai cách xử lý cạnh nhau.</w:t>
+      </w:r>
+    </w:p>
+    <w:p>
+      <w:pPr>
+        <w:pStyle w:val="BodyText"/>
         <w:keepNext/>
       </w:pPr>
       <w:r>
@@ -12743,7 +12907,7 @@
               <w:rPr>
                 <w:sz w:val="22"/>
               </w:rPr>
-              <w:t xml:space="preserve">Đơn đề nghị, thuộc loại đơn kiến nghị, phản ánh … Không phải đơn khiếu nại và không phải đơn tố cáo</w:t>
+              <w:t xml:space="preserve">đơn đề nghị, thuộc loại đơn kiến nghị, phản ánh … Không phải đơn khiếu nại và không phải đơn tố cáo</w:t>
             </w:r>
             <w:r>
               <w:rPr>
@@ -12903,7 +13067,7 @@
               <w:rPr>
                 <w:sz w:val="22"/>
               </w:rPr>
-              <w:t xml:space="preserve">Xác định là đơn có nhiều nội dung, gồm cả tố cáo; hướng dẫn tách đơn (Phiếu 2960)</w:t>
+              <w:t xml:space="preserve">Xác định là đơn có nhiều nội dung, gồm cả tố cáo; hướng dẫn tách đơn (Phiếu 2960), không nêu nội dung nào, nơi nào; trả lại bộ hồ sơ giấy</w:t>
             </w:r>
           </w:p>
         </w:tc>
@@ -12994,6 +13158,68 @@
           </w:p>
         </w:tc>
       </w:tr>
+      <w:tr>
+        <w:trPr>
+          <w:cantSplit/>
+        </w:trPr>
+        <w:tc>
+          <w:tcPr>
+            <w:tcW w:w="1882" w:type="dxa"/>
+            <w:vAlign w:val="top"/>
+          </w:tcPr>
+          <w:p>
+            <w:pPr>
+              <w:pStyle w:val="Compact"/>
+              <w:spacing w:before="20" w:after="20" w:line="252" w:lineRule="auto"/>
+              <w:jc w:val="left"/>
+            </w:pPr>
+            <w:r>
+              <w:rPr>
+                <w:sz w:val="22"/>
+              </w:rPr>
+              <w:t xml:space="preserve">Phần đơn đặt cho chính Thanh tra tỉnh</w:t>
+            </w:r>
+          </w:p>
+        </w:tc>
+        <w:tc>
+          <w:tcPr>
+            <w:tcW w:w="3594" w:type="dxa"/>
+            <w:vAlign w:val="top"/>
+          </w:tcPr>
+          <w:p>
+            <w:pPr>
+              <w:pStyle w:val="Compact"/>
+              <w:spacing w:before="20" w:after="20" w:line="252" w:lineRule="auto"/>
+              <w:jc w:val="left"/>
+            </w:pPr>
+            <w:r>
+              <w:rPr>
+                <w:sz w:val="22"/>
+              </w:rPr>
+              <w:t xml:space="preserve">Sáu đề nghị thanh tra tại Mục V: không có văn bản trả lời</w:t>
+            </w:r>
+          </w:p>
+        </w:tc>
+        <w:tc>
+          <w:tcPr>
+            <w:tcW w:w="3595" w:type="dxa"/>
+            <w:vAlign w:val="top"/>
+          </w:tcPr>
+          <w:p>
+            <w:pPr>
+              <w:pStyle w:val="Compact"/>
+              <w:spacing w:before="20" w:after="20" w:line="252" w:lineRule="auto"/>
+              <w:jc w:val="left"/>
+            </w:pPr>
+            <w:r>
+              <w:rPr>
+                <w:sz w:val="22"/>
+              </w:rPr>
+              <w:t xml:space="preserve">Sáu nội dung kiểm được bằng hồ sơ lưu tại Mục IV: không có văn bản trả lời (mục 4.21)</w:t>
+            </w:r>
+          </w:p>
+        </w:tc>
+      </w:tr>
     </w:tbl>
     <w:p>
       <w:pPr>
@@ -13028,7 +13254,7 @@
         <w:t xml:space="preserve">”</w:t>
       </w:r>
       <w:r>
-        <w:t xml:space="preserve">. Với đơn tháng 5, kết quả là một nhãn duy nhất cho cả đơn, kể cả sáu đề nghị thanh tra đặt cho chính Thanh tra tỉnh. Cùng một thông tư, cùng một cơ quan, hai cách xử lý.</w:t>
+        <w:t xml:space="preserve">. Với đơn tháng 5, kết quả là một nhãn duy nhất cho cả đơn, kể cả sáu đề nghị thanh tra đặt cho chính Thanh tra tỉnh. Cùng một thông tư, cùng một cơ quan, hai cách xử lý. Điểm chung của hai cách là phần đơn đề nghị chính Thanh tra tỉnh làm việc của mình — lần đầu được chuyển xuống phường, lần sau được trả về người gửi — đều không có văn bản trả lời.</w:t>
       </w:r>
     </w:p>
     <w:p>
@@ -14323,8 +14549,2177 @@
       </w:r>
     </w:p>
     <w:bookmarkEnd w:id="45"/>
+    <w:bookmarkStart w:id="46" w:name="X28b9ee57628432c2756bcbeba29bd1c92257e86"/>
+    <w:p>
+      <w:pPr>
+        <w:pStyle w:val="Heading3"/>
+      </w:pPr>
+      <w:r>
+        <w:t xml:space="preserve">4.20. Phiếu chuyển 2329 và Văn bản 2644 đã ghi lại việc phường chưa có kết quả khi các mốc luật định đã qua; Công văn 3292 xếp Văn bản 2644 vào nhóm văn bản chuyển đơn</w:t>
+      </w:r>
+    </w:p>
+    <w:p>
+      <w:pPr>
+        <w:pStyle w:val="FirstParagraph"/>
+        <w:keepNext/>
+      </w:pPr>
+      <w:r>
+        <w:t xml:space="preserve">Mục này đọc lại hai văn bản của chính Thanh tra tỉnh như hai chứng cứ về thời hạn, rồi đặt chúng cạnh cách Công văn 3292 mô tả lại. Các mốc tính như mục 4.8 và mục 5.8: tuyến Công văn 1436 tính từ ngày phường nhận 22/5/2026; Hồ sơ tố cáo tính từ ngày phường nhận 09/7/2026.</w:t>
+      </w:r>
+    </w:p>
+    <w:tbl>
+      <w:tblPr>
+        <w:tblStyle w:val="Table"/>
+        <w:tblW w:w="9071" w:type="dxa"/>
+        <w:jc w:val="center"/>
+        <w:tblInd w:w="0" w:type="dxa"/>
+        <w:tblBorders>
+          <w:top w:val="single" w:sz="4" w:space="0" w:color="000000"/>
+          <w:left w:val="single" w:sz="4" w:space="0" w:color="000000"/>
+          <w:bottom w:val="single" w:sz="4" w:space="0" w:color="000000"/>
+          <w:right w:val="single" w:sz="4" w:space="0" w:color="000000"/>
+          <w:insideH w:val="single" w:sz="4" w:space="0" w:color="000000"/>
+          <w:insideV w:val="single" w:sz="4" w:space="0" w:color="000000"/>
+        </w:tblBorders>
+        <w:tblLayout w:type="fixed"/>
+        <w:tblCellMar>
+          <w:top w:w="40" w:type="dxa"/>
+          <w:left w:w="85" w:type="dxa"/>
+          <w:bottom w:w="40" w:type="dxa"/>
+          <w:right w:w="85" w:type="dxa"/>
+        </w:tblCellMar>
+        <w:tblLook w:firstRow="1" w:lastRow="0" w:firstColumn="0" w:lastColumn="0" w:noHBand="0" w:noVBand="0" w:val="0020"/>
+      </w:tblPr>
+      <w:tblGrid>
+        <w:gridCol w:w="1446"/>
+        <w:gridCol w:w="3813"/>
+        <w:gridCol w:w="3812"/>
+      </w:tblGrid>
+      <w:tr>
+        <w:trPr>
+          <w:cantSplit/>
+          <w:tblHeader w:val="true"/>
+        </w:trPr>
+        <w:tc>
+          <w:tcPr>
+            <w:tcW w:w="1446" w:type="dxa"/>
+            <w:shd w:val="clear" w:color="auto" w:fill="E7E6E6"/>
+            <w:vAlign w:val="center"/>
+          </w:tcPr>
+          <w:p>
+            <w:pPr>
+              <w:pStyle w:val="Compact"/>
+              <w:spacing w:before="20" w:after="20" w:line="252" w:lineRule="auto"/>
+              <w:jc w:val="left"/>
+            </w:pPr>
+            <w:r>
+              <w:rPr>
+                <w:b/>
+                <w:sz w:val="22"/>
+              </w:rPr>
+              <w:t xml:space="preserve">Văn bản của Thanh tra tỉnh</w:t>
+            </w:r>
+          </w:p>
+        </w:tc>
+        <w:tc>
+          <w:tcPr>
+            <w:tcW w:w="3813" w:type="dxa"/>
+            <w:shd w:val="clear" w:color="auto" w:fill="E7E6E6"/>
+            <w:vAlign w:val="center"/>
+          </w:tcPr>
+          <w:p>
+            <w:pPr>
+              <w:pStyle w:val="Compact"/>
+              <w:spacing w:before="20" w:after="20" w:line="252" w:lineRule="auto"/>
+              <w:jc w:val="left"/>
+            </w:pPr>
+            <w:r>
+              <w:rPr>
+                <w:b/>
+                <w:sz w:val="22"/>
+              </w:rPr>
+              <w:t xml:space="preserve">Văn bản ghi lại điều gì</w:t>
+            </w:r>
+          </w:p>
+        </w:tc>
+        <w:tc>
+          <w:tcPr>
+            <w:tcW w:w="3812" w:type="dxa"/>
+            <w:shd w:val="clear" w:color="auto" w:fill="E7E6E6"/>
+            <w:vAlign w:val="center"/>
+          </w:tcPr>
+          <w:p>
+            <w:pPr>
+              <w:pStyle w:val="Compact"/>
+              <w:spacing w:before="20" w:after="20" w:line="252" w:lineRule="auto"/>
+              <w:jc w:val="left"/>
+            </w:pPr>
+            <w:r>
+              <w:rPr>
+                <w:b/>
+                <w:sz w:val="22"/>
+              </w:rPr>
+              <w:t xml:space="preserve">Tại ngày ban hành, các mốc luật định đã qua bao lâu</w:t>
+            </w:r>
+          </w:p>
+        </w:tc>
+      </w:tr>
+      <w:tr>
+        <w:trPr>
+          <w:cantSplit/>
+        </w:trPr>
+        <w:tc>
+          <w:tcPr>
+            <w:tcW w:w="1446" w:type="dxa"/>
+            <w:vAlign w:val="top"/>
+          </w:tcPr>
+          <w:p>
+            <w:pPr>
+              <w:pStyle w:val="Compact"/>
+              <w:spacing w:before="20" w:after="20" w:line="252" w:lineRule="auto"/>
+              <w:jc w:val="left"/>
+            </w:pPr>
+            <w:r>
+              <w:rPr>
+                <w:b/>
+                <w:bCs/>
+                <w:sz w:val="22"/>
+              </w:rPr>
+              <w:t xml:space="preserve">Phiếu chuyển 2329</w:t>
+            </w:r>
+            <w:r>
+              <w:rPr>
+                <w:sz w:val="22"/>
+              </w:rPr>
+              <w:t xml:space="preserve">, 03/8/2026 (15.1)</w:t>
+            </w:r>
+          </w:p>
+        </w:tc>
+        <w:tc>
+          <w:tcPr>
+            <w:tcW w:w="3813" w:type="dxa"/>
+            <w:vAlign w:val="top"/>
+          </w:tcPr>
+          <w:p>
+            <w:pPr>
+              <w:pStyle w:val="Compact"/>
+              <w:spacing w:before="20" w:after="20" w:line="252" w:lineRule="auto"/>
+              <w:jc w:val="left"/>
+            </w:pPr>
+            <w:r>
+              <w:rPr>
+                <w:sz w:val="22"/>
+              </w:rPr>
+              <w:t xml:space="preserve">Ban hành</w:t>
+            </w:r>
+            <w:r>
+              <w:rPr>
+                <w:sz w:val="22"/>
+              </w:rPr>
+              <w:t xml:space="preserve"> </w:t>
+            </w:r>
+            <w:r>
+              <w:rPr>
+                <w:i/>
+                <w:iCs/>
+                <w:sz w:val="22"/>
+              </w:rPr>
+              <w:t xml:space="preserve">“</w:t>
+            </w:r>
+            <w:r>
+              <w:rPr>
+                <w:i/>
+                <w:iCs/>
+                <w:sz w:val="22"/>
+              </w:rPr>
+              <w:t xml:space="preserve">sau khi xem xét nội dung đơn</w:t>
+            </w:r>
+            <w:r>
+              <w:rPr>
+                <w:i/>
+                <w:iCs/>
+                <w:sz w:val="22"/>
+              </w:rPr>
+              <w:t xml:space="preserve">”</w:t>
+            </w:r>
+            <w:r>
+              <w:rPr>
+                <w:sz w:val="22"/>
+              </w:rPr>
+              <w:t xml:space="preserve"> </w:t>
+            </w:r>
+            <w:r>
+              <w:rPr>
+                <w:sz w:val="22"/>
+              </w:rPr>
+              <w:t xml:space="preserve">ghi ngày 27/7/2026 — đơn đề nghị giám sát, đôn đốc — có nội dung</w:t>
+            </w:r>
+            <w:r>
+              <w:rPr>
+                <w:sz w:val="22"/>
+              </w:rPr>
+              <w:t xml:space="preserve"> </w:t>
+            </w:r>
+            <w:r>
+              <w:rPr>
+                <w:i/>
+                <w:iCs/>
+                <w:sz w:val="22"/>
+              </w:rPr>
+              <w:t xml:space="preserve">“</w:t>
+            </w:r>
+            <w:r>
+              <w:rPr>
+                <w:i/>
+                <w:iCs/>
+                <w:sz w:val="22"/>
+              </w:rPr>
+              <w:t xml:space="preserve">Phản ánh việc Ủy ban nhân phường Phan Thiết chưa giải quyết đơn của Ông…</w:t>
+            </w:r>
+            <w:r>
+              <w:rPr>
+                <w:i/>
+                <w:iCs/>
+                <w:sz w:val="22"/>
+              </w:rPr>
+              <w:t xml:space="preserve">”</w:t>
+            </w:r>
+            <w:r>
+              <w:rPr>
+                <w:sz w:val="22"/>
+              </w:rPr>
+              <w:t xml:space="preserve">; yêu cầu phường xem xét xử lý, giải quyết</w:t>
+            </w:r>
+            <w:r>
+              <w:rPr>
+                <w:sz w:val="22"/>
+              </w:rPr>
+              <w:t xml:space="preserve"> </w:t>
+            </w:r>
+            <w:r>
+              <w:rPr>
+                <w:i/>
+                <w:iCs/>
+                <w:sz w:val="22"/>
+              </w:rPr>
+              <w:t xml:space="preserve">“</w:t>
+            </w:r>
+            <w:r>
+              <w:rPr>
+                <w:i/>
+                <w:iCs/>
+                <w:sz w:val="22"/>
+              </w:rPr>
+              <w:t xml:space="preserve">và thông báo kết quả đến Thanh tra tỉnh</w:t>
+            </w:r>
+            <w:r>
+              <w:rPr>
+                <w:i/>
+                <w:iCs/>
+                <w:sz w:val="22"/>
+              </w:rPr>
+              <w:t xml:space="preserve">”</w:t>
+            </w:r>
+          </w:p>
+        </w:tc>
+        <w:tc>
+          <w:tcPr>
+            <w:tcW w:w="3812" w:type="dxa"/>
+            <w:vAlign w:val="top"/>
+          </w:tcPr>
+          <w:p>
+            <w:pPr>
+              <w:pStyle w:val="Compact"/>
+              <w:spacing w:before="20" w:after="20" w:line="252" w:lineRule="auto"/>
+              <w:jc w:val="left"/>
+            </w:pPr>
+            <w:r>
+              <w:rPr>
+                <w:sz w:val="22"/>
+              </w:rPr>
+              <w:t xml:space="preserve">Tuyến Công văn 1436: mốc xử lý ban đầu tối đa 05/6/2026 đã qua</w:t>
+            </w:r>
+            <w:r>
+              <w:rPr>
+                <w:sz w:val="22"/>
+              </w:rPr>
+              <w:t xml:space="preserve"> </w:t>
+            </w:r>
+            <w:r>
+              <w:rPr>
+                <w:b/>
+                <w:bCs/>
+                <w:sz w:val="22"/>
+              </w:rPr>
+              <w:t xml:space="preserve">59 ngày</w:t>
+            </w:r>
+            <w:r>
+              <w:rPr>
+                <w:sz w:val="22"/>
+              </w:rPr>
+              <w:t xml:space="preserve">; mốc báo kết quả cho cơ quan đã chuyển 11/6/2026 đã qua</w:t>
+            </w:r>
+            <w:r>
+              <w:rPr>
+                <w:sz w:val="22"/>
+              </w:rPr>
+              <w:t xml:space="preserve"> </w:t>
+            </w:r>
+            <w:r>
+              <w:rPr>
+                <w:b/>
+                <w:bCs/>
+                <w:sz w:val="22"/>
+              </w:rPr>
+              <w:t xml:space="preserve">53 ngày</w:t>
+            </w:r>
+            <w:r>
+              <w:rPr>
+                <w:sz w:val="22"/>
+              </w:rPr>
+              <w:t xml:space="preserve">. Hồ sơ tố cáo nhận ngày 09/7/2026: mốc xử lý ban đầu tối đa 23/7/2026 đã qua</w:t>
+            </w:r>
+            <w:r>
+              <w:rPr>
+                <w:sz w:val="22"/>
+              </w:rPr>
+              <w:t xml:space="preserve"> </w:t>
+            </w:r>
+            <w:r>
+              <w:rPr>
+                <w:b/>
+                <w:bCs/>
+                <w:sz w:val="22"/>
+              </w:rPr>
+              <w:t xml:space="preserve">11 ngày</w:t>
+            </w:r>
+          </w:p>
+        </w:tc>
+      </w:tr>
+      <w:tr>
+        <w:trPr>
+          <w:cantSplit/>
+        </w:trPr>
+        <w:tc>
+          <w:tcPr>
+            <w:tcW w:w="1446" w:type="dxa"/>
+            <w:vAlign w:val="top"/>
+          </w:tcPr>
+          <w:p>
+            <w:pPr>
+              <w:pStyle w:val="Compact"/>
+              <w:spacing w:before="20" w:after="20" w:line="252" w:lineRule="auto"/>
+              <w:jc w:val="left"/>
+            </w:pPr>
+            <w:r>
+              <w:rPr>
+                <w:b/>
+                <w:bCs/>
+                <w:sz w:val="22"/>
+              </w:rPr>
+              <w:t xml:space="preserve">Văn bản 2644</w:t>
+            </w:r>
+            <w:r>
+              <w:rPr>
+                <w:sz w:val="22"/>
+              </w:rPr>
+              <w:t xml:space="preserve">, 27/8/2026 (15.3)</w:t>
+            </w:r>
+          </w:p>
+        </w:tc>
+        <w:tc>
+          <w:tcPr>
+            <w:tcW w:w="3813" w:type="dxa"/>
+            <w:vAlign w:val="top"/>
+          </w:tcPr>
+          <w:p>
+            <w:pPr>
+              <w:pStyle w:val="Compact"/>
+              <w:spacing w:before="20" w:after="20" w:line="252" w:lineRule="auto"/>
+              <w:jc w:val="left"/>
+            </w:pPr>
+            <w:r>
+              <w:rPr>
+                <w:sz w:val="22"/>
+              </w:rPr>
+              <w:t xml:space="preserve">Theo chính Công văn 3292, ban hành sau khi nhận đơn đề ngày 21/8/2026</w:t>
+            </w:r>
+            <w:r>
+              <w:rPr>
+                <w:sz w:val="22"/>
+              </w:rPr>
+              <w:t xml:space="preserve"> </w:t>
+            </w:r>
+            <w:r>
+              <w:rPr>
+                <w:i/>
+                <w:iCs/>
+                <w:sz w:val="22"/>
+              </w:rPr>
+              <w:t xml:space="preserve">“</w:t>
+            </w:r>
+            <w:r>
+              <w:rPr>
+                <w:i/>
+                <w:iCs/>
+                <w:sz w:val="22"/>
+              </w:rPr>
+              <w:t xml:space="preserve">với nội dung cho rằng công dân chưa nhận được kết quả giải quyết của Ủy ban nhân dân phường Phan Thiết</w:t>
+            </w:r>
+            <w:r>
+              <w:rPr>
+                <w:i/>
+                <w:iCs/>
+                <w:sz w:val="22"/>
+              </w:rPr>
+              <w:t xml:space="preserve">”</w:t>
+            </w:r>
+            <w:r>
+              <w:rPr>
+                <w:sz w:val="22"/>
+              </w:rPr>
+              <w:t xml:space="preserve"> </w:t>
+            </w:r>
+            <w:r>
+              <w:rPr>
+                <w:sz w:val="22"/>
+              </w:rPr>
+              <w:t xml:space="preserve">theo Phiếu chuyển 2329; đề nghị phường</w:t>
+            </w:r>
+            <w:r>
+              <w:rPr>
+                <w:sz w:val="22"/>
+              </w:rPr>
+              <w:t xml:space="preserve"> </w:t>
+            </w:r>
+            <w:r>
+              <w:rPr>
+                <w:i/>
+                <w:iCs/>
+                <w:sz w:val="22"/>
+              </w:rPr>
+              <w:t xml:space="preserve">“</w:t>
+            </w:r>
+            <w:r>
+              <w:rPr>
+                <w:i/>
+                <w:iCs/>
+                <w:sz w:val="22"/>
+              </w:rPr>
+              <w:t xml:space="preserve">khẩn trương</w:t>
+            </w:r>
+            <w:r>
+              <w:rPr>
+                <w:i/>
+                <w:iCs/>
+                <w:sz w:val="22"/>
+              </w:rPr>
+              <w:t xml:space="preserve">”</w:t>
+            </w:r>
+            <w:r>
+              <w:rPr>
+                <w:sz w:val="22"/>
+              </w:rPr>
+              <w:t xml:space="preserve"> </w:t>
+            </w:r>
+            <w:r>
+              <w:rPr>
+                <w:sz w:val="22"/>
+              </w:rPr>
+              <w:t xml:space="preserve">và</w:t>
+            </w:r>
+            <w:r>
+              <w:rPr>
+                <w:sz w:val="22"/>
+              </w:rPr>
+              <w:t xml:space="preserve"> </w:t>
+            </w:r>
+            <w:r>
+              <w:rPr>
+                <w:i/>
+                <w:iCs/>
+                <w:sz w:val="22"/>
+              </w:rPr>
+              <w:t xml:space="preserve">“</w:t>
+            </w:r>
+            <w:r>
+              <w:rPr>
+                <w:i/>
+                <w:iCs/>
+                <w:sz w:val="22"/>
+              </w:rPr>
+              <w:t xml:space="preserve">thông báo kết quả đến Thanh tra tỉnh</w:t>
+            </w:r>
+            <w:r>
+              <w:rPr>
+                <w:i/>
+                <w:iCs/>
+                <w:sz w:val="22"/>
+              </w:rPr>
+              <w:t xml:space="preserve">”</w:t>
+            </w:r>
+            <w:r>
+              <w:rPr>
+                <w:sz w:val="22"/>
+              </w:rPr>
+              <w:t xml:space="preserve">; gửi kèm lại chính Phiếu chuyển 2329</w:t>
+            </w:r>
+          </w:p>
+        </w:tc>
+        <w:tc>
+          <w:tcPr>
+            <w:tcW w:w="3812" w:type="dxa"/>
+            <w:vAlign w:val="top"/>
+          </w:tcPr>
+          <w:p>
+            <w:pPr>
+              <w:pStyle w:val="Compact"/>
+              <w:spacing w:before="20" w:after="20" w:line="252" w:lineRule="auto"/>
+              <w:jc w:val="left"/>
+            </w:pPr>
+            <w:r>
+              <w:rPr>
+                <w:sz w:val="22"/>
+              </w:rPr>
+              <w:t xml:space="preserve">Ba mốc trên đã qua lần lượt</w:t>
+            </w:r>
+            <w:r>
+              <w:rPr>
+                <w:sz w:val="22"/>
+              </w:rPr>
+              <w:t xml:space="preserve"> </w:t>
+            </w:r>
+            <w:r>
+              <w:rPr>
+                <w:b/>
+                <w:bCs/>
+                <w:sz w:val="22"/>
+              </w:rPr>
+              <w:t xml:space="preserve">83 ngày</w:t>
+            </w:r>
+            <w:r>
+              <w:rPr>
+                <w:sz w:val="22"/>
+              </w:rPr>
+              <w:t xml:space="preserve">,</w:t>
+            </w:r>
+            <w:r>
+              <w:rPr>
+                <w:sz w:val="22"/>
+              </w:rPr>
+              <w:t xml:space="preserve"> </w:t>
+            </w:r>
+            <w:r>
+              <w:rPr>
+                <w:b/>
+                <w:bCs/>
+                <w:sz w:val="22"/>
+              </w:rPr>
+              <w:t xml:space="preserve">77 ngày</w:t>
+            </w:r>
+            <w:r>
+              <w:rPr>
+                <w:sz w:val="22"/>
+              </w:rPr>
+              <w:t xml:space="preserve"> </w:t>
+            </w:r>
+            <w:r>
+              <w:rPr>
+                <w:sz w:val="22"/>
+              </w:rPr>
+              <w:t xml:space="preserve">và</w:t>
+            </w:r>
+            <w:r>
+              <w:rPr>
+                <w:sz w:val="22"/>
+              </w:rPr>
+              <w:t xml:space="preserve"> </w:t>
+            </w:r>
+            <w:r>
+              <w:rPr>
+                <w:b/>
+                <w:bCs/>
+                <w:sz w:val="22"/>
+              </w:rPr>
+              <w:t xml:space="preserve">35 ngày</w:t>
+            </w:r>
+          </w:p>
+        </w:tc>
+      </w:tr>
+    </w:tbl>
+    <w:p>
+      <w:pPr>
+        <w:pStyle w:val="BodyText"/>
+        <w:spacing w:before="160"/>
+      </w:pPr>
+      <w:r>
+        <w:t xml:space="preserve">Ba điều đọc được từ bảng này.</w:t>
+      </w:r>
+    </w:p>
+    <w:p>
+      <w:pPr>
+        <w:pStyle w:val="BodyText"/>
+      </w:pPr>
+      <w:r>
+        <w:rPr>
+          <w:b/>
+          <w:bCs/>
+        </w:rPr>
+        <w:t xml:space="preserve">Thứ nhất, hai văn bản không đặt lại nội dung của đơn thành vấn đề.</w:t>
+      </w:r>
+      <w:r>
+        <w:t xml:space="preserve"> </w:t>
+      </w:r>
+      <w:r>
+        <w:t xml:space="preserve">Phiếu chuyển 2329 ghi đã</w:t>
+      </w:r>
+      <w:r>
+        <w:t xml:space="preserve"> </w:t>
+      </w:r>
+      <w:r>
+        <w:rPr>
+          <w:i/>
+          <w:iCs/>
+        </w:rPr>
+        <w:t xml:space="preserve">“</w:t>
+      </w:r>
+      <w:r>
+        <w:rPr>
+          <w:i/>
+          <w:iCs/>
+        </w:rPr>
+        <w:t xml:space="preserve">xem xét nội dung đơn</w:t>
+      </w:r>
+      <w:r>
+        <w:rPr>
+          <w:i/>
+          <w:iCs/>
+        </w:rPr>
+        <w:t xml:space="preserve">”</w:t>
+      </w:r>
+      <w:r>
+        <w:t xml:space="preserve"> </w:t>
+      </w:r>
+      <w:r>
+        <w:t xml:space="preserve">rồi chuyển kèm yêu cầu báo kết quả. Văn bản 2644 dùng lại đúng yêu cầu ấy, thêm chữ</w:t>
+      </w:r>
+      <w:r>
+        <w:t xml:space="preserve"> </w:t>
+      </w:r>
+      <w:r>
+        <w:rPr>
+          <w:i/>
+          <w:iCs/>
+        </w:rPr>
+        <w:t xml:space="preserve">“</w:t>
+      </w:r>
+      <w:r>
+        <w:rPr>
+          <w:i/>
+          <w:iCs/>
+        </w:rPr>
+        <w:t xml:space="preserve">khẩn trương</w:t>
+      </w:r>
+      <w:r>
+        <w:rPr>
+          <w:i/>
+          <w:iCs/>
+        </w:rPr>
+        <w:t xml:space="preserve">”</w:t>
+      </w:r>
+      <w:r>
+        <w:t xml:space="preserve"> </w:t>
+      </w:r>
+      <w:r>
+        <w:t xml:space="preserve">và gửi kèm lại chính Phiếu 2329. Một văn bản đề nghị khẩn trương thực hiện một phiếu chuyển đã ban hành 24 ngày trước, gửi kèm lại chính phiếu ấy, chỉ có nghĩa khi yêu cầu của phiếu ấy chưa được thực hiện xong. Về nội dung, Văn bản 2644 là Phiếu chuyển 2329 cộng thêm chữ</w:t>
+      </w:r>
+      <w:r>
+        <w:t xml:space="preserve"> </w:t>
+      </w:r>
+      <w:r>
+        <w:t xml:space="preserve">“</w:t>
+      </w:r>
+      <w:r>
+        <w:t xml:space="preserve">khẩn trương</w:t>
+      </w:r>
+      <w:r>
+        <w:t xml:space="preserve">”</w:t>
+      </w:r>
+      <w:r>
+        <w:t xml:space="preserve"> </w:t>
+      </w:r>
+      <w:r>
+        <w:t xml:space="preserve">— tức là một văn bản đôn đốc, dù trích yếu ghi</w:t>
+      </w:r>
+      <w:r>
+        <w:t xml:space="preserve"> </w:t>
+      </w:r>
+      <w:r>
+        <w:rPr>
+          <w:i/>
+          <w:iCs/>
+        </w:rPr>
+        <w:t xml:space="preserve">“</w:t>
+      </w:r>
+      <w:r>
+        <w:rPr>
+          <w:i/>
+          <w:iCs/>
+        </w:rPr>
+        <w:t xml:space="preserve">V/v chuyển đơn kiến nghị, phản ánh</w:t>
+      </w:r>
+      <w:r>
+        <w:rPr>
+          <w:i/>
+          <w:iCs/>
+        </w:rPr>
+        <w:t xml:space="preserve">”</w:t>
+      </w:r>
+      <w:r>
+        <w:t xml:space="preserve">.</w:t>
+      </w:r>
+    </w:p>
+    <w:p>
+      <w:pPr>
+        <w:pStyle w:val="BodyText"/>
+      </w:pPr>
+      <w:r>
+        <w:rPr>
+          <w:b/>
+          <w:bCs/>
+        </w:rPr>
+        <w:t xml:space="preserve">Thứ hai, ngày tháng của việc chậm nằm sẵn trong hồ sơ của chính Thanh tra tỉnh.</w:t>
+      </w:r>
+      <w:r>
+        <w:t xml:space="preserve"> </w:t>
+      </w:r>
+      <w:r>
+        <w:t xml:space="preserve">Có ba nguồn, đều ở đó: hai đơn đầu vào, ghi ngày 27/7/2026 và đề ngày 21/8/2026; hai văn bản của chính Thanh tra tỉnh, Phiếu chuyển 2329 và Văn bản 2644; và Thông báo 5553 — nơi nhận ghi</w:t>
+      </w:r>
+      <w:r>
+        <w:t xml:space="preserve"> </w:t>
+      </w:r>
+      <w:r>
+        <w:rPr>
+          <w:i/>
+          <w:iCs/>
+        </w:rPr>
+        <w:t xml:space="preserve">“</w:t>
+      </w:r>
+      <w:r>
+        <w:rPr>
+          <w:i/>
+          <w:iCs/>
+        </w:rPr>
+        <w:t xml:space="preserve">Thanh tra tỉnh (báo cáo)</w:t>
+      </w:r>
+      <w:r>
+        <w:rPr>
+          <w:i/>
+          <w:iCs/>
+        </w:rPr>
+        <w:t xml:space="preserve">”</w:t>
+      </w:r>
+      <w:r>
+        <w:t xml:space="preserve"> </w:t>
+      </w:r>
+      <w:r>
+        <w:t xml:space="preserve">— ký ngày 28/8/2026, một ngày sau Văn bản 2644, với ngày phường nhận Công văn 1436 ghi ngay ở dòng mở đầu (mục 4.8). Đối với Hồ sơ tố cáo nhận ngày 09/7/2026, đến nay chưa có văn bản nào (mục 5.8). Việc xác định các mốc đã qua không cần một cuộc xác minh; chỉ cần đặt các ngày ấy cạnh khoản 1 Điều 24 và khoản 2 Điều 26 Luật Tố cáo.</w:t>
+      </w:r>
+    </w:p>
+    <w:p>
+      <w:pPr>
+        <w:pStyle w:val="BodyText"/>
+      </w:pPr>
+      <w:r>
+        <w:rPr>
+          <w:b/>
+          <w:bCs/>
+        </w:rPr>
+        <w:t xml:space="preserve">Thứ ba, Công văn 3292 mô tả Văn bản 2644 theo trích yếu, không theo nội dung.</w:t>
+      </w:r>
+      <w:r>
+        <w:t xml:space="preserve"> </w:t>
+      </w:r>
+      <w:r>
+        <w:t xml:space="preserve">Đoạn kết đặt Văn bản 2644 cạnh Công văn 1436 dưới chữ chung</w:t>
+      </w:r>
+      <w:r>
+        <w:t xml:space="preserve"> </w:t>
+      </w:r>
+      <w:r>
+        <w:rPr>
+          <w:i/>
+          <w:iCs/>
+        </w:rPr>
+        <w:t xml:space="preserve">“</w:t>
+      </w:r>
+      <w:r>
+        <w:rPr>
+          <w:i/>
+          <w:iCs/>
+        </w:rPr>
+        <w:t xml:space="preserve">chuyển đơn</w:t>
+      </w:r>
+      <w:r>
+        <w:rPr>
+          <w:i/>
+          <w:iCs/>
+        </w:rPr>
+        <w:t xml:space="preserve">”</w:t>
+      </w:r>
+      <w:r>
+        <w:t xml:space="preserve"> </w:t>
+      </w:r>
+      <w:r>
+        <w:t xml:space="preserve">và kết luận</w:t>
+      </w:r>
+      <w:r>
+        <w:t xml:space="preserve"> </w:t>
+      </w:r>
+      <w:r>
+        <w:rPr>
+          <w:i/>
+          <w:iCs/>
+        </w:rPr>
+        <w:t xml:space="preserve">“</w:t>
+      </w:r>
+      <w:r>
+        <w:rPr>
+          <w:i/>
+          <w:iCs/>
+        </w:rPr>
+        <w:t xml:space="preserve">là đúng quy định</w:t>
+      </w:r>
+      <w:r>
+        <w:rPr>
+          <w:i/>
+          <w:iCs/>
+        </w:rPr>
+        <w:t xml:space="preserve">”</w:t>
+      </w:r>
+      <w:r>
+        <w:t xml:space="preserve"> </w:t>
+      </w:r>
+      <w:r>
+        <w:t xml:space="preserve">(mục 4.7, 4.16); bản thuật lại bỏ cụm</w:t>
+      </w:r>
+      <w:r>
+        <w:t xml:space="preserve"> </w:t>
+      </w:r>
+      <w:r>
+        <w:rPr>
+          <w:i/>
+          <w:iCs/>
+        </w:rPr>
+        <w:t xml:space="preserve">“</w:t>
+      </w:r>
+      <w:r>
+        <w:rPr>
+          <w:i/>
+          <w:iCs/>
+        </w:rPr>
+        <w:t xml:space="preserve">và thông báo kết quả đến Thanh tra tỉnh</w:t>
+      </w:r>
+      <w:r>
+        <w:rPr>
+          <w:i/>
+          <w:iCs/>
+        </w:rPr>
+        <w:t xml:space="preserve">”</w:t>
+      </w:r>
+      <w:r>
+        <w:t xml:space="preserve"> </w:t>
+      </w:r>
+      <w:r>
+        <w:t xml:space="preserve">(mục 4.15). Hệ quả đọc được trên văn bản: khi Văn bản 2644 được xếp vào nhóm văn bản chuyển đơn, ba câu hỏi không còn chỗ trong văn bản trả lời — (a) phường đã thực hiện yêu cầu tại Phiếu chuyển 2329 và Văn bản 2644 chưa; (b) việc xử lý của phường có đúng thời hạn luật định không, với các khoảng thời gian nêu ở bảng trên; (c) việc đôn đốc và việc xem xét trách nhiệm tiếp theo là gì. Câu (c) chính là nội dung đề nghị thứ hai của đơn ngày 06/10/2026, trong đó có đề nghị</w:t>
+      </w:r>
+      <w:r>
+        <w:t xml:space="preserve"> </w:t>
+      </w:r>
+      <w:r>
+        <w:rPr>
+          <w:i/>
+          <w:iCs/>
+        </w:rPr>
+        <w:t xml:space="preserve">“</w:t>
+      </w:r>
+      <w:r>
+        <w:rPr>
+          <w:i/>
+          <w:iCs/>
+        </w:rPr>
+        <w:t xml:space="preserve">xem xét, xử lý theo thẩm quyền hoặc kiến nghị cấp có thẩm quyền xử lý trách nhiệm theo quy định của pháp luật đối với việc chậm thực hiện Phiếu chuyển số 2329/TTr-TCDKNTC và Văn bản số 2644/TTr-TCDKNTC</w:t>
+      </w:r>
+      <w:r>
+        <w:rPr>
+          <w:i/>
+          <w:iCs/>
+        </w:rPr>
+        <w:t xml:space="preserve">”</w:t>
+      </w:r>
+      <w:r>
+        <w:t xml:space="preserve">. Công văn 3292 không có câu nào về ba câu hỏi ấy.</w:t>
+      </w:r>
+    </w:p>
+    <w:p>
+      <w:pPr>
+        <w:pStyle w:val="BodyText"/>
+      </w:pPr>
+      <w:r>
+        <w:t xml:space="preserve">Mục này chỉ nêu hệ quả đọc được trên văn bản. Việc phường có vi phạm thời hạn hay không, và trách nhiệm đến đâu, thuộc người có thẩm quyền xác định; điều tôi đề nghị là ý kiến về việc ấy được nêu bằng văn bản (mục 9, B.6, B.7).</w:t>
+      </w:r>
+    </w:p>
     <w:bookmarkEnd w:id="46"/>
-    <w:bookmarkStart w:id="55" w:name="X81787a2f44ab3a2d81abce2b0fbd0900d582b2e"/>
+    <w:bookmarkStart w:id="47" w:name="X1389df8d72d39b7111bcdba61611f7d780a370f"/>
+    <w:p>
+      <w:pPr>
+        <w:pStyle w:val="Heading3"/>
+      </w:pPr>
+      <w:r>
+        <w:t xml:space="preserve">4.21. Phiếu hướng dẫn 2960: không chỉ ra nội dung nào, nơi nào; bộ hồ sơ được trả lại; căn cứ của việc trả lại</w:t>
+      </w:r>
+    </w:p>
+    <w:p>
+      <w:pPr>
+        <w:pStyle w:val="FirstParagraph"/>
+      </w:pPr>
+      <w:r>
+        <w:t xml:space="preserve">Mục 4.10 và mục 4.17 dùng Phiếu hướng dẫn 2960 làm mốc so sánh. Mục này xét chính tờ phiếu ấy, vì nó trả lời đơn ngày 14/9/2026 — đơn đặt câu hỏi về Công văn 1436 lần đầu — và vì những câu hỏi không được trả lời ở đó là những câu Công văn 3292 lại để ngỏ (mục 3, 4.5).</w:t>
+      </w:r>
+    </w:p>
+    <w:p>
+      <w:pPr>
+        <w:pStyle w:val="BodyText"/>
+      </w:pPr>
+      <w:r>
+        <w:rPr>
+          <w:b/>
+          <w:bCs/>
+        </w:rPr>
+        <w:t xml:space="preserve">Đơn ngày 14/9/2026 đã tự tách loại đơn và nơi nhận.</w:t>
+      </w:r>
+      <w:r>
+        <w:t xml:space="preserve"> </w:t>
+      </w:r>
+      <w:r>
+        <w:t xml:space="preserve">Cùng ngày 14/9/2026 tôi lập hai đơn riêng, gửi hai người khác nhau: Đơn tố cáo gửi Chủ tịch Ủy ban nhân dân tỉnh (17.02–03; nhận lúc 10 giờ 09 ngày 17/9/2026, 16.4) và Đơn đề nghị gửi Chánh Thanh tra tỉnh (17.05; giao ngày 18/9/2026, 16.5). Mỗi nơi nhận một bộ giấy riêng, 14 trang: trang bìa và mục lục 3 trang, đơn có chữ ký 11 trang; các tài liệu còn lại nộp bản số hóa. Trang 1 của đơn gửi Chánh Thanh tra tỉnh ghi:</w:t>
+      </w:r>
+    </w:p>
+    <w:p>
+      <w:pPr>
+        <w:pStyle w:val="BlockText"/>
+      </w:pPr>
+      <w:r>
+        <w:rPr>
+          <w:i/>
+          <w:iCs/>
+        </w:rPr>
+        <w:t xml:space="preserve">“</w:t>
+      </w:r>
+      <w:r>
+        <w:rPr>
+          <w:i/>
+          <w:iCs/>
+        </w:rPr>
+        <w:t xml:space="preserve">Loại đơn: đơn đề nghị, thuộc loại đơn kiến nghị, phản ánh theo Thông tư số 05/2021/TT-TTCP. Không phải đơn khiếu nại và không phải đơn tố cáo. Cùng ngày, tôi có một đơn tố cáo gửi Chủ tịch Ủy ban nhân dân tỉnh Lâm Đồng; bản sao kèm theo đây.</w:t>
+      </w:r>
+      <w:r>
+        <w:rPr>
+          <w:i/>
+          <w:iCs/>
+        </w:rPr>
+        <w:t xml:space="preserve">”</w:t>
+      </w:r>
+    </w:p>
+    <w:p>
+      <w:pPr>
+        <w:pStyle w:val="FirstParagraph"/>
+      </w:pPr>
+      <w:r>
+        <w:t xml:space="preserve">Mục III của đơn viết tiếp:</w:t>
+      </w:r>
+      <w:r>
+        <w:t xml:space="preserve"> </w:t>
+      </w:r>
+      <w:r>
+        <w:rPr>
+          <w:i/>
+          <w:iCs/>
+        </w:rPr>
+        <w:t xml:space="preserve">“</w:t>
+      </w:r>
+      <w:r>
+        <w:rPr>
+          <w:i/>
+          <w:iCs/>
+        </w:rPr>
+        <w:t xml:space="preserve">đây là đơn kiến nghị, phản ánh theo Thông tư số 05/2021/TT-TTCP, nội dung thuộc trách nhiệm quản lý của Quý cơ quan, việc xử lý theo Điều 20 thông tư ấy.</w:t>
+      </w:r>
+      <w:r>
+        <w:rPr>
+          <w:i/>
+          <w:iCs/>
+        </w:rPr>
+        <w:t xml:space="preserve">”</w:t>
+      </w:r>
+      <w:r>
+        <w:t xml:space="preserve"> </w:t>
+      </w:r>
+      <w:r>
+        <w:t xml:space="preserve">Đề nghị cuối cùng, Mục VII.17, đã tính trước trường hợp có phần phải chuyển:</w:t>
+      </w:r>
+      <w:r>
+        <w:t xml:space="preserve"> </w:t>
+      </w:r>
+      <w:r>
+        <w:rPr>
+          <w:i/>
+          <w:iCs/>
+        </w:rPr>
+        <w:t xml:space="preserve">“</w:t>
+      </w:r>
+      <w:r>
+        <w:rPr>
+          <w:i/>
+          <w:iCs/>
+        </w:rPr>
+        <w:t xml:space="preserve">Trường hợp cần chuyển đơn đến cơ quan khác, kính đề nghị thông báo nơi nhận, số và ngày văn bản chuyển.</w:t>
+      </w:r>
+      <w:r>
+        <w:rPr>
+          <w:i/>
+          <w:iCs/>
+        </w:rPr>
+        <w:t xml:space="preserve">”</w:t>
+      </w:r>
+    </w:p>
+    <w:p>
+      <w:pPr>
+        <w:pStyle w:val="BodyText"/>
+      </w:pPr>
+      <w:r>
+        <w:rPr>
+          <w:b/>
+          <w:bCs/>
+        </w:rPr>
+        <w:t xml:space="preserve">Phiếu 2960 viết gì.</w:t>
+      </w:r>
+      <w:r>
+        <w:t xml:space="preserve"> </w:t>
+      </w:r>
+      <w:r>
+        <w:t xml:space="preserve">Toàn văn phần nội dung (15.4):</w:t>
+      </w:r>
+    </w:p>
+    <w:p>
+      <w:pPr>
+        <w:pStyle w:val="BlockText"/>
+      </w:pPr>
+      <w:r>
+        <w:rPr>
+          <w:i/>
+          <w:iCs/>
+        </w:rPr>
+        <w:t xml:space="preserve">“</w:t>
+      </w:r>
+      <w:r>
+        <w:rPr>
+          <w:i/>
+          <w:iCs/>
+        </w:rPr>
+        <w:t xml:space="preserve">Ngày 21 tháng 9 năm 2026, Thanh tra tỉnh nhận được đơn ghi ngày 14 tháng 9 năm 2026 của công dân.</w:t>
+      </w:r>
+      <w:r>
+        <w:rPr>
+          <w:i/>
+          <w:iCs/>
+        </w:rPr>
+        <w:t xml:space="preserve">”</w:t>
+      </w:r>
+    </w:p>
+    <w:p>
+      <w:pPr>
+        <w:pStyle w:val="BlockText"/>
+      </w:pPr>
+      <w:r>
+        <w:rPr>
+          <w:i/>
+          <w:iCs/>
+        </w:rPr>
+        <w:t xml:space="preserve">“</w:t>
+      </w:r>
+      <w:r>
+        <w:rPr>
+          <w:i/>
+          <w:iCs/>
+        </w:rPr>
+        <w:t xml:space="preserve">Sau khi xem xét nội dung đơn và các thông tin, tài liệu kèm theo, đơn của công dân có cả nội dung kiến nghị, phản ánh và tố cáo; đơn có nhiều nội dung thuộc thẩm quyền giải quyết của nhiều cơ quan, tổ chức, đơn vị, cá nhân. Do vậy, Thanh tra tỉnh hướng dẫn công dân viết lại đơn, tách nội dung đơn và gửi đơn đến cơ quan, tổ chức, đơn vị, cá nhân có thẩm quyền giải quyết theo quy định của pháp luật./.</w:t>
+      </w:r>
+      <w:r>
+        <w:rPr>
+          <w:i/>
+          <w:iCs/>
+        </w:rPr>
+        <w:t xml:space="preserve">”</w:t>
+      </w:r>
+    </w:p>
+    <w:p>
+      <w:pPr>
+        <w:pStyle w:val="FirstParagraph"/>
+      </w:pPr>
+      <w:r>
+        <w:t xml:space="preserve">Mục</w:t>
+      </w:r>
+      <w:r>
+        <w:t xml:space="preserve"> </w:t>
+      </w:r>
+      <w:r>
+        <w:t xml:space="preserve">“</w:t>
+      </w:r>
+      <w:r>
+        <w:t xml:space="preserve">Nơi nhận</w:t>
+      </w:r>
+      <w:r>
+        <w:t xml:space="preserve">”</w:t>
+      </w:r>
+      <w:r>
+        <w:t xml:space="preserve"> </w:t>
+      </w:r>
+      <w:r>
+        <w:t xml:space="preserve">của phiếu ghi ba dòng:</w:t>
+      </w:r>
+      <w:r>
+        <w:t xml:space="preserve"> </w:t>
+      </w:r>
+      <w:r>
+        <w:t xml:space="preserve">“</w:t>
+      </w:r>
+      <w:r>
+        <w:t xml:space="preserve">Như trên</w:t>
+      </w:r>
+      <w:r>
+        <w:t xml:space="preserve">”</w:t>
+      </w:r>
+      <w:r>
+        <w:t xml:space="preserve">,</w:t>
+      </w:r>
+      <w:r>
+        <w:t xml:space="preserve"> </w:t>
+      </w:r>
+      <w:r>
+        <w:t xml:space="preserve">“</w:t>
+      </w:r>
+      <w:r>
+        <w:t xml:space="preserve">TTTĐT</w:t>
+      </w:r>
+      <w:r>
+        <w:t xml:space="preserve">”</w:t>
+      </w:r>
+      <w:r>
+        <w:t xml:space="preserve">,</w:t>
+      </w:r>
+      <w:r>
+        <w:t xml:space="preserve"> </w:t>
+      </w:r>
+      <w:r>
+        <w:t xml:space="preserve">“</w:t>
+      </w:r>
+      <w:r>
+        <w:t xml:space="preserve">Lưu: VT, PKNTC.1</w:t>
+      </w:r>
+      <w:r>
+        <w:t xml:space="preserve">”</w:t>
+      </w:r>
+      <w:r>
+        <w:t xml:space="preserve">. Phiếu không dẫn điều, khoản nào; không nêu nội dung nào là kiến nghị, phản ánh, nội dung nào là tố cáo; không nêu nội dung nào thuộc thẩm quyền của cơ quan, người nào. Bộ hồ sơ giấy tôi gửi được trả lại, kèm duy nhất tờ phiếu này; không có văn bản nào khác.</w:t>
+      </w:r>
+    </w:p>
+    <w:p>
+      <w:pPr>
+        <w:pStyle w:val="BodyText"/>
+      </w:pPr>
+      <w:r>
+        <w:rPr>
+          <w:b/>
+          <w:bCs/>
+        </w:rPr>
+        <w:t xml:space="preserve">Để công bằng.</w:t>
+      </w:r>
+      <w:r>
+        <w:t xml:space="preserve"> </w:t>
+      </w:r>
+      <w:r>
+        <w:t xml:space="preserve">Đơn ngày 14/9/2026 có những chỗ làm cho nhận định</w:t>
+      </w:r>
+      <w:r>
+        <w:t xml:space="preserve"> </w:t>
+      </w:r>
+      <w:r>
+        <w:t xml:space="preserve">“</w:t>
+      </w:r>
+      <w:r>
+        <w:t xml:space="preserve">có cả nội dung … tố cáo</w:t>
+      </w:r>
+      <w:r>
+        <w:t xml:space="preserve">”</w:t>
+      </w:r>
+      <w:r>
+        <w:t xml:space="preserve"> </w:t>
+      </w:r>
+      <w:r>
+        <w:t xml:space="preserve">có chỗ dựa: Mục VII.14 đề nghị lập hồ sơ chuyển Cơ quan điều tra hoặc Viện kiểm sát đối với các hành vi tại Ủy ban nhân dân phường; Mục VII.12 đề nghị áp dụng biện pháp bảo vệ theo Luật Tố cáo; và hồ sơ kèm bản sao một đơn tố cáo. Tôi không tranh luận rằng nhận định ấy không có căn cứ. Điều tôi nêu là phần tiếp theo mà quy định đòi hỏi, và phần ấy không có trên tờ phiếu.</w:t>
+      </w:r>
+    </w:p>
+    <w:p>
+      <w:pPr>
+        <w:pStyle w:val="BodyText"/>
+      </w:pPr>
+      <w:r>
+        <w:rPr>
+          <w:b/>
+          <w:bCs/>
+        </w:rPr>
+        <w:t xml:space="preserve">Quy định đòi hỏi gì.</w:t>
+      </w:r>
+      <w:r>
+        <w:t xml:space="preserve"> </w:t>
+      </w:r>
+      <w:r>
+        <w:t xml:space="preserve">Điều 21 Thông tư số 05/2021/TT-TTCP quy định một việc: đơn có cả nội dung khiếu nại, tố cáo, kiến nghị, phản ánh thì người xử lý đơn hướng dẫn người gửi tách riêng từng nội dung để gửi đến đúng cơ quan, tổ chức, đơn vị, cá nhân có thẩm quyền giải quyết; việc hướng dẫn thực hiện theo Mẫu số 05. Mẫu số 05 có phần ghi từng nội dung của đơn và cơ quan, người có thẩm quyền giải quyết nội dung ấy — chính phần làm cho tờ phiếu thành một lời hướng dẫn. Phiếu 2960 dùng đúng tên mẫu và đúng câu mở đầu</w:t>
+      </w:r>
+      <w:r>
+        <w:t xml:space="preserve"> </w:t>
+      </w:r>
+      <w:r>
+        <w:rPr>
+          <w:i/>
+          <w:iCs/>
+        </w:rPr>
+        <w:t xml:space="preserve">“</w:t>
+      </w:r>
+      <w:r>
+        <w:rPr>
+          <w:i/>
+          <w:iCs/>
+        </w:rPr>
+        <w:t xml:space="preserve">Sau khi xem xét nội dung đơn và các thông tin, tài liệu kèm theo</w:t>
+      </w:r>
+      <w:r>
+        <w:rPr>
+          <w:i/>
+          <w:iCs/>
+        </w:rPr>
+        <w:t xml:space="preserve">”</w:t>
+      </w:r>
+      <w:r>
+        <w:t xml:space="preserve">, nhưng ở chỗ phải ghi từng nội dung và từng nơi thì ghi chung</w:t>
+      </w:r>
+      <w:r>
+        <w:t xml:space="preserve"> </w:t>
+      </w:r>
+      <w:r>
+        <w:rPr>
+          <w:i/>
+          <w:iCs/>
+        </w:rPr>
+        <w:t xml:space="preserve">“</w:t>
+      </w:r>
+      <w:r>
+        <w:rPr>
+          <w:i/>
+          <w:iCs/>
+        </w:rPr>
+        <w:t xml:space="preserve">nhiều cơ quan, tổ chức, đơn vị, cá nhân</w:t>
+      </w:r>
+      <w:r>
+        <w:rPr>
+          <w:i/>
+          <w:iCs/>
+        </w:rPr>
+        <w:t xml:space="preserve">”</w:t>
+      </w:r>
+      <w:r>
+        <w:t xml:space="preserve">.</w:t>
+      </w:r>
+    </w:p>
+    <w:p>
+      <w:pPr>
+        <w:pStyle w:val="BodyText"/>
+      </w:pPr>
+      <w:r>
+        <w:t xml:space="preserve">Bên cạnh Điều 21, ba quy định khác vẫn áp dụng cho từng phần của đơn: khoản 1 Điều 20 Thông tư — nội dung thuộc trách nhiệm quản lý của cơ quan mình thì giải quyết, trả lời; khoản 2 Điều 20 — nội dung không thuộc thì chuyển đến cơ quan có trách nhiệm và thông báo cho người gửi; và đối với nội dung tố cáo không thuộc thẩm quyền, khoản 2 Điều 24 Luật Tố cáo — chuyển trong 05 ngày làm việc và thông báo cho người tố cáo. Theo cách đọc của tôi, việc hướng dẫn tách đơn nhằm đưa những phần phải giải quyết ở nơi khác đến đúng nơi; nó không làm cho phần thuộc trách nhiệm của chính cơ quan nhận đơn thôi thuộc khoản 1 Điều 20.</w:t>
+      </w:r>
+    </w:p>
+    <w:p>
+      <w:pPr>
+        <w:pStyle w:val="BodyText"/>
+      </w:pPr>
+      <w:r>
+        <w:rPr>
+          <w:b/>
+          <w:bCs/>
+        </w:rPr>
+        <w:t xml:space="preserve">Có quy định nào cho trả lại đơn vì đơn có nhiều nội dung không?</w:t>
+      </w:r>
+      <w:r>
+        <w:t xml:space="preserve"> </w:t>
+      </w:r>
+      <w:r>
+        <w:t xml:space="preserve">Tôi chưa tìm thấy. Điều 21 nói về việc hướng dẫn tách nội dung, không nói về việc trả lại đơn hay trả lại hồ sơ. Đối với phần tố cáo không thuộc thẩm quyền, Luật Tố cáo quy định chuyển và thông báo, không quy định trả lại. Đối với phần kiến nghị, phản ánh không thuộc trách nhiệm, khoản 2 Điều 20 Thông tư cũng quy định chuyển và thông báo. Một tờ phiếu không nêu nội dung nào đi đâu, đi kèm toàn bộ hồ sơ được gửi trả, cho người nhận biết một điều duy nhất: đơn chưa được xử lý. Nếu Thanh tra tỉnh có căn cứ khác cho việc trả lại hồ sơ, xin được biết căn cứ ấy (mục 9, G.1).</w:t>
+      </w:r>
+    </w:p>
+    <w:p>
+      <w:pPr>
+        <w:pStyle w:val="BodyText"/>
+        <w:keepNext/>
+      </w:pPr>
+      <w:r>
+        <w:rPr>
+          <w:b/>
+          <w:bCs/>
+        </w:rPr>
+        <w:t xml:space="preserve">Phần đơn thuộc trách nhiệm của chính Thanh tra tỉnh.</w:t>
+      </w:r>
+      <w:r>
+        <w:t xml:space="preserve"> </w:t>
+      </w:r>
+      <w:r>
+        <w:t xml:space="preserve">Mục IV của đơn ngày 14/9/2026 mang tên</w:t>
+      </w:r>
+      <w:r>
+        <w:t xml:space="preserve"> </w:t>
+      </w:r>
+      <w:r>
+        <w:rPr>
+          <w:i/>
+          <w:iCs/>
+        </w:rPr>
+        <w:t xml:space="preserve">“</w:t>
+      </w:r>
+      <w:r>
+        <w:rPr>
+          <w:i/>
+          <w:iCs/>
+        </w:rPr>
+        <w:t xml:space="preserve">SÁU NỘI DUNG QUÝ CƠ QUAN KIỂM ĐƯỢC BẰNG HỒ SƠ LƯU CỦA CHÍNH MÌNH</w:t>
+      </w:r>
+      <w:r>
+        <w:rPr>
+          <w:i/>
+          <w:iCs/>
+        </w:rPr>
+        <w:t xml:space="preserve">”</w:t>
+      </w:r>
+      <w:r>
+        <w:t xml:space="preserve">. Đặt từng phần của đơn cạnh hướng xử lý tương ứng:</w:t>
+      </w:r>
+    </w:p>
+    <w:tbl>
+      <w:tblPr>
+        <w:tblStyle w:val="Table"/>
+        <w:tblW w:w="9071" w:type="dxa"/>
+        <w:jc w:val="center"/>
+        <w:tblInd w:w="0" w:type="dxa"/>
+        <w:tblBorders>
+          <w:top w:val="single" w:sz="4" w:space="0" w:color="000000"/>
+          <w:left w:val="single" w:sz="4" w:space="0" w:color="000000"/>
+          <w:bottom w:val="single" w:sz="4" w:space="0" w:color="000000"/>
+          <w:right w:val="single" w:sz="4" w:space="0" w:color="000000"/>
+          <w:insideH w:val="single" w:sz="4" w:space="0" w:color="000000"/>
+          <w:insideV w:val="single" w:sz="4" w:space="0" w:color="000000"/>
+        </w:tblBorders>
+        <w:tblLayout w:type="fixed"/>
+        <w:tblCellMar>
+          <w:top w:w="40" w:type="dxa"/>
+          <w:left w:w="85" w:type="dxa"/>
+          <w:bottom w:w="40" w:type="dxa"/>
+          <w:right w:w="85" w:type="dxa"/>
+        </w:tblCellMar>
+        <w:tblLook w:firstRow="1" w:lastRow="0" w:firstColumn="0" w:lastColumn="0" w:noHBand="0" w:noVBand="0" w:val="0020"/>
+      </w:tblPr>
+      <w:tblGrid>
+        <w:gridCol w:w="3499"/>
+        <w:gridCol w:w="2332"/>
+        <w:gridCol w:w="2332"/>
+        <w:gridCol w:w="908"/>
+      </w:tblGrid>
+      <w:tr>
+        <w:trPr>
+          <w:cantSplit/>
+          <w:tblHeader w:val="true"/>
+        </w:trPr>
+        <w:tc>
+          <w:tcPr>
+            <w:tcW w:w="3499" w:type="dxa"/>
+            <w:shd w:val="clear" w:color="auto" w:fill="E7E6E6"/>
+            <w:vAlign w:val="center"/>
+          </w:tcPr>
+          <w:p>
+            <w:pPr>
+              <w:pStyle w:val="Compact"/>
+              <w:spacing w:before="20" w:after="20" w:line="252" w:lineRule="auto"/>
+              <w:jc w:val="left"/>
+            </w:pPr>
+            <w:r>
+              <w:rPr>
+                <w:b/>
+                <w:sz w:val="22"/>
+              </w:rPr>
+              <w:t xml:space="preserve">Nội dung trong đơn ngày 14/9/2026</w:t>
+            </w:r>
+          </w:p>
+        </w:tc>
+        <w:tc>
+          <w:tcPr>
+            <w:tcW w:w="2332" w:type="dxa"/>
+            <w:shd w:val="clear" w:color="auto" w:fill="E7E6E6"/>
+            <w:vAlign w:val="center"/>
+          </w:tcPr>
+          <w:p>
+            <w:pPr>
+              <w:pStyle w:val="Compact"/>
+              <w:spacing w:before="20" w:after="20" w:line="252" w:lineRule="auto"/>
+              <w:jc w:val="left"/>
+            </w:pPr>
+            <w:r>
+              <w:rPr>
+                <w:b/>
+                <w:sz w:val="22"/>
+              </w:rPr>
+              <w:t xml:space="preserve">Câu trả lời nằm ở đâu</w:t>
+            </w:r>
+          </w:p>
+        </w:tc>
+        <w:tc>
+          <w:tcPr>
+            <w:tcW w:w="2332" w:type="dxa"/>
+            <w:shd w:val="clear" w:color="auto" w:fill="E7E6E6"/>
+            <w:vAlign w:val="center"/>
+          </w:tcPr>
+          <w:p>
+            <w:pPr>
+              <w:pStyle w:val="Compact"/>
+              <w:spacing w:before="20" w:after="20" w:line="252" w:lineRule="auto"/>
+              <w:jc w:val="left"/>
+            </w:pPr>
+            <w:r>
+              <w:rPr>
+                <w:b/>
+                <w:sz w:val="22"/>
+              </w:rPr>
+              <w:t xml:space="preserve">Hướng xử lý theo quy định</w:t>
+            </w:r>
+          </w:p>
+        </w:tc>
+        <w:tc>
+          <w:tcPr>
+            <w:tcW w:w="908" w:type="dxa"/>
+            <w:shd w:val="clear" w:color="auto" w:fill="E7E6E6"/>
+            <w:vAlign w:val="center"/>
+          </w:tcPr>
+          <w:p>
+            <w:pPr>
+              <w:pStyle w:val="Compact"/>
+              <w:spacing w:before="20" w:after="20" w:line="252" w:lineRule="auto"/>
+              <w:jc w:val="left"/>
+            </w:pPr>
+            <w:r>
+              <w:rPr>
+                <w:b/>
+                <w:sz w:val="22"/>
+              </w:rPr>
+              <w:t xml:space="preserve">Phiếu 2960</w:t>
+            </w:r>
+          </w:p>
+        </w:tc>
+      </w:tr>
+      <w:tr>
+        <w:trPr>
+          <w:cantSplit/>
+        </w:trPr>
+        <w:tc>
+          <w:tcPr>
+            <w:tcW w:w="3499" w:type="dxa"/>
+            <w:vAlign w:val="top"/>
+          </w:tcPr>
+          <w:p>
+            <w:pPr>
+              <w:pStyle w:val="Compact"/>
+              <w:spacing w:before="20" w:after="20" w:line="252" w:lineRule="auto"/>
+              <w:jc w:val="left"/>
+            </w:pPr>
+            <w:r>
+              <w:rPr>
+                <w:sz w:val="22"/>
+              </w:rPr>
+              <w:t xml:space="preserve">Mục IV, sáu nội dung: văn bản nào được chuyển kèm Công văn 1436; ngày 18/5/2026 là ngày gì; Phiếu chuyển 2329 và Thông báo 5553 nói về cùng một khoảng thời gian; trạng thái yêu cầu tại Phiếu chuyển 2329 và Văn bản 2644; Hồ sơ tố cáo nhận ngày 09/7/2026 và trách nhiệm thụ lý; phạm vi Công văn số 416/VP và nội dung Công văn 1436 chuyển kèm</w:t>
+            </w:r>
+          </w:p>
+        </w:tc>
+        <w:tc>
+          <w:tcPr>
+            <w:tcW w:w="2332" w:type="dxa"/>
+            <w:vAlign w:val="top"/>
+          </w:tcPr>
+          <w:p>
+            <w:pPr>
+              <w:pStyle w:val="Compact"/>
+              <w:spacing w:before="20" w:after="20" w:line="252" w:lineRule="auto"/>
+              <w:jc w:val="left"/>
+            </w:pPr>
+            <w:r>
+              <w:rPr>
+                <w:sz w:val="22"/>
+              </w:rPr>
+              <w:t xml:space="preserve">Hồ sơ lưu, sổ văn bản của chính Thanh tra tỉnh</w:t>
+            </w:r>
+          </w:p>
+        </w:tc>
+        <w:tc>
+          <w:tcPr>
+            <w:tcW w:w="2332" w:type="dxa"/>
+            <w:vAlign w:val="top"/>
+          </w:tcPr>
+          <w:p>
+            <w:pPr>
+              <w:pStyle w:val="Compact"/>
+              <w:spacing w:before="20" w:after="20" w:line="252" w:lineRule="auto"/>
+              <w:jc w:val="left"/>
+            </w:pPr>
+            <w:r>
+              <w:rPr>
+                <w:sz w:val="22"/>
+              </w:rPr>
+              <w:t xml:space="preserve">Khoản 1 Điều 20 Thông tư số 05/2021/TT-TTCP: giải quyết, trả lời</w:t>
+            </w:r>
+          </w:p>
+        </w:tc>
+        <w:tc>
+          <w:tcPr>
+            <w:tcW w:w="908" w:type="dxa"/>
+            <w:vAlign w:val="top"/>
+          </w:tcPr>
+          <w:p>
+            <w:pPr>
+              <w:pStyle w:val="Compact"/>
+              <w:spacing w:before="20" w:after="20" w:line="252" w:lineRule="auto"/>
+              <w:jc w:val="left"/>
+            </w:pPr>
+            <w:r>
+              <w:rPr>
+                <w:sz w:val="22"/>
+              </w:rPr>
+              <w:t xml:space="preserve">Không nêu</w:t>
+            </w:r>
+          </w:p>
+        </w:tc>
+      </w:tr>
+      <w:tr>
+        <w:trPr>
+          <w:cantSplit/>
+        </w:trPr>
+        <w:tc>
+          <w:tcPr>
+            <w:tcW w:w="3499" w:type="dxa"/>
+            <w:vAlign w:val="top"/>
+          </w:tcPr>
+          <w:p>
+            <w:pPr>
+              <w:pStyle w:val="Compact"/>
+              <w:spacing w:before="20" w:after="20" w:line="252" w:lineRule="auto"/>
+              <w:jc w:val="left"/>
+            </w:pPr>
+            <w:r>
+              <w:rPr>
+                <w:sz w:val="22"/>
+              </w:rPr>
+              <w:t xml:space="preserve">Mục V, Mục VI: ý kiến và câu hỏi về Thông báo 5553</w:t>
+            </w:r>
+          </w:p>
+        </w:tc>
+        <w:tc>
+          <w:tcPr>
+            <w:tcW w:w="2332" w:type="dxa"/>
+            <w:vAlign w:val="top"/>
+          </w:tcPr>
+          <w:p>
+            <w:pPr>
+              <w:pStyle w:val="Compact"/>
+              <w:spacing w:before="20" w:after="20" w:line="252" w:lineRule="auto"/>
+              <w:jc w:val="left"/>
+            </w:pPr>
+            <w:r>
+              <w:rPr>
+                <w:sz w:val="22"/>
+              </w:rPr>
+              <w:t xml:space="preserve">Thông báo 5553 — văn bản gửi Thanh tra tỉnh để báo cáo — và hồ sơ xử lý của phường</w:t>
+            </w:r>
+          </w:p>
+        </w:tc>
+        <w:tc>
+          <w:tcPr>
+            <w:tcW w:w="2332" w:type="dxa"/>
+            <w:vAlign w:val="top"/>
+          </w:tcPr>
+          <w:p>
+            <w:pPr>
+              <w:pStyle w:val="Compact"/>
+              <w:spacing w:before="20" w:after="20" w:line="252" w:lineRule="auto"/>
+              <w:jc w:val="left"/>
+            </w:pPr>
+            <w:r>
+              <w:rPr>
+                <w:sz w:val="22"/>
+              </w:rPr>
+              <w:t xml:space="preserve">Trả lời theo khoản 1 Điều 20; hoặc chuyển và thông báo theo khoản 2 Điều 20</w:t>
+            </w:r>
+          </w:p>
+        </w:tc>
+        <w:tc>
+          <w:tcPr>
+            <w:tcW w:w="908" w:type="dxa"/>
+            <w:vAlign w:val="top"/>
+          </w:tcPr>
+          <w:p>
+            <w:pPr>
+              <w:pStyle w:val="Compact"/>
+              <w:spacing w:before="20" w:after="20" w:line="252" w:lineRule="auto"/>
+              <w:jc w:val="left"/>
+            </w:pPr>
+            <w:r>
+              <w:rPr>
+                <w:sz w:val="22"/>
+              </w:rPr>
+              <w:t xml:space="preserve">Không nêu</w:t>
+            </w:r>
+          </w:p>
+        </w:tc>
+      </w:tr>
+      <w:tr>
+        <w:trPr>
+          <w:cantSplit/>
+        </w:trPr>
+        <w:tc>
+          <w:tcPr>
+            <w:tcW w:w="3499" w:type="dxa"/>
+            <w:vAlign w:val="top"/>
+          </w:tcPr>
+          <w:p>
+            <w:pPr>
+              <w:pStyle w:val="Compact"/>
+              <w:spacing w:before="20" w:after="20" w:line="252" w:lineRule="auto"/>
+              <w:jc w:val="left"/>
+            </w:pPr>
+            <w:r>
+              <w:rPr>
+                <w:sz w:val="22"/>
+              </w:rPr>
+              <w:t xml:space="preserve">Mục VII.13: lập hồ sơ kiến nghị Chủ tịch Ủy ban nhân dân tỉnh xử lý vi phạm</w:t>
+            </w:r>
+          </w:p>
+        </w:tc>
+        <w:tc>
+          <w:tcPr>
+            <w:tcW w:w="2332" w:type="dxa"/>
+            <w:vAlign w:val="top"/>
+          </w:tcPr>
+          <w:p>
+            <w:pPr>
+              <w:pStyle w:val="Compact"/>
+              <w:spacing w:before="20" w:after="20" w:line="252" w:lineRule="auto"/>
+              <w:jc w:val="left"/>
+            </w:pPr>
+            <w:r>
+              <w:rPr>
+                <w:sz w:val="22"/>
+              </w:rPr>
+              <w:t xml:space="preserve">Việc kiến nghị thuộc chức năng của cơ quan thanh tra</w:t>
+            </w:r>
+          </w:p>
+        </w:tc>
+        <w:tc>
+          <w:tcPr>
+            <w:tcW w:w="2332" w:type="dxa"/>
+            <w:vAlign w:val="top"/>
+          </w:tcPr>
+          <w:p>
+            <w:pPr>
+              <w:pStyle w:val="Compact"/>
+              <w:spacing w:before="20" w:after="20" w:line="252" w:lineRule="auto"/>
+              <w:jc w:val="left"/>
+            </w:pPr>
+            <w:r>
+              <w:rPr>
+                <w:sz w:val="22"/>
+              </w:rPr>
+              <w:t xml:space="preserve">Khoản 1 Điều 20</w:t>
+            </w:r>
+          </w:p>
+        </w:tc>
+        <w:tc>
+          <w:tcPr>
+            <w:tcW w:w="908" w:type="dxa"/>
+            <w:vAlign w:val="top"/>
+          </w:tcPr>
+          <w:p>
+            <w:pPr>
+              <w:pStyle w:val="Compact"/>
+              <w:spacing w:before="20" w:after="20" w:line="252" w:lineRule="auto"/>
+              <w:jc w:val="left"/>
+            </w:pPr>
+            <w:r>
+              <w:rPr>
+                <w:sz w:val="22"/>
+              </w:rPr>
+              <w:t xml:space="preserve">Không nêu</w:t>
+            </w:r>
+          </w:p>
+        </w:tc>
+      </w:tr>
+      <w:tr>
+        <w:trPr>
+          <w:cantSplit/>
+        </w:trPr>
+        <w:tc>
+          <w:tcPr>
+            <w:tcW w:w="3499" w:type="dxa"/>
+            <w:vAlign w:val="top"/>
+          </w:tcPr>
+          <w:p>
+            <w:pPr>
+              <w:pStyle w:val="Compact"/>
+              <w:spacing w:before="20" w:after="20" w:line="252" w:lineRule="auto"/>
+              <w:jc w:val="left"/>
+            </w:pPr>
+            <w:r>
+              <w:rPr>
+                <w:sz w:val="22"/>
+              </w:rPr>
+              <w:t xml:space="preserve">Mục VII.12, VII.14: bảo vệ người tố cáo; lập hồ sơ chuyển Cơ quan điều tra hoặc Viện kiểm sát</w:t>
+            </w:r>
+          </w:p>
+        </w:tc>
+        <w:tc>
+          <w:tcPr>
+            <w:tcW w:w="2332" w:type="dxa"/>
+            <w:vAlign w:val="top"/>
+          </w:tcPr>
+          <w:p>
+            <w:pPr>
+              <w:pStyle w:val="Compact"/>
+              <w:spacing w:before="20" w:after="20" w:line="252" w:lineRule="auto"/>
+              <w:jc w:val="left"/>
+            </w:pPr>
+            <w:r>
+              <w:rPr>
+                <w:sz w:val="22"/>
+              </w:rPr>
+              <w:t xml:space="preserve">Phần gần với tố cáo nhất. Nội dung tố cáo đã được gửi riêng tới Chủ tịch Ủy ban nhân dân tỉnh bằng đơn cùng ngày, nhận ngày 17/9/2026</w:t>
+            </w:r>
+          </w:p>
+        </w:tc>
+        <w:tc>
+          <w:tcPr>
+            <w:tcW w:w="2332" w:type="dxa"/>
+            <w:vAlign w:val="top"/>
+          </w:tcPr>
+          <w:p>
+            <w:pPr>
+              <w:pStyle w:val="Compact"/>
+              <w:spacing w:before="20" w:after="20" w:line="252" w:lineRule="auto"/>
+              <w:jc w:val="left"/>
+            </w:pPr>
+            <w:r>
+              <w:rPr>
+                <w:sz w:val="22"/>
+              </w:rPr>
+              <w:t xml:space="preserve">Nếu coi là tố cáo không thuộc thẩm quyền: chuyển và thông báo (khoản 2 Điều 24 Luật Tố cáo); hoặc hướng dẫn nêu rõ nơi gửi (Điều 21, Mẫu số 05)</w:t>
+            </w:r>
+          </w:p>
+        </w:tc>
+        <w:tc>
+          <w:tcPr>
+            <w:tcW w:w="908" w:type="dxa"/>
+            <w:vAlign w:val="top"/>
+          </w:tcPr>
+          <w:p>
+            <w:pPr>
+              <w:pStyle w:val="Compact"/>
+              <w:spacing w:before="20" w:after="20" w:line="252" w:lineRule="auto"/>
+              <w:jc w:val="left"/>
+            </w:pPr>
+            <w:r>
+              <w:rPr>
+                <w:sz w:val="22"/>
+              </w:rPr>
+              <w:t xml:space="preserve">Không nêu</w:t>
+            </w:r>
+          </w:p>
+        </w:tc>
+      </w:tr>
+    </w:tbl>
+    <w:p>
+      <w:pPr>
+        <w:pStyle w:val="BodyText"/>
+        <w:spacing w:before="160"/>
+      </w:pPr>
+      <w:r>
+        <w:t xml:space="preserve">Sáu nội dung ở dòng đầu không có cơ quan có thẩm quyền nào khác để gửi đến, vì câu trả lời chỉ nằm ở Thanh tra tỉnh. Bốn trong sáu nội dung ấy — IV.1, IV.2, IV.4, IV.5 — tôi đặt lại tại đơn ngày 06/10/2026; Công văn 3292 trả lời một phần nội dung IV.1, không trả lời ba nội dung còn lại (mục 3).</w:t>
+      </w:r>
+    </w:p>
+    <w:p>
+      <w:pPr>
+        <w:pStyle w:val="BodyText"/>
+        <w:keepNext/>
+      </w:pPr>
+      <w:r>
+        <w:rPr>
+          <w:b/>
+          <w:bCs/>
+        </w:rPr>
+        <w:t xml:space="preserve">Đặt cạnh Công văn 1436.</w:t>
+      </w:r>
+    </w:p>
+    <w:tbl>
+      <w:tblPr>
+        <w:tblStyle w:val="Table"/>
+        <w:tblW w:w="9071" w:type="dxa"/>
+        <w:jc w:val="center"/>
+        <w:tblInd w:w="0" w:type="dxa"/>
+        <w:tblBorders>
+          <w:top w:val="single" w:sz="4" w:space="0" w:color="000000"/>
+          <w:left w:val="single" w:sz="4" w:space="0" w:color="000000"/>
+          <w:bottom w:val="single" w:sz="4" w:space="0" w:color="000000"/>
+          <w:right w:val="single" w:sz="4" w:space="0" w:color="000000"/>
+          <w:insideH w:val="single" w:sz="4" w:space="0" w:color="000000"/>
+          <w:insideV w:val="single" w:sz="4" w:space="0" w:color="000000"/>
+        </w:tblBorders>
+        <w:tblLayout w:type="fixed"/>
+        <w:tblCellMar>
+          <w:top w:w="40" w:type="dxa"/>
+          <w:left w:w="85" w:type="dxa"/>
+          <w:bottom w:w="40" w:type="dxa"/>
+          <w:right w:w="85" w:type="dxa"/>
+        </w:tblCellMar>
+        <w:tblLook w:firstRow="1" w:lastRow="0" w:firstColumn="0" w:lastColumn="0" w:noHBand="0" w:noVBand="0" w:val="0020"/>
+      </w:tblPr>
+      <w:tblGrid>
+        <w:gridCol w:w="1882"/>
+        <w:gridCol w:w="3594"/>
+        <w:gridCol w:w="3595"/>
+      </w:tblGrid>
+      <w:tr>
+        <w:trPr>
+          <w:cantSplit/>
+          <w:tblHeader w:val="true"/>
+        </w:trPr>
+        <w:tc>
+          <w:tcPr>
+            <w:tcW w:w="1882" w:type="dxa"/>
+            <w:shd w:val="clear" w:color="auto" w:fill="E7E6E6"/>
+            <w:vAlign w:val="center"/>
+          </w:tcPr>
+          <w:p>
+            <w:pPr>
+              <w:pStyle w:val="Compact"/>
+              <w:spacing w:before="20" w:after="20" w:line="252" w:lineRule="auto"/>
+              <w:jc w:val="left"/>
+            </w:pPr>
+          </w:p>
+        </w:tc>
+        <w:tc>
+          <w:tcPr>
+            <w:tcW w:w="3594" w:type="dxa"/>
+            <w:shd w:val="clear" w:color="auto" w:fill="E7E6E6"/>
+            <w:vAlign w:val="center"/>
+          </w:tcPr>
+          <w:p>
+            <w:pPr>
+              <w:pStyle w:val="Compact"/>
+              <w:spacing w:before="20" w:after="20" w:line="252" w:lineRule="auto"/>
+              <w:jc w:val="left"/>
+            </w:pPr>
+            <w:r>
+              <w:rPr>
+                <w:b/>
+                <w:sz w:val="22"/>
+              </w:rPr>
+              <w:t xml:space="preserve">Đơn B, tháng 5/2026</w:t>
+            </w:r>
+          </w:p>
+        </w:tc>
+        <w:tc>
+          <w:tcPr>
+            <w:tcW w:w="3595" w:type="dxa"/>
+            <w:shd w:val="clear" w:color="auto" w:fill="E7E6E6"/>
+            <w:vAlign w:val="center"/>
+          </w:tcPr>
+          <w:p>
+            <w:pPr>
+              <w:pStyle w:val="Compact"/>
+              <w:spacing w:before="20" w:after="20" w:line="252" w:lineRule="auto"/>
+              <w:jc w:val="left"/>
+            </w:pPr>
+            <w:r>
+              <w:rPr>
+                <w:b/>
+                <w:sz w:val="22"/>
+              </w:rPr>
+              <w:t xml:space="preserve">Đơn ngày 14/9/2026</w:t>
+            </w:r>
+          </w:p>
+        </w:tc>
+      </w:tr>
+      <w:tr>
+        <w:trPr>
+          <w:cantSplit/>
+        </w:trPr>
+        <w:tc>
+          <w:tcPr>
+            <w:tcW w:w="1882" w:type="dxa"/>
+            <w:vAlign w:val="top"/>
+          </w:tcPr>
+          <w:p>
+            <w:pPr>
+              <w:pStyle w:val="Compact"/>
+              <w:spacing w:before="20" w:after="20" w:line="252" w:lineRule="auto"/>
+              <w:jc w:val="left"/>
+            </w:pPr>
+            <w:r>
+              <w:rPr>
+                <w:sz w:val="22"/>
+              </w:rPr>
+              <w:t xml:space="preserve">Phần đơn đặt cho chính Thanh tra tỉnh</w:t>
+            </w:r>
+          </w:p>
+        </w:tc>
+        <w:tc>
+          <w:tcPr>
+            <w:tcW w:w="3594" w:type="dxa"/>
+            <w:vAlign w:val="top"/>
+          </w:tcPr>
+          <w:p>
+            <w:pPr>
+              <w:pStyle w:val="Compact"/>
+              <w:spacing w:before="20" w:after="20" w:line="252" w:lineRule="auto"/>
+              <w:jc w:val="left"/>
+            </w:pPr>
+            <w:r>
+              <w:rPr>
+                <w:sz w:val="22"/>
+              </w:rPr>
+              <w:t xml:space="preserve">Sáu đề nghị tại Mục V</w:t>
+            </w:r>
+            <w:r>
+              <w:rPr>
+                <w:sz w:val="22"/>
+              </w:rPr>
+              <w:t xml:space="preserve"> </w:t>
+            </w:r>
+            <w:r>
+              <w:rPr>
+                <w:sz w:val="22"/>
+              </w:rPr>
+              <w:t xml:space="preserve">“</w:t>
+            </w:r>
+            <w:r>
+              <w:rPr>
+                <w:sz w:val="22"/>
+              </w:rPr>
+              <w:t xml:space="preserve">Kiến nghị thanh tra</w:t>
+            </w:r>
+            <w:r>
+              <w:rPr>
+                <w:sz w:val="22"/>
+              </w:rPr>
+              <w:t xml:space="preserve">”</w:t>
+            </w:r>
+          </w:p>
+        </w:tc>
+        <w:tc>
+          <w:tcPr>
+            <w:tcW w:w="3595" w:type="dxa"/>
+            <w:vAlign w:val="top"/>
+          </w:tcPr>
+          <w:p>
+            <w:pPr>
+              <w:pStyle w:val="Compact"/>
+              <w:spacing w:before="20" w:after="20" w:line="252" w:lineRule="auto"/>
+              <w:jc w:val="left"/>
+            </w:pPr>
+            <w:r>
+              <w:rPr>
+                <w:sz w:val="22"/>
+              </w:rPr>
+              <w:t xml:space="preserve">Sáu nội dung tại Mục IV, kiểm được bằng hồ sơ lưu; đề nghị lập hồ sơ kiến nghị tại Mục VII.13</w:t>
+            </w:r>
+          </w:p>
+        </w:tc>
+      </w:tr>
+      <w:tr>
+        <w:trPr>
+          <w:cantSplit/>
+        </w:trPr>
+        <w:tc>
+          <w:tcPr>
+            <w:tcW w:w="1882" w:type="dxa"/>
+            <w:vAlign w:val="top"/>
+          </w:tcPr>
+          <w:p>
+            <w:pPr>
+              <w:pStyle w:val="Compact"/>
+              <w:spacing w:before="20" w:after="20" w:line="252" w:lineRule="auto"/>
+              <w:jc w:val="left"/>
+            </w:pPr>
+            <w:r>
+              <w:rPr>
+                <w:sz w:val="22"/>
+              </w:rPr>
+              <w:t xml:space="preserve">Cách xử lý cả đơn</w:t>
+            </w:r>
+          </w:p>
+        </w:tc>
+        <w:tc>
+          <w:tcPr>
+            <w:tcW w:w="3594" w:type="dxa"/>
+            <w:vAlign w:val="top"/>
+          </w:tcPr>
+          <w:p>
+            <w:pPr>
+              <w:pStyle w:val="Compact"/>
+              <w:spacing w:before="20" w:after="20" w:line="252" w:lineRule="auto"/>
+              <w:jc w:val="left"/>
+            </w:pPr>
+            <w:r>
+              <w:rPr>
+                <w:sz w:val="22"/>
+              </w:rPr>
+              <w:t xml:space="preserve">Chuyển cả đơn xuống phường (Công văn 1436)</w:t>
+            </w:r>
+          </w:p>
+        </w:tc>
+        <w:tc>
+          <w:tcPr>
+            <w:tcW w:w="3595" w:type="dxa"/>
+            <w:vAlign w:val="top"/>
+          </w:tcPr>
+          <w:p>
+            <w:pPr>
+              <w:pStyle w:val="Compact"/>
+              <w:spacing w:before="20" w:after="20" w:line="252" w:lineRule="auto"/>
+              <w:jc w:val="left"/>
+            </w:pPr>
+            <w:r>
+              <w:rPr>
+                <w:sz w:val="22"/>
+              </w:rPr>
+              <w:t xml:space="preserve">Trả cả bộ hồ sơ về người gửi (Phiếu 2960)</w:t>
+            </w:r>
+          </w:p>
+        </w:tc>
+      </w:tr>
+      <w:tr>
+        <w:trPr>
+          <w:cantSplit/>
+        </w:trPr>
+        <w:tc>
+          <w:tcPr>
+            <w:tcW w:w="1882" w:type="dxa"/>
+            <w:vAlign w:val="top"/>
+          </w:tcPr>
+          <w:p>
+            <w:pPr>
+              <w:pStyle w:val="Compact"/>
+              <w:spacing w:before="20" w:after="20" w:line="252" w:lineRule="auto"/>
+              <w:jc w:val="left"/>
+            </w:pPr>
+            <w:r>
+              <w:rPr>
+                <w:sz w:val="22"/>
+              </w:rPr>
+              <w:t xml:space="preserve">Phần đặt cho chính Thanh tra tỉnh được trả lời tại văn bản nào</w:t>
+            </w:r>
+          </w:p>
+        </w:tc>
+        <w:tc>
+          <w:tcPr>
+            <w:tcW w:w="3594" w:type="dxa"/>
+            <w:vAlign w:val="top"/>
+          </w:tcPr>
+          <w:p>
+            <w:pPr>
+              <w:pStyle w:val="Compact"/>
+              <w:spacing w:before="20" w:after="20" w:line="252" w:lineRule="auto"/>
+              <w:jc w:val="left"/>
+            </w:pPr>
+            <w:r>
+              <w:rPr>
+                <w:sz w:val="22"/>
+              </w:rPr>
+              <w:t xml:space="preserve">Không có</w:t>
+            </w:r>
+          </w:p>
+        </w:tc>
+        <w:tc>
+          <w:tcPr>
+            <w:tcW w:w="3595" w:type="dxa"/>
+            <w:vAlign w:val="top"/>
+          </w:tcPr>
+          <w:p>
+            <w:pPr>
+              <w:pStyle w:val="Compact"/>
+              <w:spacing w:before="20" w:after="20" w:line="252" w:lineRule="auto"/>
+              <w:jc w:val="left"/>
+            </w:pPr>
+            <w:r>
+              <w:rPr>
+                <w:sz w:val="22"/>
+              </w:rPr>
+              <w:t xml:space="preserve">Không có</w:t>
+            </w:r>
+          </w:p>
+        </w:tc>
+      </w:tr>
+    </w:tbl>
+    <w:p>
+      <w:pPr>
+        <w:pStyle w:val="BodyText"/>
+        <w:spacing w:before="160"/>
+      </w:pPr>
+      <w:r>
+        <w:t xml:space="preserve">Hai cách xử lý ngược chiều nhau — một lần chuyển xuống, một lần trả về — cho cùng một kết quả: phần đơn đề nghị chính Thanh tra tỉnh làm việc thuộc trách nhiệm của mình không có văn bản trả lời. Đó cũng là phần mà đơn ngày 06/10/2026 gửi lại, và Công văn 3292 chỉ trả lời một phần (mục 3).</w:t>
+      </w:r>
+    </w:p>
+    <w:p>
+      <w:pPr>
+        <w:pStyle w:val="BodyText"/>
+      </w:pPr>
+      <w:r>
+        <w:rPr>
+          <w:b/>
+          <w:bCs/>
+        </w:rPr>
+        <w:t xml:space="preserve">Về phía tôi.</w:t>
+      </w:r>
+      <w:r>
+        <w:t xml:space="preserve"> </w:t>
+      </w:r>
+      <w:r>
+        <w:t xml:space="preserve">Khi nhận Phiếu 2960, tôi đã không hỏi lại. Ngày 06/10/2026 tôi tự tách đơn theo cách hiểu của mình: phần khiếu nại các kết luận của Thông báo 5553 gửi Chủ tịch Ủy ban nhân dân phường; ba nội dung liên quan đến văn bản của chính Thanh tra tỉnh gửi lại Chánh Thanh tra tỉnh (mục 4.10). Việc tôi làm theo phiếu không thay đổi điều đọc được trên tờ phiếu: nó không chỉ ra nội dung nào, nơi nào.</w:t>
+      </w:r>
+    </w:p>
+    <w:p>
+      <w:pPr>
+        <w:pStyle w:val="BodyText"/>
+      </w:pPr>
+      <w:r>
+        <w:t xml:space="preserve">Kính đề nghị Thanh tra tỉnh: (i) cho biết căn cứ của việc trả lại bộ hồ sơ kèm Phiếu 2960; (ii) nếu căn cứ là Điều 21 Thông tư số 05/2021/TT-TTCP, ban hành phiếu hướng dẫn theo Mẫu số 05, ghi từng nội dung cần tách và cơ quan, người có thẩm quyền tương ứng; (iii) đối với sáu nội dung tại Mục IV đơn ngày 14/9/2026, trả lời theo khoản 1 Điều 20 thông tư ấy, hoặc, nếu cho rằng nội dung nào không thuộc trách nhiệm của mình, nêu cơ quan có trách nhiệm (mục 9, G.1, G.2).</w:t>
+      </w:r>
+    </w:p>
+    <w:bookmarkEnd w:id="47"/>
+    <w:bookmarkEnd w:id="48"/>
+    <w:bookmarkStart w:id="57" w:name="X81787a2f44ab3a2d81abce2b0fbd0900d582b2e"/>
     <w:p>
       <w:pPr>
         <w:pStyle w:val="Heading2"/>
@@ -14475,7 +16870,7 @@
         <w:t xml:space="preserve">, với ngày ấy, các mục ấy, người ấy và vụ việc ấy.</w:t>
       </w:r>
     </w:p>
-    <w:bookmarkStart w:id="47" w:name="Xffd5e46ee690df6fec0d8807fc8d17f262c9eba"/>
+    <w:bookmarkStart w:id="49" w:name="Xffd5e46ee690df6fec0d8807fc8d17f262c9eba"/>
     <w:p>
       <w:pPr>
         <w:pStyle w:val="Heading3"/>
@@ -15136,8 +17531,8 @@
         <w:t xml:space="preserve">.</w:t>
       </w:r>
     </w:p>
-    <w:bookmarkEnd w:id="47"/>
-    <w:bookmarkStart w:id="48" w:name="Xa962892bd9c1961ec2d399f2de5ff7601d40ed4"/>
+    <w:bookmarkEnd w:id="49"/>
+    <w:bookmarkStart w:id="50" w:name="Xa962892bd9c1961ec2d399f2de5ff7601d40ed4"/>
     <w:p>
       <w:pPr>
         <w:pStyle w:val="Heading3"/>
@@ -16832,8 +19227,8 @@
         <w:t xml:space="preserve">tôi chỉ ghi nhận, không tính là chỗ mô tả sai. Hai chỗ không khớp đều là dữ kiện mà việc phân loại không chạm tới được: một ngày tháng, và một đối tượng là tập thể hay cá nhân. Phụ lục II, mục L.10, đã lập phép đối chiếu này từ ngày 14/9/2026. Và ngay cả ở chỗ khớp — vụ việc — Thông báo 5553 chỉ mô tả một phần nhỏ của những gì đơn trình bày (mục 5.6).</w:t>
       </w:r>
     </w:p>
-    <w:bookmarkEnd w:id="48"/>
-    <w:bookmarkStart w:id="49" w:name="X183b11babd57dd67aaf351daad4cb3a7e88e36a"/>
+    <w:bookmarkEnd w:id="50"/>
+    <w:bookmarkStart w:id="51" w:name="X183b11babd57dd67aaf351daad4cb3a7e88e36a"/>
     <w:p>
       <w:pPr>
         <w:pStyle w:val="Heading3"/>
@@ -16993,8 +19388,8 @@
         <w:t xml:space="preserve">văn bản chuyển đơn — Công văn 1436 ngày 22/5/2026 của Thanh tra tỉnh, và Phiếu chuyển đơn kiến nghị, phản ánh số 2707/SGDĐT-VP ngày 08/6/2026 của Sở Giáo dục và Đào tạo. Phiếu chuyển 2707 mới là văn bản chuyển nội dung chuyên môn, và phường đã trả lời nó bằng Công văn số 6689/UBND-VHXH ngày 21/9/2026. Nếu phạm vi của Công văn số 416/VP đến từ Phiếu chuyển 2707, thì câu hỏi trở thành: hoạt động thu thập tài liệu duy nhất được nêu trong Thông báo 5553 — văn bản trả lời cho tuyến Công văn 1436 — lại được giới hạn theo phạm vi của tuyến kia.</w:t>
       </w:r>
     </w:p>
-    <w:bookmarkEnd w:id="49"/>
-    <w:bookmarkStart w:id="50" w:name="Xa1767d00dc6040b5ad7440b81bd8fa250b5128c"/>
+    <w:bookmarkEnd w:id="51"/>
+    <w:bookmarkStart w:id="52" w:name="Xa1767d00dc6040b5ad7440b81bd8fa250b5128c"/>
     <w:p>
       <w:pPr>
         <w:pStyle w:val="Heading3"/>
@@ -18311,8 +20706,8 @@
         <w:t xml:space="preserve">và không đụng tới một dòng nào trong ba lần ấy: không xác nhận, không bác bỏ, không nêu lý do không xem xét. Vấn đề vì vậy không còn là Thanh tra tỉnh thiếu thông tin; vấn đề là đã nhận những phân tích cụ thể ấy, Thanh tra tỉnh xem xét chúng thế nào.</w:t>
       </w:r>
     </w:p>
-    <w:bookmarkEnd w:id="50"/>
-    <w:bookmarkStart w:id="51" w:name="Xd63a61cf861ea6d209613eada2f3815571fd6f7"/>
+    <w:bookmarkEnd w:id="52"/>
+    <w:bookmarkStart w:id="53" w:name="Xd63a61cf861ea6d209613eada2f3815571fd6f7"/>
     <w:p>
       <w:pPr>
         <w:pStyle w:val="Heading3"/>
@@ -18503,8 +20898,8 @@
         <w:t xml:space="preserve">. Cùng nội dung này, cho biết Công văn 1436 chuyển kèm những nội dung nào, và trong khoảng từ ngày 14/5/2026 đến ngày 22/5/2026, Thanh tra tỉnh có nhận được văn bản chuyển đơn nào của Sở Giáo dục và Đào tạo hay không.</w:t>
       </w:r>
     </w:p>
-    <w:bookmarkEnd w:id="51"/>
-    <w:bookmarkStart w:id="52" w:name="Xebfd2be5282b50cb6c087e09a55a499ef65b093"/>
+    <w:bookmarkEnd w:id="53"/>
+    <w:bookmarkStart w:id="54" w:name="Xebfd2be5282b50cb6c087e09a55a499ef65b093"/>
     <w:p>
       <w:pPr>
         <w:pStyle w:val="Heading3"/>
@@ -20090,8 +22485,8 @@
         <w:t xml:space="preserve">Đây là điều Thanh tra tỉnh kiểm được ngay, vì bản gốc Đơn B đang nằm trong hồ sơ của Thanh tra tỉnh, cạnh bản Thông báo 5553 gửi lên để báo cáo.</w:t>
       </w:r>
     </w:p>
-    <w:bookmarkEnd w:id="52"/>
-    <w:bookmarkStart w:id="53" w:name="X9560a92f0da94eff46e4684034e3a7e21a9b9f2"/>
+    <w:bookmarkEnd w:id="54"/>
+    <w:bookmarkStart w:id="55" w:name="X9560a92f0da94eff46e4684034e3a7e21a9b9f2"/>
     <w:p>
       <w:pPr>
         <w:pStyle w:val="Heading3"/>
@@ -20832,8 +23227,103 @@
         <w:t xml:space="preserve">Thông báo không thụ lý tố cáo tự nó không sai về hình thức; Luật Tố cáo cho phép không thụ lý và thông báo lý do. Điều được nêu ở đây là phạm vi, căn cứ, và ba kết luận về nội dung đặt trong một văn bản không thụ lý. Đây là ba điểm tại nội dung đề nghị thứ ba của đơn 06/10/2026 (mục 3.2); Công văn 3292 không nhắc. Những câu hỏi này — văn bản giải quyết khiếu nại phải mang hình thức gì; điều kiện thụ lý được xét ở bước nào; một thông báo không thụ lý có được chứa kết luận về nội dung không — là nghiệp vụ thường xuyên của cơ quan thanh tra. Trả lời chúng không cần giám định chuyên môn, chỉ cần đặt văn bản cạnh điều luật.</w:t>
       </w:r>
     </w:p>
-    <w:bookmarkEnd w:id="53"/>
-    <w:bookmarkStart w:id="54" w:name="X723c7cf92997a9d9171bd4bda854d54b22322b1"/>
+    <w:p>
+      <w:pPr>
+        <w:pStyle w:val="BodyText"/>
+      </w:pPr>
+      <w:r>
+        <w:t xml:space="preserve">Một trong những câu hỏi ấy đã được đặt cho chính Thanh tra tỉnh từ tháng 5/2026. Đề nghị V.2(a) của Đơn B xin thanh tra</w:t>
+      </w:r>
+      <w:r>
+        <w:t xml:space="preserve"> </w:t>
+      </w:r>
+      <w:r>
+        <w:rPr>
+          <w:i/>
+          <w:iCs/>
+        </w:rPr>
+        <w:t xml:space="preserve">“</w:t>
+      </w:r>
+      <w:r>
+        <w:rPr>
+          <w:i/>
+          <w:iCs/>
+        </w:rPr>
+        <w:t xml:space="preserve">tính hợp pháp của việc hạ cấp đơn khiếu nại</w:t>
+      </w:r>
+      <w:r>
+        <w:rPr>
+          <w:i/>
+          <w:iCs/>
+        </w:rPr>
+        <w:t xml:space="preserve">”</w:t>
+      </w:r>
+      <w:r>
+        <w:t xml:space="preserve"> </w:t>
+      </w:r>
+      <w:r>
+        <w:t xml:space="preserve">trong Công văn 87 — một câu hỏi trả lời được bằng cách đặt Công văn 87 cạnh Điều 31 và khoản 3 Điều 6 Luật Khiếu nại. Câu hỏi ấy đi về phường cùng cả đơn theo Công văn 1436. Câu trả lời của phường — mục 1 và mục 2 Thông báo 5553: việc phân loại</w:t>
+      </w:r>
+      <w:r>
+        <w:t xml:space="preserve"> </w:t>
+      </w:r>
+      <w:r>
+        <w:rPr>
+          <w:i/>
+          <w:iCs/>
+        </w:rPr>
+        <w:t xml:space="preserve">“</w:t>
+      </w:r>
+      <w:r>
+        <w:rPr>
+          <w:i/>
+          <w:iCs/>
+        </w:rPr>
+        <w:t xml:space="preserve">là đúng quy định</w:t>
+      </w:r>
+      <w:r>
+        <w:rPr>
+          <w:i/>
+          <w:iCs/>
+        </w:rPr>
+        <w:t xml:space="preserve">”</w:t>
+      </w:r>
+      <w:r>
+        <w:t xml:space="preserve">, việc trả lời bằng công văn</w:t>
+      </w:r>
+      <w:r>
+        <w:t xml:space="preserve"> </w:t>
+      </w:r>
+      <w:r>
+        <w:rPr>
+          <w:i/>
+          <w:iCs/>
+        </w:rPr>
+        <w:t xml:space="preserve">“</w:t>
+      </w:r>
+      <w:r>
+        <w:rPr>
+          <w:i/>
+          <w:iCs/>
+        </w:rPr>
+        <w:t xml:space="preserve">là đúng theo quy định tại Điều 20 Thông tư số 05/2021/TT-TTCP</w:t>
+      </w:r>
+      <w:r>
+        <w:rPr>
+          <w:i/>
+          <w:iCs/>
+        </w:rPr>
+        <w:t xml:space="preserve">”</w:t>
+      </w:r>
+      <w:r>
+        <w:t xml:space="preserve"> </w:t>
+      </w:r>
+      <w:r>
+        <w:t xml:space="preserve">— nay nằm trong hồ sơ của Thanh tra tỉnh với tư cách văn bản báo cáo. Công văn 3292 không có ý kiến về câu trả lời ấy.</w:t>
+      </w:r>
+    </w:p>
+    <w:bookmarkEnd w:id="55"/>
+    <w:bookmarkStart w:id="56" w:name="X723c7cf92997a9d9171bd4bda854d54b22322b1"/>
     <w:p>
       <w:pPr>
         <w:pStyle w:val="Heading3"/>
@@ -21482,9 +23972,9 @@
         <w:t xml:space="preserve">Thông báo 5553 không phải kết quả xử lý Hồ sơ tố cáo nhận ngày 09/7/2026 — khi ấy xin cho biết phường đã ban hành văn bản nào về hồ sơ ấy, đã báo kết quả theo Phiếu chuyển 2329 và Văn bản 2644 bằng văn bản nào, và nếu chưa thì Thanh tra tỉnh đã thực hiện bước theo dõi, đôn đốc tiếp theo nào.</w:t>
       </w:r>
     </w:p>
-    <w:bookmarkEnd w:id="54"/>
-    <w:bookmarkEnd w:id="55"/>
-    <w:bookmarkStart w:id="56" w:name="vài-điểm-về-hình-thức"/>
+    <w:bookmarkEnd w:id="56"/>
+    <w:bookmarkEnd w:id="57"/>
+    <w:bookmarkStart w:id="58" w:name="vài-điểm-về-hình-thức"/>
     <w:p>
       <w:pPr>
         <w:pStyle w:val="Heading2"/>
@@ -21846,8 +24336,8 @@
         <w:t xml:space="preserve">Toàn văn viện dẫn một văn bản quy phạm pháp luật duy nhất — Thông tư số 05/2021/TT-TTCP — ở dạng tên đầy đủ, không kèm số hiệu điều hay khoản, trong khi thông tư ấy quy định trình tự khác nhau cho đơn tố cáo và đơn kiến nghị, phản ánh (mục 4.7).</w:t>
       </w:r>
     </w:p>
-    <w:bookmarkEnd w:id="56"/>
-    <w:bookmarkStart w:id="57" w:name="X480355ca03c344de72147d9ba42f2e5a756bbd4"/>
+    <w:bookmarkEnd w:id="58"/>
+    <w:bookmarkStart w:id="59" w:name="X480355ca03c344de72147d9ba42f2e5a756bbd4"/>
     <w:p>
       <w:pPr>
         <w:pStyle w:val="Heading2"/>
@@ -22048,8 +24538,8 @@
         <w:t xml:space="preserve">. Công văn 3292 không đi đường nào trong hai đường ấy đối với nội dung đề nghị thứ hai và thứ ba: không giải quyết, không trả lời, không chuyển, không thông báo, và cũng không hướng dẫn.</w:t>
       </w:r>
     </w:p>
-    <w:bookmarkEnd w:id="57"/>
-    <w:bookmarkStart w:id="58" w:name="nhận-định-của-người-lập-báo-cáo"/>
+    <w:bookmarkEnd w:id="59"/>
+    <w:bookmarkStart w:id="60" w:name="nhận-định-của-người-lập-báo-cáo"/>
     <w:p>
       <w:pPr>
         <w:pStyle w:val="Heading2"/>
@@ -22126,7 +24616,7 @@
         <w:t xml:space="preserve">”</w:t>
       </w:r>
       <w:r>
-        <w:t xml:space="preserve">, và câu kết luận nói rằng việc chuyển đơn là đúng quy định (4.15, 4.16). Chuyển đơn đúng quy định và yêu cầu đã được thực hiện là hai việc khác nhau.</w:t>
+        <w:t xml:space="preserve">, và câu kết luận nói rằng việc chuyển đơn là đúng quy định (4.15, 4.16). Chuyển đơn đúng quy định và yêu cầu đã được thực hiện là hai việc khác nhau. Trong khi đó, chính hai văn bản ấy, đặt cạnh ngày tháng ghi trong Thông báo 5553, cho thấy các mốc luật định trên cả hai hồ sơ đã qua từ trước khi Phiếu chuyển 2329 được ban hành (4.20).</w:t>
       </w:r>
     </w:p>
     <w:p>
@@ -22168,7 +24658,7 @@
         <w:t xml:space="preserve"> </w:t>
       </w:r>
       <w:r>
-        <w:t xml:space="preserve">của một người cụ thể; văn bản báo cáo kết quả lại nói không có cơ sở xác định hành vi vi phạm (4.19). Đơn tháng 9/2026 có nhiều nội dung thì được hướng dẫn tách; đơn tháng 5/2026 có nhiều nội dung thì được gắn một nhãn (4.17). Đã gọi là tố cáo thì các nghĩa vụ đi kèm — thông báo cho người tố cáo, đối chiếu Điều 17 Thông tư 05, xem xét Điều 27 Luật Tố cáo — chưa để lại dấu ở văn bản nào (4.4, 4.6, 4.18); ở cấp phường, văn bản đầu tiên được ký sau mốc xử lý ban đầu tối đa 84 ngày (4.8). Dù hướng nào đúng thì cũng kéo theo một hệ quả cần được trả lời. Công văn 3292 không chọn hướng nào, nên cũng không phải trả lời hệ quả nào.</w:t>
+        <w:t xml:space="preserve">của một người cụ thể; văn bản báo cáo kết quả lại nói không có cơ sở xác định hành vi vi phạm (4.19). Đơn tháng 9/2026 có nhiều nội dung thì được hướng dẫn tách bằng một phiếu không nêu nội dung nào, nơi nào, và toàn bộ hồ sơ được trả về; đơn tháng 5/2026 có nhiều nội dung thì được gắn một nhãn và chuyển cả xuống phường; cả hai lần, phần đơn đặt cho chính Thanh tra tỉnh không có văn bản trả lời (4.17, 4.21). Đã gọi là tố cáo thì các nghĩa vụ đi kèm — thông báo cho người tố cáo, đối chiếu Điều 17 Thông tư 05, xem xét Điều 27 Luật Tố cáo — chưa để lại dấu ở văn bản nào (4.4, 4.6, 4.18); ở cấp phường, văn bản đầu tiên được ký sau mốc xử lý ban đầu tối đa 84 ngày (4.8). Dù hướng nào đúng thì cũng kéo theo một hệ quả cần được trả lời. Công văn 3292 không chọn hướng nào, nên cũng không phải trả lời hệ quả nào.</w:t>
       </w:r>
     </w:p>
     <w:p>
@@ -22261,8 +24751,8 @@
         <w:t xml:space="preserve">Công văn 3292 khẳng định việc phân loại, chuyển đơn là đúng quy định, nhưng không trả lời hệ quả pháp lý của chính việc phân loại ấy; không xác định kết quả thực hiện Phiếu chuyển 2329 và Văn bản 2644 đối với Hồ sơ tố cáo nhận ngày 09/7/2026; không giải thích vì sao Thông báo 5553 và Công văn 6689 đều không nhận diện hồ sơ ấy; và không xem xét ba kết luận của Thông báo 5553 — văn bản gửi chính Thanh tra tỉnh để báo cáo. Vì vậy Công văn 3292 chưa đáp ứng ba nội dung đề nghị độc lập của đơn ngày 06/10/2026.</w:t>
       </w:r>
     </w:p>
-    <w:bookmarkEnd w:id="58"/>
-    <w:bookmarkStart w:id="59" w:name="đề-nghị"/>
+    <w:bookmarkEnd w:id="60"/>
+    <w:bookmarkStart w:id="61" w:name="đề-nghị"/>
     <w:p>
       <w:pPr>
         <w:pStyle w:val="Heading2"/>
@@ -22888,6 +25378,28 @@
     </w:p>
     <w:p>
       <w:pPr>
+        <w:pStyle w:val="Compact"/>
+        <w:numPr>
+          <w:ilvl w:val="0"/>
+          <w:numId w:val="1017"/>
+        </w:numPr>
+      </w:pPr>
+      <w:r>
+        <w:rPr>
+          <w:b/>
+          <w:bCs/>
+        </w:rPr>
+        <w:t xml:space="preserve">B.7.</w:t>
+      </w:r>
+      <w:r>
+        <w:t xml:space="preserve"> </w:t>
+      </w:r>
+      <w:r>
+        <w:t xml:space="preserve">Nêu ý kiến bằng văn bản về việc, tại ngày ban hành Phiếu chuyển 2329 (03/8/2026) và Văn bản 2644 (27/8/2026), các mốc tại khoản 1 Điều 24 và khoản 2 Điều 26 Luật Tố cáo trên hai hồ sơ đã qua bao lâu, và việc ấy được xử lý thế nào (4.20).</w:t>
+      </w:r>
+    </w:p>
+    <w:p>
+      <w:pPr>
         <w:pStyle w:val="FirstParagraph"/>
       </w:pPr>
       <w:r>
@@ -23232,34 +25744,16 @@
         <w:t xml:space="preserve">Các nội dung tại phần A, B và D trả lời được bằng tài liệu đang nằm trong hồ sơ của Thanh tra tỉnh. Kính đề nghị trả lời theo từng mục, có hoặc không, kèm tên tài liệu làm căn cứ.</w:t>
       </w:r>
     </w:p>
-    <w:bookmarkEnd w:id="59"/>
-    <w:bookmarkStart w:id="60" w:name="Xc3b7a417661813019a10754720f70278e6b2625"/>
-    <w:p>
-      <w:pPr>
-        <w:pStyle w:val="Heading2"/>
-      </w:pPr>
-      <w:r>
-        <w:t xml:space="preserve">10. Ghi chú tự đối chiếu và giới hạn của các kết luận</w:t>
-      </w:r>
-    </w:p>
     <w:p>
       <w:pPr>
         <w:pStyle w:val="FirstParagraph"/>
       </w:pPr>
       <w:r>
-        <w:t xml:space="preserve">Tôi tự nêu những chỗ trong hồ sơ của chính tôi cần ghi chú, và những giới hạn của báo cáo này, để không ai phải đi tìm.</w:t>
-      </w:r>
-    </w:p>
-    <w:p>
-      <w:pPr>
-        <w:pStyle w:val="BodyText"/>
-      </w:pPr>
-      <w:r>
-        <w:rPr>
-          <w:b/>
-          <w:bCs/>
-        </w:rPr>
-        <w:t xml:space="preserve">Các chỗ cần ghi chú trong tài liệu của tôi</w:t>
+        <w:rPr>
+          <w:b/>
+          <w:bCs/>
+        </w:rPr>
+        <w:t xml:space="preserve">G. Phiếu hướng dẫn 2960 và đơn ngày 14/9/2026</w:t>
       </w:r>
     </w:p>
     <w:p>
@@ -23275,31 +25769,13 @@
           <w:b/>
           <w:bCs/>
         </w:rPr>
-        <w:t xml:space="preserve">Ngày đề Đơn B.</w:t>
-      </w:r>
-      <w:r>
-        <w:t xml:space="preserve"> </w:t>
-      </w:r>
-      <w:r>
-        <w:t xml:space="preserve">Phụ lục II (L.2) và Phụ lục IV (Bảng 4) ghi ngày đề của cả ba đơn tháng 5/2026 là 14/5/2026; Phụ lục I và đơn ngày 14/9/2026 cũng có chỗ ghi đơn gửi Thanh tra tỉnh đề ngày 14/5/2026. Chi tiết đúng: Đơn A và Đơn C đề ngày 14/5/2026; Đơn B đề ngày 16/5/2026 (mục 5.2; tệp 00.2, dòng 2). Kết luận</w:t>
-      </w:r>
-      <w:r>
-        <w:t xml:space="preserve"> </w:t>
-      </w:r>
-      <w:r>
-        <w:t xml:space="preserve">“</w:t>
-      </w:r>
-      <w:r>
-        <w:t xml:space="preserve">không đơn nào đề ngày 18/5/2026</w:t>
-      </w:r>
-      <w:r>
-        <w:t xml:space="preserve">”</w:t>
-      </w:r>
-      <w:r>
-        <w:t xml:space="preserve"> </w:t>
-      </w:r>
-      <w:r>
-        <w:t xml:space="preserve">đúng với cả hai con số.</w:t>
+        <w:t xml:space="preserve">G.1.</w:t>
+      </w:r>
+      <w:r>
+        <w:t xml:space="preserve"> </w:t>
+      </w:r>
+      <w:r>
+        <w:t xml:space="preserve">Cho biết căn cứ của việc trả lại bộ hồ sơ kèm Phiếu hướng dẫn 2960. Nếu căn cứ là Điều 21 Thông tư số 05/2021/TT-TTCP, đề nghị ban hành phiếu hướng dẫn theo Mẫu số 05: ghi từng nội dung cần tách và cơ quan, người có thẩm quyền giải quyết tương ứng (4.21).</w:t>
       </w:r>
     </w:p>
     <w:p>
@@ -23315,179 +25791,23 @@
           <w:b/>
           <w:bCs/>
         </w:rPr>
-        <w:t xml:space="preserve">Một câu trong đơn ngày 27/7/2026</w:t>
-      </w:r>
-      <w:r>
-        <w:t xml:space="preserve"> </w:t>
-      </w:r>
-      <w:r>
-        <w:t xml:space="preserve">gọi đơn tháng 5/2026 là</w:t>
-      </w:r>
-      <w:r>
-        <w:t xml:space="preserve"> </w:t>
-      </w:r>
-      <w:r>
-        <w:t xml:space="preserve">“</w:t>
-      </w:r>
-      <w:r>
-        <w:t xml:space="preserve">Đơn tố cáo</w:t>
-      </w:r>
-      <w:r>
-        <w:t xml:space="preserve">”</w:t>
-      </w:r>
-      <w:r>
-        <w:t xml:space="preserve">. Tôi đã tự nêu lại cho đúng trong đơn ngày 06/10/2026; câu ấy lập sau Công văn 1436 hơn hai tháng nên không thể là căn cứ phân loại (mục 4.11).</w:t>
-      </w:r>
-    </w:p>
-    <w:p>
-      <w:pPr>
-        <w:pStyle w:val="Compact"/>
-        <w:numPr>
-          <w:ilvl w:val="0"/>
-          <w:numId w:val="1022"/>
-        </w:numPr>
-      </w:pPr>
-      <w:r>
-        <w:rPr>
-          <w:b/>
-          <w:bCs/>
-        </w:rPr>
-        <w:t xml:space="preserve">Tài liệu kèm đơn ngày 27/7/2026</w:t>
-      </w:r>
-      <w:r>
-        <w:t xml:space="preserve"> </w:t>
-      </w:r>
-      <w:r>
-        <w:t xml:space="preserve">là bản sao Đơn tố cáo ngày 09/7/2026 và ảnh vận đơn, gửi để chứng minh việc tôi đã nộp; hồ sơ gốc — đơn, phụ lục, thẻ nhớ USB — chỉ gửi Chủ tịch Ủy ban nhân dân phường. Đơn ngày 06/10/2026 và bản ngày 27/10/2026 của báo cáo này có chỗ gọi là</w:t>
-      </w:r>
-      <w:r>
-        <w:t xml:space="preserve"> </w:t>
-      </w:r>
-      <w:r>
-        <w:t xml:space="preserve">“</w:t>
-      </w:r>
-      <w:r>
-        <w:t xml:space="preserve">bản Hồ sơ tố cáo</w:t>
-      </w:r>
-      <w:r>
-        <w:t xml:space="preserve">”</w:t>
-      </w:r>
-      <w:r>
-        <w:t xml:space="preserve">; bản này ghi thống nhất là</w:t>
-      </w:r>
-      <w:r>
-        <w:t xml:space="preserve"> </w:t>
-      </w:r>
-      <w:r>
-        <w:t xml:space="preserve">“</w:t>
-      </w:r>
-      <w:r>
-        <w:t xml:space="preserve">bản sao Đơn tố cáo</w:t>
-      </w:r>
-      <w:r>
-        <w:t xml:space="preserve">”</w:t>
-      </w:r>
-      <w:r>
-        <w:t xml:space="preserve"> </w:t>
-      </w:r>
-      <w:r>
-        <w:t xml:space="preserve">(mục 4.13).</w:t>
-      </w:r>
-    </w:p>
-    <w:p>
-      <w:pPr>
-        <w:pStyle w:val="Compact"/>
-        <w:numPr>
-          <w:ilvl w:val="0"/>
-          <w:numId w:val="1022"/>
-        </w:numPr>
-      </w:pPr>
-      <w:r>
-        <w:rPr>
-          <w:b/>
-          <w:bCs/>
-        </w:rPr>
-        <w:t xml:space="preserve">Khoản về chuyển tố cáo.</w:t>
-      </w:r>
-      <w:r>
-        <w:t xml:space="preserve"> </w:t>
-      </w:r>
-      <w:r>
-        <w:t xml:space="preserve">Nghĩa vụ chuyển trong 05 ngày làm việc và thông báo cho người tố cáo nằm tại khoản 2 Điều 24 Luật Tố cáo, như đơn ngày 27/7/2026 và báo cáo này dẫn. Hồ sơ tố cáo ngày 09/7/2026 (Mục III, Mục VII.C, Mục VIII) ghi là</w:t>
-      </w:r>
-      <w:r>
-        <w:t xml:space="preserve"> </w:t>
-      </w:r>
-      <w:r>
-        <w:t xml:space="preserve">“</w:t>
-      </w:r>
-      <w:r>
-        <w:t xml:space="preserve">khoản 3 Điều 24</w:t>
-      </w:r>
-      <w:r>
-        <w:t xml:space="preserve">”</w:t>
-      </w:r>
-      <w:r>
-        <w:t xml:space="preserve">. Ghi chú này không làm thay đổi nghĩa vụ được đề nghị.</w:t>
-      </w:r>
-    </w:p>
-    <w:p>
-      <w:pPr>
-        <w:pStyle w:val="Compact"/>
-        <w:numPr>
-          <w:ilvl w:val="0"/>
-          <w:numId w:val="1022"/>
-        </w:numPr>
-      </w:pPr>
-      <w:r>
-        <w:rPr>
-          <w:b/>
-          <w:bCs/>
-        </w:rPr>
-        <w:t xml:space="preserve">Luật Thanh tra.</w:t>
-      </w:r>
-      <w:r>
-        <w:t xml:space="preserve"> </w:t>
-      </w:r>
-      <w:r>
-        <w:t xml:space="preserve">Đơn B viện dẫn</w:t>
-      </w:r>
-      <w:r>
-        <w:t xml:space="preserve"> </w:t>
-      </w:r>
-      <w:r>
-        <w:t xml:space="preserve">“</w:t>
-      </w:r>
-      <w:r>
-        <w:t xml:space="preserve">Luật Thanh tra 2022</w:t>
-      </w:r>
-      <w:r>
-        <w:t xml:space="preserve">”</w:t>
-      </w:r>
-      <w:r>
-        <w:t xml:space="preserve">; tại thời điểm gửi đơn, Luật Thanh tra năm 2025 (số 84/2025/QH15) đã có hiệu lực từ ngày 01/7/2025. Viện dẫn ấy không làm thay đổi nội dung đề nghị thanh tra.</w:t>
-      </w:r>
-    </w:p>
-    <w:p>
-      <w:pPr>
-        <w:pStyle w:val="Compact"/>
-        <w:numPr>
-          <w:ilvl w:val="0"/>
-          <w:numId w:val="1022"/>
-        </w:numPr>
-      </w:pPr>
-      <w:r>
-        <w:rPr>
-          <w:b/>
-          <w:bCs/>
-        </w:rPr>
-        <w:t xml:space="preserve">Cách tính mốc.</w:t>
-      </w:r>
-      <w:r>
-        <w:t xml:space="preserve"> </w:t>
-      </w:r>
-      <w:r>
-        <w:t xml:space="preserve">Phụ lục I (mục A.7.2, K.1) tính mốc trên Hồ sơ tố cáo nhận ngày 09/7/2026 là 17/7 và 22/7/2026, tức tính cả ngày nhận. Báo cáo này tính từ ngày tiếp theo ngày nhận (khoản 2 Điều 147 Bộ luật Dân sự năm 2015), nên mốc là 20/7 và 23/7/2026. Hai cách tính đều cho thấy mốc đã qua từ tháng 7/2026.</w:t>
+        <w:t xml:space="preserve">G.2.</w:t>
+      </w:r>
+      <w:r>
+        <w:t xml:space="preserve"> </w:t>
+      </w:r>
+      <w:r>
+        <w:t xml:space="preserve">Đối với sáu nội dung tại Mục IV đơn ngày 14/9/2026 — các nội dung trả lời được bằng hồ sơ lưu của Thanh tra tỉnh — trả lời theo khoản 1 Điều 20 Thông tư số 05/2021/TT-TTCP; nội dung nào Thanh tra tỉnh cho rằng không thuộc trách nhiệm của mình, đề nghị nêu cơ quan có trách nhiệm (4.21).</w:t>
+      </w:r>
+    </w:p>
+    <w:bookmarkEnd w:id="61"/>
+    <w:bookmarkStart w:id="62" w:name="Xc3b7a417661813019a10754720f70278e6b2625"/>
+    <w:p>
+      <w:pPr>
+        <w:pStyle w:val="Heading2"/>
+      </w:pPr>
+      <w:r>
+        <w:t xml:space="preserve">10. Ghi chú tự đối chiếu và giới hạn của các kết luận</w:t>
       </w:r>
     </w:p>
     <w:p>
@@ -23495,11 +25815,19 @@
         <w:pStyle w:val="FirstParagraph"/>
       </w:pPr>
       <w:r>
-        <w:rPr>
-          <w:b/>
-          <w:bCs/>
-        </w:rPr>
-        <w:t xml:space="preserve">Giới hạn của các kết luận</w:t>
+        <w:t xml:space="preserve">Tôi tự nêu những chỗ trong hồ sơ của chính tôi cần ghi chú, và những giới hạn của báo cáo này, để không ai phải đi tìm.</w:t>
+      </w:r>
+    </w:p>
+    <w:p>
+      <w:pPr>
+        <w:pStyle w:val="BodyText"/>
+      </w:pPr>
+      <w:r>
+        <w:rPr>
+          <w:b/>
+          <w:bCs/>
+        </w:rPr>
+        <w:t xml:space="preserve">Các chỗ cần ghi chú trong tài liệu của tôi</w:t>
       </w:r>
     </w:p>
     <w:p>
@@ -23511,7 +25839,17 @@
         </w:numPr>
       </w:pPr>
       <w:r>
-        <w:t xml:space="preserve">Những gì báo cáo nói</w:t>
+        <w:rPr>
+          <w:b/>
+          <w:bCs/>
+        </w:rPr>
+        <w:t xml:space="preserve">Ngày đề Đơn B.</w:t>
+      </w:r>
+      <w:r>
+        <w:t xml:space="preserve"> </w:t>
+      </w:r>
+      <w:r>
+        <w:t xml:space="preserve">Phụ lục II (L.2) và Phụ lục IV (Bảng 4) ghi ngày đề của cả ba đơn tháng 5/2026 là 14/5/2026; Phụ lục I và đơn ngày 14/9/2026 cũng có chỗ ghi đơn gửi Thanh tra tỉnh đề ngày 14/5/2026. Chi tiết đúng: Đơn A và Đơn C đề ngày 14/5/2026; Đơn B đề ngày 16/5/2026 (mục 5.2; tệp 00.2, dòng 2). Kết luận</w:t>
       </w:r>
       <w:r>
         <w:t xml:space="preserve"> </w:t>
@@ -23520,7 +25858,7 @@
         <w:t xml:space="preserve">“</w:t>
       </w:r>
       <w:r>
-        <w:t xml:space="preserve">không có</w:t>
+        <w:t xml:space="preserve">không đơn nào đề ngày 18/5/2026</w:t>
       </w:r>
       <w:r>
         <w:t xml:space="preserve">”</w:t>
@@ -23529,53 +25867,7 @@
         <w:t xml:space="preserve"> </w:t>
       </w:r>
       <w:r>
-        <w:t xml:space="preserve">là</w:t>
-      </w:r>
-      <w:r>
-        <w:t xml:space="preserve"> </w:t>
-      </w:r>
-      <w:r>
-        <w:rPr>
-          <w:b/>
-          <w:bCs/>
-        </w:rPr>
-        <w:t xml:space="preserve">không có trong văn bản đã ban hành</w:t>
-      </w:r>
-      <w:r>
-        <w:t xml:space="preserve"> </w:t>
-      </w:r>
-      <w:r>
-        <w:t xml:space="preserve">và trong những gì tôi nhận được đến ngày 28/10/2026. Cơ quan có hoạt động nào không thể hiện ra văn bản hay không thì chỉ hồ sơ xử lý của cơ quan trả lời được; vì vậy các đề nghị tại mục 9 đặt dưới dạng</w:t>
-      </w:r>
-      <w:r>
-        <w:t xml:space="preserve"> </w:t>
-      </w:r>
-      <w:r>
-        <w:t xml:space="preserve">“</w:t>
-      </w:r>
-      <w:r>
-        <w:t xml:space="preserve">cho biết</w:t>
-      </w:r>
-      <w:r>
-        <w:t xml:space="preserve">”</w:t>
-      </w:r>
-      <w:r>
-        <w:t xml:space="preserve">,</w:t>
-      </w:r>
-      <w:r>
-        <w:t xml:space="preserve"> </w:t>
-      </w:r>
-      <w:r>
-        <w:t xml:space="preserve">“</w:t>
-      </w:r>
-      <w:r>
-        <w:t xml:space="preserve">xác nhận</w:t>
-      </w:r>
-      <w:r>
-        <w:t xml:space="preserve">”</w:t>
-      </w:r>
-      <w:r>
-        <w:t xml:space="preserve">.</w:t>
+        <w:t xml:space="preserve">đúng với cả hai con số.</w:t>
       </w:r>
     </w:p>
     <w:p>
@@ -23587,23 +25879,32 @@
         </w:numPr>
       </w:pPr>
       <w:r>
-        <w:t xml:space="preserve">Báo cáo chỉ nêu sự việc đọc được từ văn bản và hệ quả của nó;</w:t>
-      </w:r>
-      <w:r>
-        <w:t xml:space="preserve"> </w:t>
-      </w:r>
-      <w:r>
-        <w:rPr>
-          <w:b/>
-          <w:bCs/>
-        </w:rPr>
-        <w:t xml:space="preserve">không nêu và không suy đoán động cơ</w:t>
-      </w:r>
-      <w:r>
-        <w:t xml:space="preserve"> </w:t>
-      </w:r>
-      <w:r>
-        <w:t xml:space="preserve">của người ký bất kỳ văn bản nào.</w:t>
+        <w:rPr>
+          <w:b/>
+          <w:bCs/>
+        </w:rPr>
+        <w:t xml:space="preserve">Một câu trong đơn ngày 27/7/2026</w:t>
+      </w:r>
+      <w:r>
+        <w:t xml:space="preserve"> </w:t>
+      </w:r>
+      <w:r>
+        <w:t xml:space="preserve">gọi đơn tháng 5/2026 là</w:t>
+      </w:r>
+      <w:r>
+        <w:t xml:space="preserve"> </w:t>
+      </w:r>
+      <w:r>
+        <w:t xml:space="preserve">“</w:t>
+      </w:r>
+      <w:r>
+        <w:t xml:space="preserve">Đơn tố cáo</w:t>
+      </w:r>
+      <w:r>
+        <w:t xml:space="preserve">”</w:t>
+      </w:r>
+      <w:r>
+        <w:t xml:space="preserve">. Tôi đã tự nêu lại cho đúng trong đơn ngày 06/10/2026; câu ấy lập sau Công văn 1436 hơn hai tháng nên không thể là căn cứ phân loại (mục 4.11).</w:t>
       </w:r>
     </w:p>
     <w:p>
@@ -23615,39 +25916,50 @@
         </w:numPr>
       </w:pPr>
       <w:r>
-        <w:t xml:space="preserve">Báo cáo</w:t>
-      </w:r>
-      <w:r>
-        <w:t xml:space="preserve"> </w:t>
-      </w:r>
-      <w:r>
-        <w:rPr>
-          <w:b/>
-          <w:bCs/>
-        </w:rPr>
-        <w:t xml:space="preserve">không đề nghị</w:t>
-      </w:r>
-      <w:r>
-        <w:t xml:space="preserve"> </w:t>
-      </w:r>
-      <w:r>
-        <w:t xml:space="preserve">Thanh tra tỉnh giải quyết khiếu nại thay Chủ tịch Ủy ban nhân dân phường, và</w:t>
-      </w:r>
-      <w:r>
-        <w:t xml:space="preserve"> </w:t>
-      </w:r>
-      <w:r>
-        <w:rPr>
-          <w:b/>
-          <w:bCs/>
-        </w:rPr>
-        <w:t xml:space="preserve">không đề nghị</w:t>
-      </w:r>
-      <w:r>
-        <w:t xml:space="preserve"> </w:t>
-      </w:r>
-      <w:r>
-        <w:t xml:space="preserve">kết luận về trách nhiệm hình sự thay cơ quan tiến hành tố tụng. Việc tôi nêu điều luật hình sự trong các hồ sơ trước không có nghĩa là đã có dấu hiệu tội phạm; điều tôi đề nghị là việc xem xét được thể hiện bằng văn bản (mục 4.18).</w:t>
+        <w:rPr>
+          <w:b/>
+          <w:bCs/>
+        </w:rPr>
+        <w:t xml:space="preserve">Tài liệu kèm đơn ngày 27/7/2026</w:t>
+      </w:r>
+      <w:r>
+        <w:t xml:space="preserve"> </w:t>
+      </w:r>
+      <w:r>
+        <w:t xml:space="preserve">là bản sao Đơn tố cáo ngày 09/7/2026 và ảnh vận đơn, gửi để chứng minh việc tôi đã nộp; hồ sơ gốc — đơn, phụ lục, thẻ nhớ USB — chỉ gửi Chủ tịch Ủy ban nhân dân phường. Đơn ngày 06/10/2026 và bản ngày 27/10/2026 của báo cáo này có chỗ gọi là</w:t>
+      </w:r>
+      <w:r>
+        <w:t xml:space="preserve"> </w:t>
+      </w:r>
+      <w:r>
+        <w:t xml:space="preserve">“</w:t>
+      </w:r>
+      <w:r>
+        <w:t xml:space="preserve">bản Hồ sơ tố cáo</w:t>
+      </w:r>
+      <w:r>
+        <w:t xml:space="preserve">”</w:t>
+      </w:r>
+      <w:r>
+        <w:t xml:space="preserve">; bản này ghi thống nhất là</w:t>
+      </w:r>
+      <w:r>
+        <w:t xml:space="preserve"> </w:t>
+      </w:r>
+      <w:r>
+        <w:t xml:space="preserve">“</w:t>
+      </w:r>
+      <w:r>
+        <w:t xml:space="preserve">bản sao Đơn tố cáo</w:t>
+      </w:r>
+      <w:r>
+        <w:t xml:space="preserve">”</w:t>
+      </w:r>
+      <w:r>
+        <w:t xml:space="preserve"> </w:t>
+      </w:r>
+      <w:r>
+        <w:t xml:space="preserve">(mục 4.13).</w:t>
       </w:r>
     </w:p>
     <w:p>
@@ -23659,36 +25971,32 @@
         </w:numPr>
       </w:pPr>
       <w:r>
-        <w:t xml:space="preserve">Đơn khiếu nại ngày 06/10/2026 khiếu nại</w:t>
-      </w:r>
-      <w:r>
-        <w:t xml:space="preserve"> </w:t>
-      </w:r>
-      <w:r>
-        <w:rPr>
-          <w:b/>
-          <w:bCs/>
-        </w:rPr>
-        <w:t xml:space="preserve">ba kết luận</w:t>
-      </w:r>
-      <w:r>
-        <w:t xml:space="preserve"> </w:t>
-      </w:r>
-      <w:r>
-        <w:t xml:space="preserve">của Thông báo 5553,</w:t>
-      </w:r>
-      <w:r>
-        <w:t xml:space="preserve"> </w:t>
-      </w:r>
-      <w:r>
-        <w:rPr>
-          <w:b/>
-          <w:bCs/>
-        </w:rPr>
-        <w:t xml:space="preserve">không khiếu nại việc không thụ lý tố cáo</w:t>
-      </w:r>
-      <w:r>
-        <w:t xml:space="preserve">. Một thông báo không thụ lý tố cáo tự nó không sai về hình thức; điều được nêu là phạm vi, căn cứ và các kết luận về nội dung đặt trong văn bản ấy (mục 5.7).</w:t>
+        <w:rPr>
+          <w:b/>
+          <w:bCs/>
+        </w:rPr>
+        <w:t xml:space="preserve">Khoản về chuyển tố cáo.</w:t>
+      </w:r>
+      <w:r>
+        <w:t xml:space="preserve"> </w:t>
+      </w:r>
+      <w:r>
+        <w:t xml:space="preserve">Nghĩa vụ chuyển trong 05 ngày làm việc và thông báo cho người tố cáo nằm tại khoản 2 Điều 24 Luật Tố cáo, như đơn ngày 27/7/2026 và báo cáo này dẫn. Hồ sơ tố cáo ngày 09/7/2026 (Mục III, Mục VII.C, Mục VIII) ghi là</w:t>
+      </w:r>
+      <w:r>
+        <w:t xml:space="preserve"> </w:t>
+      </w:r>
+      <w:r>
+        <w:t xml:space="preserve">“</w:t>
+      </w:r>
+      <w:r>
+        <w:t xml:space="preserve">khoản 3 Điều 24</w:t>
+      </w:r>
+      <w:r>
+        <w:t xml:space="preserve">”</w:t>
+      </w:r>
+      <w:r>
+        <w:t xml:space="preserve">. Ghi chú này không làm thay đổi nghĩa vụ được đề nghị.</w:t>
       </w:r>
     </w:p>
     <w:p>
@@ -23700,7 +26008,32 @@
         </w:numPr>
       </w:pPr>
       <w:r>
-        <w:t xml:space="preserve">Những chỗ trong ngoặc kép là trích nguyên văn từ bản gốc văn bản. Nội dung điều luật ở các chỗ khác được diễn đạt theo văn bản; khi trích dẫn chính thức, xin đối chiếu văn bản hợp nhất (Phụ lục C).</w:t>
+        <w:rPr>
+          <w:b/>
+          <w:bCs/>
+        </w:rPr>
+        <w:t xml:space="preserve">Luật Thanh tra.</w:t>
+      </w:r>
+      <w:r>
+        <w:t xml:space="preserve"> </w:t>
+      </w:r>
+      <w:r>
+        <w:t xml:space="preserve">Đơn B viện dẫn</w:t>
+      </w:r>
+      <w:r>
+        <w:t xml:space="preserve"> </w:t>
+      </w:r>
+      <w:r>
+        <w:t xml:space="preserve">“</w:t>
+      </w:r>
+      <w:r>
+        <w:t xml:space="preserve">Luật Thanh tra 2022</w:t>
+      </w:r>
+      <w:r>
+        <w:t xml:space="preserve">”</w:t>
+      </w:r>
+      <w:r>
+        <w:t xml:space="preserve">; tại thời điểm gửi đơn, Luật Thanh tra năm 2025 (số 84/2025/QH15) đã có hiệu lực từ ngày 01/7/2025. Viện dẫn ấy không làm thay đổi nội dung đề nghị thanh tra.</w:t>
       </w:r>
     </w:p>
     <w:p>
@@ -23712,11 +26045,270 @@
         </w:numPr>
       </w:pPr>
       <w:r>
+        <w:rPr>
+          <w:b/>
+          <w:bCs/>
+        </w:rPr>
+        <w:t xml:space="preserve">Cách tính mốc.</w:t>
+      </w:r>
+      <w:r>
+        <w:t xml:space="preserve"> </w:t>
+      </w:r>
+      <w:r>
+        <w:t xml:space="preserve">Phụ lục I (mục A.7.2, K.1) tính mốc trên Hồ sơ tố cáo nhận ngày 09/7/2026 là 17/7 và 22/7/2026, tức tính cả ngày nhận. Báo cáo này tính từ ngày tiếp theo ngày nhận (khoản 2 Điều 147 Bộ luật Dân sự năm 2015), nên mốc là 20/7 và 23/7/2026. Hai cách tính đều cho thấy mốc đã qua từ tháng 7/2026.</w:t>
+      </w:r>
+    </w:p>
+    <w:p>
+      <w:pPr>
+        <w:pStyle w:val="FirstParagraph"/>
+      </w:pPr>
+      <w:r>
+        <w:rPr>
+          <w:b/>
+          <w:bCs/>
+        </w:rPr>
+        <w:t xml:space="preserve">Giới hạn của các kết luận</w:t>
+      </w:r>
+    </w:p>
+    <w:p>
+      <w:pPr>
+        <w:pStyle w:val="Compact"/>
+        <w:numPr>
+          <w:ilvl w:val="0"/>
+          <w:numId w:val="1024"/>
+        </w:numPr>
+      </w:pPr>
+      <w:r>
+        <w:t xml:space="preserve">Những gì báo cáo nói</w:t>
+      </w:r>
+      <w:r>
+        <w:t xml:space="preserve"> </w:t>
+      </w:r>
+      <w:r>
+        <w:t xml:space="preserve">“</w:t>
+      </w:r>
+      <w:r>
+        <w:t xml:space="preserve">không có</w:t>
+      </w:r>
+      <w:r>
+        <w:t xml:space="preserve">”</w:t>
+      </w:r>
+      <w:r>
+        <w:t xml:space="preserve"> </w:t>
+      </w:r>
+      <w:r>
+        <w:t xml:space="preserve">là</w:t>
+      </w:r>
+      <w:r>
+        <w:t xml:space="preserve"> </w:t>
+      </w:r>
+      <w:r>
+        <w:rPr>
+          <w:b/>
+          <w:bCs/>
+        </w:rPr>
+        <w:t xml:space="preserve">không có trong văn bản đã ban hành</w:t>
+      </w:r>
+      <w:r>
+        <w:t xml:space="preserve"> </w:t>
+      </w:r>
+      <w:r>
+        <w:t xml:space="preserve">và trong những gì tôi nhận được đến ngày 28/10/2026. Cơ quan có hoạt động nào không thể hiện ra văn bản hay không thì chỉ hồ sơ xử lý của cơ quan trả lời được; vì vậy các đề nghị tại mục 9 đặt dưới dạng</w:t>
+      </w:r>
+      <w:r>
+        <w:t xml:space="preserve"> </w:t>
+      </w:r>
+      <w:r>
+        <w:t xml:space="preserve">“</w:t>
+      </w:r>
+      <w:r>
+        <w:t xml:space="preserve">cho biết</w:t>
+      </w:r>
+      <w:r>
+        <w:t xml:space="preserve">”</w:t>
+      </w:r>
+      <w:r>
+        <w:t xml:space="preserve">,</w:t>
+      </w:r>
+      <w:r>
+        <w:t xml:space="preserve"> </w:t>
+      </w:r>
+      <w:r>
+        <w:t xml:space="preserve">“</w:t>
+      </w:r>
+      <w:r>
+        <w:t xml:space="preserve">xác nhận</w:t>
+      </w:r>
+      <w:r>
+        <w:t xml:space="preserve">”</w:t>
+      </w:r>
+      <w:r>
+        <w:t xml:space="preserve">.</w:t>
+      </w:r>
+    </w:p>
+    <w:p>
+      <w:pPr>
+        <w:pStyle w:val="Compact"/>
+        <w:numPr>
+          <w:ilvl w:val="0"/>
+          <w:numId w:val="1024"/>
+        </w:numPr>
+      </w:pPr>
+      <w:r>
+        <w:t xml:space="preserve">Báo cáo chỉ nêu sự việc đọc được từ văn bản và hệ quả của nó;</w:t>
+      </w:r>
+      <w:r>
+        <w:t xml:space="preserve"> </w:t>
+      </w:r>
+      <w:r>
+        <w:rPr>
+          <w:b/>
+          <w:bCs/>
+        </w:rPr>
+        <w:t xml:space="preserve">không nêu và không suy đoán động cơ</w:t>
+      </w:r>
+      <w:r>
+        <w:t xml:space="preserve"> </w:t>
+      </w:r>
+      <w:r>
+        <w:t xml:space="preserve">của người ký bất kỳ văn bản nào.</w:t>
+      </w:r>
+    </w:p>
+    <w:p>
+      <w:pPr>
+        <w:pStyle w:val="Compact"/>
+        <w:numPr>
+          <w:ilvl w:val="0"/>
+          <w:numId w:val="1024"/>
+        </w:numPr>
+      </w:pPr>
+      <w:r>
+        <w:t xml:space="preserve">Báo cáo</w:t>
+      </w:r>
+      <w:r>
+        <w:t xml:space="preserve"> </w:t>
+      </w:r>
+      <w:r>
+        <w:rPr>
+          <w:b/>
+          <w:bCs/>
+        </w:rPr>
+        <w:t xml:space="preserve">không đề nghị</w:t>
+      </w:r>
+      <w:r>
+        <w:t xml:space="preserve"> </w:t>
+      </w:r>
+      <w:r>
+        <w:t xml:space="preserve">Thanh tra tỉnh giải quyết khiếu nại thay Chủ tịch Ủy ban nhân dân phường, và</w:t>
+      </w:r>
+      <w:r>
+        <w:t xml:space="preserve"> </w:t>
+      </w:r>
+      <w:r>
+        <w:rPr>
+          <w:b/>
+          <w:bCs/>
+        </w:rPr>
+        <w:t xml:space="preserve">không đề nghị</w:t>
+      </w:r>
+      <w:r>
+        <w:t xml:space="preserve"> </w:t>
+      </w:r>
+      <w:r>
+        <w:t xml:space="preserve">kết luận về trách nhiệm hình sự thay cơ quan tiến hành tố tụng. Việc tôi nêu điều luật hình sự trong các hồ sơ trước không có nghĩa là đã có dấu hiệu tội phạm; điều tôi đề nghị là việc xem xét được thể hiện bằng văn bản (mục 4.18).</w:t>
+      </w:r>
+    </w:p>
+    <w:p>
+      <w:pPr>
+        <w:pStyle w:val="Compact"/>
+        <w:numPr>
+          <w:ilvl w:val="0"/>
+          <w:numId w:val="1024"/>
+        </w:numPr>
+      </w:pPr>
+      <w:r>
+        <w:t xml:space="preserve">Đơn khiếu nại ngày 06/10/2026 khiếu nại</w:t>
+      </w:r>
+      <w:r>
+        <w:t xml:space="preserve"> </w:t>
+      </w:r>
+      <w:r>
+        <w:rPr>
+          <w:b/>
+          <w:bCs/>
+        </w:rPr>
+        <w:t xml:space="preserve">ba kết luận</w:t>
+      </w:r>
+      <w:r>
+        <w:t xml:space="preserve"> </w:t>
+      </w:r>
+      <w:r>
+        <w:t xml:space="preserve">của Thông báo 5553,</w:t>
+      </w:r>
+      <w:r>
+        <w:t xml:space="preserve"> </w:t>
+      </w:r>
+      <w:r>
+        <w:rPr>
+          <w:b/>
+          <w:bCs/>
+        </w:rPr>
+        <w:t xml:space="preserve">không khiếu nại việc không thụ lý tố cáo</w:t>
+      </w:r>
+      <w:r>
+        <w:t xml:space="preserve">. Một thông báo không thụ lý tố cáo tự nó không sai về hình thức; điều được nêu là phạm vi, căn cứ và các kết luận về nội dung đặt trong văn bản ấy (mục 5.7).</w:t>
+      </w:r>
+    </w:p>
+    <w:p>
+      <w:pPr>
+        <w:pStyle w:val="Compact"/>
+        <w:numPr>
+          <w:ilvl w:val="0"/>
+          <w:numId w:val="1024"/>
+        </w:numPr>
+      </w:pPr>
+      <w:r>
+        <w:t xml:space="preserve">Những chỗ trong ngoặc kép là trích nguyên văn từ bản gốc văn bản. Nội dung điều luật ở các chỗ khác được diễn đạt theo văn bản; khi trích dẫn chính thức, xin đối chiếu văn bản hợp nhất (Phụ lục C).</w:t>
+      </w:r>
+    </w:p>
+    <w:p>
+      <w:pPr>
+        <w:pStyle w:val="Compact"/>
+        <w:numPr>
+          <w:ilvl w:val="0"/>
+          <w:numId w:val="1024"/>
+        </w:numPr>
+      </w:pPr>
+      <w:r>
         <w:t xml:space="preserve">Số ngày: ngày lịch tính đến ngày 28/10/2026; ngày làm việc không tính thứ Bảy, Chủ nhật và ngày lễ; thời hạn tính từ ngày tiếp theo ngày nhận.</w:t>
       </w:r>
     </w:p>
-    <w:bookmarkEnd w:id="60"/>
-    <w:bookmarkStart w:id="61" w:name="dẫn-chiếu-khi-làm-đơn"/>
+    <w:p>
+      <w:pPr>
+        <w:pStyle w:val="Compact"/>
+        <w:numPr>
+          <w:ilvl w:val="0"/>
+          <w:numId w:val="1024"/>
+        </w:numPr>
+      </w:pPr>
+      <w:r>
+        <w:t xml:space="preserve">Mục 4.21 nêu rằng tôi chưa tìm thấy quy định cho phép trả lại toàn bộ đơn chỉ vì đơn có nhiều nội dung. Đó là kết quả tra cứu của tôi trong các văn bản dẫn tại Phụ lục C, không phải khẳng định thay cơ quan có thẩm quyền; nếu có căn cứ khác, tôi xin được biết (đề nghị G.1). Nội dung Điều 21 và Mẫu số 05 Thông tư số 05/2021/TT-TTCP được diễn đạt theo văn bản; khi trích dẫn chính thức, xin đối chiếu Công báo.</w:t>
+      </w:r>
+    </w:p>
+    <w:p>
+      <w:pPr>
+        <w:pStyle w:val="Compact"/>
+        <w:numPr>
+          <w:ilvl w:val="0"/>
+          <w:numId w:val="1024"/>
+        </w:numPr>
+      </w:pPr>
+      <w:r>
+        <w:t xml:space="preserve">Các mốc thời gian tính theo ngày ghi trên văn bản. Báo cáo không đặt vấn đề về ngày ký của bất kỳ văn bản nào.</w:t>
+      </w:r>
+    </w:p>
+    <w:bookmarkEnd w:id="62"/>
+    <w:bookmarkStart w:id="63" w:name="dẫn-chiếu-khi-làm-đơn"/>
     <w:p>
       <w:pPr>
         <w:pStyle w:val="Heading2"/>
@@ -23954,7 +26546,7 @@
               <w:rPr>
                 <w:sz w:val="22"/>
               </w:rPr>
-              <w:t xml:space="preserve">Trả lời đủ ba nội dung đơn 06/10/2026; kết quả Phiếu 2329, Văn bản 2644; trạng thái Hồ sơ tố cáo 09/7; theo dõi Đơn khiếu nại 06/10</w:t>
+              <w:t xml:space="preserve">Trả lời đủ ba nội dung đơn 06/10/2026; kết quả Phiếu 2329, Văn bản 2644; trạng thái Hồ sơ tố cáo 09/7; theo dõi Đơn khiếu nại 06/10; căn cứ trả lại hồ sơ kèm Phiếu 2960 và sáu nội dung tại Mục IV đơn 14/9</w:t>
             </w:r>
           </w:p>
         </w:tc>
@@ -23973,7 +26565,7 @@
               <w:rPr>
                 <w:sz w:val="22"/>
               </w:rPr>
-              <w:t xml:space="preserve">1, 3, 4.1 – 4.19, 5.5, 5.8, 7</w:t>
+              <w:t xml:space="preserve">1, 3, 4.1 – 4.21, 5.5, 5.8, 7</w:t>
             </w:r>
           </w:p>
         </w:tc>
@@ -23992,7 +26584,7 @@
               <w:rPr>
                 <w:sz w:val="22"/>
               </w:rPr>
-              <w:t xml:space="preserve">A.1 – A.5, B.1 – B.6, C.1 – C.3, D.1 – D.2, E.1 – E.2, F</w:t>
+              <w:t xml:space="preserve">A.1 – A.5, B.1 – B.7, C.1 – C.3, D.1 – D.2, E.1 – E.2, F, G.1 – G.2</w:t>
             </w:r>
           </w:p>
         </w:tc>
@@ -24068,7 +26660,7 @@
               <w:rPr>
                 <w:sz w:val="22"/>
               </w:rPr>
-              <w:t xml:space="preserve">Căn cứ phân loại đơn tháng 5 (4.2 – 4.4, 4.17); thông báo khi chuyển (4.6); câu hỏi về kết quả bị trả lời bằng thủ tục (4.15, 4.16); hai đánh giá trái nhau (4.19); Điều 27 (4.18); đơn khiếu nại quá hạn (4.14)</w:t>
+              <w:t xml:space="preserve">Căn cứ phân loại đơn tháng 5 (4.2 – 4.4, 4.17); thông báo khi chuyển (4.6); câu hỏi về kết quả bị trả lời bằng thủ tục (4.15, 4.16); hai đánh giá trái nhau (4.19); Điều 27 (4.18); đơn khiếu nại quá hạn (4.14); Văn bản 2644 được xếp vào nhóm văn bản chuyển đơn (4.20); Phiếu 2960 không nêu nội dung nào, nơi nào, hồ sơ bị trả lại (4.21)</w:t>
             </w:r>
           </w:p>
         </w:tc>
@@ -24087,7 +26679,7 @@
               <w:rPr>
                 <w:sz w:val="22"/>
               </w:rPr>
-              <w:t xml:space="preserve">1, 3.3, 4.15 – 4.19, 8</w:t>
+              <w:t xml:space="preserve">1, 3.3, 4.15 – 4.21, 8</w:t>
             </w:r>
           </w:p>
         </w:tc>
@@ -24106,7 +26698,7 @@
               <w:rPr>
                 <w:sz w:val="22"/>
               </w:rPr>
-              <w:t xml:space="preserve">Đề nghị yêu cầu Thanh tra tỉnh trả lời các mục A – E</w:t>
+              <w:t xml:space="preserve">Đề nghị yêu cầu Thanh tra tỉnh trả lời các mục A – E, G</w:t>
             </w:r>
           </w:p>
         </w:tc>
@@ -24182,7 +26774,7 @@
               <w:rPr>
                 <w:sz w:val="22"/>
               </w:rPr>
-              <w:t xml:space="preserve">Hồ sơ tố cáo 09/7 chưa có văn bản; Thông báo 5553 và Công văn 6689 không nhận diện hồ sơ ấy; Đơn khiếu nại 06/10 quá hạn thụ lý; mốc trên tuyến Công văn 1436</w:t>
+              <w:t xml:space="preserve">Hồ sơ tố cáo 09/7 chưa có văn bản; Thông báo 5553 và Công văn 6689 không nhận diện hồ sơ ấy; Đơn khiếu nại 06/10 quá hạn thụ lý; mốc trên tuyến Công văn 1436; Phiếu chuyển 2329 và Văn bản 2644 ghi lại việc phường chưa có kết quả khi các mốc đã qua</w:t>
             </w:r>
           </w:p>
         </w:tc>
@@ -24201,7 +26793,7 @@
               <w:rPr>
                 <w:sz w:val="22"/>
               </w:rPr>
-              <w:t xml:space="preserve">4.8, 4.13, 4.14, 5.8, Phụ lục B</w:t>
+              <w:t xml:space="preserve">4.8, 4.13, 4.14, 4.20, 5.8, Phụ lục B</w:t>
             </w:r>
           </w:p>
         </w:tc>
@@ -24220,7 +26812,7 @@
               <w:rPr>
                 <w:sz w:val="22"/>
               </w:rPr>
-              <w:t xml:space="preserve">B.2, B.3, C.3, E.2</w:t>
+              <w:t xml:space="preserve">B.2, B.3, B.7, C.3, E.2</w:t>
             </w:r>
           </w:p>
         </w:tc>
@@ -24469,8 +27061,8 @@
         <w:br w:type="page"/>
       </w:r>
     </w:p>
-    <w:bookmarkEnd w:id="61"/>
-    <w:bookmarkStart w:id="62" w:name="X25fef0f694bac7efbe96cc29ba5fd573f0ac1d8"/>
+    <w:bookmarkEnd w:id="63"/>
+    <w:bookmarkStart w:id="64" w:name="X25fef0f694bac7efbe96cc29ba5fd573f0ac1d8"/>
     <w:p>
       <w:pPr>
         <w:pStyle w:val="Heading2"/>
@@ -25107,7 +27699,7 @@
               <w:rPr>
                 <w:sz w:val="22"/>
               </w:rPr>
-              <w:t xml:space="preserve">ngày 28/9/2026 — đơn có nhiều nội dung khác nhau, hướng dẫn tách đơn</w:t>
+              <w:t xml:space="preserve">ngày 28/9/2026 — đơn có nhiều nội dung khác nhau, hướng dẫn tách đơn; phiếu không nêu nội dung nào, nơi nào; bộ hồ sơ giấy được trả lại kèm phiếu (mục 4.21)</w:t>
             </w:r>
           </w:p>
         </w:tc>
@@ -25423,8 +28015,8 @@
         <w:t xml:space="preserve">.</w:t>
       </w:r>
     </w:p>
-    <w:bookmarkEnd w:id="62"/>
-    <w:bookmarkStart w:id="63" w:name="Xdf46f2bbb5bdd3a70db28e905d9b21004e959d9"/>
+    <w:bookmarkEnd w:id="64"/>
+    <w:bookmarkStart w:id="65" w:name="Xdf46f2bbb5bdd3a70db28e905d9b21004e959d9"/>
     <w:p>
       <w:pPr>
         <w:pStyle w:val="Heading2"/>
@@ -26744,7 +29336,7 @@
               <w:rPr>
                 <w:sz w:val="22"/>
               </w:rPr>
-              <w:t xml:space="preserve">Đơn đề nghị gửi Thanh tra tỉnh (đề 14/9, giao 18/9), lần đầu hỏi</w:t>
+              <w:t xml:space="preserve">Đơn đề nghị gửi Thanh tra tỉnh (đề 14/9, giao 18/9), tự ghi là đơn kiến nghị, phản ánh, lần đầu hỏi</w:t>
             </w:r>
             <w:r>
               <w:rPr>
@@ -26762,13 +29354,19 @@
               <w:rPr>
                 <w:sz w:val="22"/>
               </w:rPr>
-              <w:t xml:space="preserve">hồ sơ có tài liệu nào đề ngày 18/5/2026 hay không</w:t>
+              <w:t xml:space="preserve">hồ sơ Quý cơ quan có tài liệu nào đề ngày 18/5/2026 hay không</w:t>
             </w:r>
             <w:r>
               <w:rPr>
                 <w:sz w:val="22"/>
               </w:rPr>
               <w:t xml:space="preserve">”</w:t>
+            </w:r>
+            <w:r>
+              <w:rPr>
+                <w:sz w:val="22"/>
+              </w:rPr>
+              <w:t xml:space="preserve">. Cùng ngày lập Đơn tố cáo gửi Chủ tịch Ủy ban nhân dân tỉnh, bộ hồ sơ riêng; Chủ tịch Ủy ban nhân dân tỉnh nhận lúc 10 giờ 09 ngày 17/9/2026</w:t>
             </w:r>
           </w:p>
         </w:tc>
@@ -26911,7 +29509,7 @@
               <w:rPr>
                 <w:sz w:val="22"/>
               </w:rPr>
-              <w:t xml:space="preserve">— đơn có nhiều nội dung khác nhau, hướng dẫn tách đơn</w:t>
+              <w:t xml:space="preserve">— đơn có nhiều nội dung khác nhau, hướng dẫn tách đơn; không nêu nội dung nào, nơi nào; bộ hồ sơ giấy được trả lại kèm phiếu</w:t>
             </w:r>
           </w:p>
         </w:tc>
@@ -26954,7 +29552,7 @@
               <w:rPr>
                 <w:sz w:val="22"/>
               </w:rPr>
-              <w:t xml:space="preserve">Tôi tách đơn theo hướng dẫn: Đơn khiếu nại Thông báo 5553 gửi phường (nhận 17 giờ cùng ngày); ba nội dung còn lại gửi Thanh tra tỉnh</w:t>
+              <w:t xml:space="preserve">Tôi tự tách đơn theo hướng dẫn: Đơn khiếu nại Thông báo 5553 gửi phường (nhận 17 giờ cùng ngày); ba nội dung còn lại gửi Thanh tra tỉnh</w:t>
             </w:r>
           </w:p>
         </w:tc>
@@ -27220,8 +29818,8 @@
         </w:tc>
       </w:tr>
     </w:tbl>
-    <w:bookmarkEnd w:id="63"/>
-    <w:bookmarkStart w:id="64" w:name="X63e650233058611a647b40621bcb9c8b036476c"/>
+    <w:bookmarkEnd w:id="65"/>
+    <w:bookmarkStart w:id="66" w:name="X63e650233058611a647b40621bcb9c8b036476c"/>
     <w:p>
       <w:pPr>
         <w:pStyle w:val="Heading2"/>
@@ -27465,7 +30063,7 @@
               <w:rPr>
                 <w:sz w:val="22"/>
               </w:rPr>
-              <w:t xml:space="preserve">4.8, 4.19, 5.7, 5.8</w:t>
+              <w:t xml:space="preserve">4.8, 4.19, 4.20, 5.7, 5.8</w:t>
             </w:r>
           </w:p>
         </w:tc>
@@ -27527,7 +30125,7 @@
               <w:rPr>
                 <w:sz w:val="22"/>
               </w:rPr>
-              <w:t xml:space="preserve">4.6, 4.18, 5.8</w:t>
+              <w:t xml:space="preserve">4.6, 4.18, 4.21, 5.8</w:t>
             </w:r>
           </w:p>
         </w:tc>
@@ -27589,7 +30187,7 @@
               <w:rPr>
                 <w:sz w:val="22"/>
               </w:rPr>
-              <w:t xml:space="preserve">4.8</w:t>
+              <w:t xml:space="preserve">4.8, 4.20</w:t>
             </w:r>
           </w:p>
         </w:tc>
@@ -28587,7 +31185,7 @@
               <w:rPr>
                 <w:sz w:val="22"/>
               </w:rPr>
-              <w:t xml:space="preserve">7</w:t>
+              <w:t xml:space="preserve">4.21, 7</w:t>
             </w:r>
           </w:p>
         </w:tc>
@@ -28649,7 +31247,7 @@
               <w:rPr>
                 <w:sz w:val="22"/>
               </w:rPr>
-              <w:t xml:space="preserve">4.6, 7</w:t>
+              <w:t xml:space="preserve">4.6, 4.21, 7</w:t>
             </w:r>
           </w:p>
         </w:tc>
@@ -28692,7 +31290,7 @@
               <w:rPr>
                 <w:sz w:val="22"/>
               </w:rPr>
-              <w:t xml:space="preserve">Đơn có nhiều nội dung khác nhau: hướng dẫn người gửi tách riêng từng nội dung (Mẫu số 05)</w:t>
+              <w:t xml:space="preserve">Đơn có nhiều nội dung khác nhau: hướng dẫn người gửi tách riêng từng nội dung để gửi đến đúng cơ quan, tổ chức, đơn vị, cá nhân có thẩm quyền giải quyết; hướng dẫn theo Mẫu số 05</w:t>
             </w:r>
           </w:p>
         </w:tc>
@@ -28711,7 +31309,69 @@
               <w:rPr>
                 <w:sz w:val="22"/>
               </w:rPr>
-              <w:t xml:space="preserve">4.17, 5.8</w:t>
+              <w:t xml:space="preserve">4.17, 4.21, 5.8</w:t>
+            </w:r>
+          </w:p>
+        </w:tc>
+      </w:tr>
+      <w:tr>
+        <w:trPr>
+          <w:cantSplit/>
+        </w:trPr>
+        <w:tc>
+          <w:tcPr>
+            <w:tcW w:w="1636" w:type="dxa"/>
+            <w:vAlign w:val="top"/>
+          </w:tcPr>
+          <w:p>
+            <w:pPr>
+              <w:pStyle w:val="Compact"/>
+              <w:spacing w:before="20" w:after="20" w:line="252" w:lineRule="auto"/>
+              <w:jc w:val="left"/>
+            </w:pPr>
+            <w:r>
+              <w:rPr>
+                <w:sz w:val="22"/>
+              </w:rPr>
+              <w:t xml:space="preserve">Mẫu số 05</w:t>
+            </w:r>
+          </w:p>
+        </w:tc>
+        <w:tc>
+          <w:tcPr>
+            <w:tcW w:w="6395" w:type="dxa"/>
+            <w:vAlign w:val="top"/>
+          </w:tcPr>
+          <w:p>
+            <w:pPr>
+              <w:pStyle w:val="Compact"/>
+              <w:spacing w:before="20" w:after="20" w:line="252" w:lineRule="auto"/>
+              <w:jc w:val="left"/>
+            </w:pPr>
+            <w:r>
+              <w:rPr>
+                <w:sz w:val="22"/>
+              </w:rPr>
+              <w:t xml:space="preserve">Phiếu hướng dẫn (đơn có nhiều nội dung khác nhau): ghi từng nội dung của đơn và cơ quan, người có thẩm quyền giải quyết nội dung ấy</w:t>
+            </w:r>
+          </w:p>
+        </w:tc>
+        <w:tc>
+          <w:tcPr>
+            <w:tcW w:w="1040" w:type="dxa"/>
+            <w:vAlign w:val="top"/>
+          </w:tcPr>
+          <w:p>
+            <w:pPr>
+              <w:pStyle w:val="Compact"/>
+              <w:spacing w:before="20" w:after="20" w:line="252" w:lineRule="auto"/>
+              <w:jc w:val="left"/>
+            </w:pPr>
+            <w:r>
+              <w:rPr>
+                <w:sz w:val="22"/>
+              </w:rPr>
+              <w:t xml:space="preserve">4.21</w:t>
             </w:r>
           </w:p>
         </w:tc>
@@ -28751,8 +31411,8 @@
         <w:t xml:space="preserve">, khoản 2 Điều 147: thời hạn tính bằng ngày thì ngày đầu tiên không được tính, mà tính từ ngày tiếp theo liền kề (10, mục 6 và 12).</w:t>
       </w:r>
     </w:p>
-    <w:bookmarkEnd w:id="64"/>
-    <w:bookmarkStart w:id="65" w:name="phụ-lục-d-danh-mục-tài-liệu-dẫn-chiếu"/>
+    <w:bookmarkEnd w:id="66"/>
+    <w:bookmarkStart w:id="67" w:name="phụ-lục-d-danh-mục-tài-liệu-dẫn-chiếu"/>
     <w:p>
       <w:pPr>
         <w:pStyle w:val="Heading2"/>
@@ -29767,7 +32427,7 @@
               <w:rPr>
                 <w:sz w:val="22"/>
               </w:rPr>
-              <w:t xml:space="preserve">16.5</w:t>
+              <w:t xml:space="preserve">16.4</w:t>
             </w:r>
           </w:p>
         </w:tc>
@@ -29786,7 +32446,7 @@
               <w:rPr>
                 <w:sz w:val="22"/>
               </w:rPr>
-              <w:t xml:space="preserve">Báo phát đơn ngày 14/9/2026</w:t>
+              <w:t xml:space="preserve">Báo phát Đơn tố cáo ngày 14/9/2026 gửi Chủ tịch Ủy ban nhân dân tỉnh, nhận lúc 10 giờ 09 ngày 17/9/2026</w:t>
             </w:r>
           </w:p>
         </w:tc>
@@ -29810,7 +32470,7 @@
               <w:rPr>
                 <w:sz w:val="22"/>
               </w:rPr>
-              <w:t xml:space="preserve">17.05</w:t>
+              <w:t xml:space="preserve">16.5</w:t>
             </w:r>
           </w:p>
         </w:tc>
@@ -29829,7 +32489,7 @@
               <w:rPr>
                 <w:sz w:val="22"/>
               </w:rPr>
-              <w:t xml:space="preserve">Đơn đề nghị gửi Chánh Thanh tra tỉnh ngày 14/9/2026 (thư mục 7, tệp 04)</w:t>
+              <w:t xml:space="preserve">Báo phát đơn ngày 14/9/2026</w:t>
             </w:r>
           </w:p>
         </w:tc>
@@ -29853,7 +32513,7 @@
               <w:rPr>
                 <w:sz w:val="22"/>
               </w:rPr>
-              <w:t xml:space="preserve">17.14</w:t>
+              <w:t xml:space="preserve">17.02 – 17.03</w:t>
             </w:r>
           </w:p>
         </w:tc>
@@ -29872,7 +32532,7 @@
               <w:rPr>
                 <w:sz w:val="22"/>
               </w:rPr>
-              <w:t xml:space="preserve">Đơn khiếu nại Thông báo 5553, phường nhận 06/10/2026</w:t>
+              <w:t xml:space="preserve">Đơn tố cáo gửi Chủ tịch Ủy ban nhân dân tỉnh ngày 14/9/2026</w:t>
             </w:r>
           </w:p>
         </w:tc>
@@ -29896,7 +32556,7 @@
               <w:rPr>
                 <w:sz w:val="22"/>
               </w:rPr>
-              <w:t xml:space="preserve">17.15, 17.15a</w:t>
+              <w:t xml:space="preserve">17.05</w:t>
             </w:r>
           </w:p>
         </w:tc>
@@ -29915,7 +32575,7 @@
               <w:rPr>
                 <w:sz w:val="22"/>
               </w:rPr>
-              <w:t xml:space="preserve">Đơn đề nghị gửi Chánh Thanh tra tỉnh ngày 06/10/2026 (thư mục 7, tệp 05); báo phát ngày 12/10/2026</w:t>
+              <w:t xml:space="preserve">Đơn đề nghị gửi Chánh Thanh tra tỉnh ngày 14/9/2026 (thư mục 7, tệp 04); kèm trang bìa, mục lục hồ sơ và danh mục tài liệu số hóa cùng ngày</w:t>
             </w:r>
           </w:p>
         </w:tc>
@@ -29939,7 +32599,7 @@
               <w:rPr>
                 <w:sz w:val="22"/>
               </w:rPr>
-              <w:t xml:space="preserve">17.17a</w:t>
+              <w:t xml:space="preserve">17.14</w:t>
             </w:r>
           </w:p>
         </w:tc>
@@ -29958,7 +32618,7 @@
               <w:rPr>
                 <w:sz w:val="22"/>
               </w:rPr>
-              <w:t xml:space="preserve">Giấy tiếp nhận của phường (23/9/2026, 06/10/2026)</w:t>
+              <w:t xml:space="preserve">Đơn khiếu nại Thông báo 5553, phường nhận 06/10/2026</w:t>
             </w:r>
           </w:p>
         </w:tc>
@@ -29982,7 +32642,7 @@
               <w:rPr>
                 <w:sz w:val="22"/>
               </w:rPr>
-              <w:t xml:space="preserve">Thư mục 7, tệp 01</w:t>
+              <w:t xml:space="preserve">17.15, 17.15a</w:t>
             </w:r>
           </w:p>
         </w:tc>
@@ -30001,7 +32661,7 @@
               <w:rPr>
                 <w:sz w:val="22"/>
               </w:rPr>
-              <w:t xml:space="preserve">Đơn B, đề ngày 16/5/2026</w:t>
+              <w:t xml:space="preserve">Đơn đề nghị gửi Chánh Thanh tra tỉnh ngày 06/10/2026 (thư mục 7, tệp 05); báo phát ngày 12/10/2026</w:t>
             </w:r>
           </w:p>
         </w:tc>
@@ -30025,6 +32685,92 @@
               <w:rPr>
                 <w:sz w:val="22"/>
               </w:rPr>
+              <w:t xml:space="preserve">17.17a</w:t>
+            </w:r>
+          </w:p>
+        </w:tc>
+        <w:tc>
+          <w:tcPr>
+            <w:tcW w:w="7631" w:type="dxa"/>
+            <w:vAlign w:val="top"/>
+          </w:tcPr>
+          <w:p>
+            <w:pPr>
+              <w:pStyle w:val="Compact"/>
+              <w:spacing w:before="20" w:after="20" w:line="252" w:lineRule="auto"/>
+              <w:jc w:val="left"/>
+            </w:pPr>
+            <w:r>
+              <w:rPr>
+                <w:sz w:val="22"/>
+              </w:rPr>
+              <w:t xml:space="preserve">Giấy tiếp nhận của phường (23/9/2026, 06/10/2026)</w:t>
+            </w:r>
+          </w:p>
+        </w:tc>
+      </w:tr>
+      <w:tr>
+        <w:trPr>
+          <w:cantSplit/>
+        </w:trPr>
+        <w:tc>
+          <w:tcPr>
+            <w:tcW w:w="1440" w:type="dxa"/>
+            <w:vAlign w:val="top"/>
+          </w:tcPr>
+          <w:p>
+            <w:pPr>
+              <w:pStyle w:val="Compact"/>
+              <w:spacing w:before="20" w:after="20" w:line="252" w:lineRule="auto"/>
+              <w:jc w:val="left"/>
+            </w:pPr>
+            <w:r>
+              <w:rPr>
+                <w:sz w:val="22"/>
+              </w:rPr>
+              <w:t xml:space="preserve">Thư mục 7, tệp 01</w:t>
+            </w:r>
+          </w:p>
+        </w:tc>
+        <w:tc>
+          <w:tcPr>
+            <w:tcW w:w="7631" w:type="dxa"/>
+            <w:vAlign w:val="top"/>
+          </w:tcPr>
+          <w:p>
+            <w:pPr>
+              <w:pStyle w:val="Compact"/>
+              <w:spacing w:before="20" w:after="20" w:line="252" w:lineRule="auto"/>
+              <w:jc w:val="left"/>
+            </w:pPr>
+            <w:r>
+              <w:rPr>
+                <w:sz w:val="22"/>
+              </w:rPr>
+              <w:t xml:space="preserve">Đơn B, đề ngày 16/5/2026</w:t>
+            </w:r>
+          </w:p>
+        </w:tc>
+      </w:tr>
+      <w:tr>
+        <w:trPr>
+          <w:cantSplit/>
+        </w:trPr>
+        <w:tc>
+          <w:tcPr>
+            <w:tcW w:w="1440" w:type="dxa"/>
+            <w:vAlign w:val="top"/>
+          </w:tcPr>
+          <w:p>
+            <w:pPr>
+              <w:pStyle w:val="Compact"/>
+              <w:spacing w:before="20" w:after="20" w:line="252" w:lineRule="auto"/>
+              <w:jc w:val="left"/>
+            </w:pPr>
+            <w:r>
+              <w:rPr>
+                <w:sz w:val="22"/>
+              </w:rPr>
               <w:t xml:space="preserve">00.2</w:t>
             </w:r>
           </w:p>
@@ -30078,8 +32824,8 @@
         <w:t xml:space="preserve">Người lập báo cáo — Trần Duy Tuệ</w:t>
       </w:r>
     </w:p>
-    <w:bookmarkEnd w:id="65"/>
-    <w:bookmarkEnd w:id="66"/>
+    <w:bookmarkEnd w:id="67"/>
+    <w:bookmarkEnd w:id="68"/>
     <w:sectPr>
       <w:footerReference w:type="default" r:id="rId9"/>
       <w:pgSz w:w="11906" w:h="16838"/>
@@ -30800,6 +33546,9 @@
     <w:abstractNumId w:val="991"/>
   </w:num>
   <w:num w:numId="1022">
+    <w:abstractNumId w:val="991"/>
+  </w:num>
+  <w:num w:numId="1023">
     <w:abstractNumId w:val="99411"/>
     <w:lvlOverride w:ilvl="0">
       <w:startOverride w:val="1"/>
@@ -30829,7 +33578,7 @@
       <w:startOverride w:val="1"/>
     </w:lvlOverride>
   </w:num>
-  <w:num w:numId="1023">
+  <w:num w:numId="1024">
     <w:abstractNumId w:val="99417"/>
     <w:lvlOverride w:ilvl="0">
       <w:startOverride w:val="7"/>

</xml_diff>